<commit_message>
feat(sds): replace procedural pictogram rendering with official UNECE/ECHA vector asset bank (ADR-070)
</commit_message>
<xml_diff>
--- a/docs/SDS/Karta_Charakterystyki_8034055535448_SDS_ORCHIDEA_E_VANIGLIA_V2_PL.docx
+++ b/docs/SDS/Karta_Charakterystyki_8034055535448_SDS_ORCHIDEA_E_VANIGLIA_V2_PL.docx
@@ -2249,98 +2249,98 @@
           <w:sz w:val="20"/>
           <w:szCs w:val="20"/>
         </w:rPr>
-        <w:t xml:space="preserve">- woda słodka:0,96mg/l</w:t>
-      </w:r>
-    </w:p>
-    <w:p>
-      <w:pPr>
-        <w:spacing w:after="80"/>
-      </w:pPr>
-      <w:r>
-        <w:rPr>
-          <w:rFonts w:ascii="Arial" w:cs="Arial" w:eastAsia="Arial" w:hAnsi="Arial"/>
-          <w:sz w:val="20"/>
-          <w:szCs w:val="20"/>
-        </w:rPr>
-        <w:t xml:space="preserve">- woda morska:0,79mg/l</w:t>
-      </w:r>
-    </w:p>
-    <w:p>
-      <w:pPr>
-        <w:spacing w:after="80"/>
-      </w:pPr>
-      <w:r>
-        <w:rPr>
-          <w:rFonts w:ascii="Arial" w:cs="Arial" w:eastAsia="Arial" w:hAnsi="Arial"/>
-          <w:sz w:val="20"/>
-          <w:szCs w:val="20"/>
-        </w:rPr>
-        <w:t xml:space="preserve">- osady słodkowodne:3,6mg/kg</w:t>
-      </w:r>
-    </w:p>
-    <w:p>
-      <w:pPr>
-        <w:spacing w:after="80"/>
-      </w:pPr>
-      <w:r>
-        <w:rPr>
-          <w:rFonts w:ascii="Arial" w:cs="Arial" w:eastAsia="Arial" w:hAnsi="Arial"/>
-          <w:sz w:val="20"/>
-          <w:szCs w:val="20"/>
-        </w:rPr>
-        <w:t xml:space="preserve">- osady morskie:2,9mg/kg</w:t>
-      </w:r>
-    </w:p>
-    <w:p>
-      <w:pPr>
-        <w:spacing w:after="80"/>
-      </w:pPr>
-      <w:r>
-        <w:rPr>
-          <w:rFonts w:ascii="Arial" w:cs="Arial" w:eastAsia="Arial" w:hAnsi="Arial"/>
-          <w:sz w:val="20"/>
-          <w:szCs w:val="20"/>
-        </w:rPr>
-        <w:t xml:space="preserve">- woda (uwalnianie okresowe):2,75mg/l</w:t>
-      </w:r>
-    </w:p>
-    <w:p>
-      <w:pPr>
-        <w:spacing w:after="80"/>
-      </w:pPr>
-      <w:r>
-        <w:rPr>
-          <w:rFonts w:ascii="Arial" w:cs="Arial" w:eastAsia="Arial" w:hAnsi="Arial"/>
-          <w:sz w:val="20"/>
-          <w:szCs w:val="20"/>
-        </w:rPr>
-        <w:t xml:space="preserve">- mikroorganizmy w oczyszczalni ścieków (STP):580mg/l</w:t>
-      </w:r>
-    </w:p>
-    <w:p>
-      <w:pPr>
-        <w:spacing w:after="80"/>
-      </w:pPr>
-      <w:r>
-        <w:rPr>
-          <w:rFonts w:ascii="Arial" w:cs="Arial" w:eastAsia="Arial" w:hAnsi="Arial"/>
-          <w:sz w:val="20"/>
-          <w:szCs w:val="20"/>
-        </w:rPr>
-        <w:t xml:space="preserve">- łańcuch pokarmowy (zatrucie wtórne):0,38mg/kg</w:t>
-      </w:r>
-    </w:p>
-    <w:p>
-      <w:pPr>
-        <w:spacing w:after="80"/>
-      </w:pPr>
-      <w:r>
-        <w:rPr>
-          <w:rFonts w:ascii="Arial" w:cs="Arial" w:eastAsia="Arial" w:hAnsi="Arial"/>
-          <w:sz w:val="20"/>
-          <w:szCs w:val="20"/>
-        </w:rPr>
-        <w:t xml:space="preserve">- środowisko glebowe (gleba):0,63mg/kg</w:t>
+        <w:t xml:space="preserve">- woda słodka: 0,96 mg/l</w:t>
+      </w:r>
+    </w:p>
+    <w:p>
+      <w:pPr>
+        <w:spacing w:after="80"/>
+      </w:pPr>
+      <w:r>
+        <w:rPr>
+          <w:rFonts w:ascii="Arial" w:cs="Arial" w:eastAsia="Arial" w:hAnsi="Arial"/>
+          <w:sz w:val="20"/>
+          <w:szCs w:val="20"/>
+        </w:rPr>
+        <w:t xml:space="preserve">- woda morska: 0,79 mg/l</w:t>
+      </w:r>
+    </w:p>
+    <w:p>
+      <w:pPr>
+        <w:spacing w:after="80"/>
+      </w:pPr>
+      <w:r>
+        <w:rPr>
+          <w:rFonts w:ascii="Arial" w:cs="Arial" w:eastAsia="Arial" w:hAnsi="Arial"/>
+          <w:sz w:val="20"/>
+          <w:szCs w:val="20"/>
+        </w:rPr>
+        <w:t xml:space="preserve">- osady słodkowodne: 3,6 mg/kg</w:t>
+      </w:r>
+    </w:p>
+    <w:p>
+      <w:pPr>
+        <w:spacing w:after="80"/>
+      </w:pPr>
+      <w:r>
+        <w:rPr>
+          <w:rFonts w:ascii="Arial" w:cs="Arial" w:eastAsia="Arial" w:hAnsi="Arial"/>
+          <w:sz w:val="20"/>
+          <w:szCs w:val="20"/>
+        </w:rPr>
+        <w:t xml:space="preserve">- osady morskie: 2,9 mg/kg</w:t>
+      </w:r>
+    </w:p>
+    <w:p>
+      <w:pPr>
+        <w:spacing w:after="80"/>
+      </w:pPr>
+      <w:r>
+        <w:rPr>
+          <w:rFonts w:ascii="Arial" w:cs="Arial" w:eastAsia="Arial" w:hAnsi="Arial"/>
+          <w:sz w:val="20"/>
+          <w:szCs w:val="20"/>
+        </w:rPr>
+        <w:t xml:space="preserve">- woda (uwalnianie okresowe): 2,75 mg/l</w:t>
+      </w:r>
+    </w:p>
+    <w:p>
+      <w:pPr>
+        <w:spacing w:after="80"/>
+      </w:pPr>
+      <w:r>
+        <w:rPr>
+          <w:rFonts w:ascii="Arial" w:cs="Arial" w:eastAsia="Arial" w:hAnsi="Arial"/>
+          <w:sz w:val="20"/>
+          <w:szCs w:val="20"/>
+        </w:rPr>
+        <w:t xml:space="preserve">- mikroorganizmy w oczyszczalni ścieków (STP): 580 mg/l</w:t>
+      </w:r>
+    </w:p>
+    <w:p>
+      <w:pPr>
+        <w:spacing w:after="80"/>
+      </w:pPr>
+      <w:r>
+        <w:rPr>
+          <w:rFonts w:ascii="Arial" w:cs="Arial" w:eastAsia="Arial" w:hAnsi="Arial"/>
+          <w:sz w:val="20"/>
+          <w:szCs w:val="20"/>
+        </w:rPr>
+        <w:t xml:space="preserve">- łańcuch pokarmowy (zatrucie wtórne): 0,38 mg/kg</w:t>
+      </w:r>
+    </w:p>
+    <w:p>
+      <w:pPr>
+        <w:spacing w:after="80"/>
+      </w:pPr>
+      <w:r>
+        <w:rPr>
+          <w:rFonts w:ascii="Arial" w:cs="Arial" w:eastAsia="Arial" w:hAnsi="Arial"/>
+          <w:sz w:val="20"/>
+          <w:szCs w:val="20"/>
+        </w:rPr>
+        <w:t xml:space="preserve">- środowisko glebowe (gleba): 0,63 mg/kg</w:t>
       </w:r>
     </w:p>
     <w:p>
@@ -2483,85 +2483,85 @@
           <w:sz w:val="20"/>
           <w:szCs w:val="20"/>
         </w:rPr>
-        <w:t xml:space="preserve">- woda słodka:0,081mg/l</w:t>
-      </w:r>
-    </w:p>
-    <w:p>
-      <w:pPr>
-        <w:spacing w:after="80"/>
-      </w:pPr>
-      <w:r>
-        <w:rPr>
-          <w:rFonts w:ascii="Arial" w:cs="Arial" w:eastAsia="Arial" w:hAnsi="Arial"/>
-          <w:sz w:val="20"/>
-          <w:szCs w:val="20"/>
-        </w:rPr>
-        <w:t xml:space="preserve">- woda morska:0,008111mg/l</w:t>
-      </w:r>
-    </w:p>
-    <w:p>
-      <w:pPr>
-        <w:spacing w:after="80"/>
-      </w:pPr>
-      <w:r>
-        <w:rPr>
-          <w:rFonts w:ascii="Arial" w:cs="Arial" w:eastAsia="Arial" w:hAnsi="Arial"/>
-          <w:sz w:val="20"/>
-          <w:szCs w:val="20"/>
-        </w:rPr>
-        <w:t xml:space="preserve">- osady słodkowodne:0,409mg/kg</w:t>
-      </w:r>
-    </w:p>
-    <w:p>
-      <w:pPr>
-        <w:spacing w:after="80"/>
-      </w:pPr>
-      <w:r>
-        <w:rPr>
-          <w:rFonts w:ascii="Arial" w:cs="Arial" w:eastAsia="Arial" w:hAnsi="Arial"/>
-          <w:sz w:val="20"/>
-          <w:szCs w:val="20"/>
-        </w:rPr>
-        <w:t xml:space="preserve">- osady morskie:0,0409mg/kg</w:t>
-      </w:r>
-    </w:p>
-    <w:p>
-      <w:pPr>
-        <w:spacing w:after="80"/>
-      </w:pPr>
-      <w:r>
-        <w:rPr>
-          <w:rFonts w:ascii="Arial" w:cs="Arial" w:eastAsia="Arial" w:hAnsi="Arial"/>
-          <w:sz w:val="20"/>
-          <w:szCs w:val="20"/>
-        </w:rPr>
-        <w:t xml:space="preserve">- woda (uwalnianie okresowe):0,8111mg/l</w:t>
-      </w:r>
-    </w:p>
-    <w:p>
-      <w:pPr>
-        <w:spacing w:after="80"/>
-      </w:pPr>
-      <w:r>
-        <w:rPr>
-          <w:rFonts w:ascii="Arial" w:cs="Arial" w:eastAsia="Arial" w:hAnsi="Arial"/>
-          <w:sz w:val="20"/>
-          <w:szCs w:val="20"/>
-        </w:rPr>
-        <w:t xml:space="preserve">- mikroorganizmy w oczyszczalni ścieków (STP):4,5mg/l</w:t>
-      </w:r>
-    </w:p>
-    <w:p>
-      <w:pPr>
-        <w:spacing w:after="80"/>
-      </w:pPr>
-      <w:r>
-        <w:rPr>
-          <w:rFonts w:ascii="Arial" w:cs="Arial" w:eastAsia="Arial" w:hAnsi="Arial"/>
-          <w:sz w:val="20"/>
-          <w:szCs w:val="20"/>
-        </w:rPr>
-        <w:t xml:space="preserve">- środowisko glebowe (gleba):0,0967mg/kg</w:t>
+        <w:t xml:space="preserve">- woda słodka: 0,081 mg/l</w:t>
+      </w:r>
+    </w:p>
+    <w:p>
+      <w:pPr>
+        <w:spacing w:after="80"/>
+      </w:pPr>
+      <w:r>
+        <w:rPr>
+          <w:rFonts w:ascii="Arial" w:cs="Arial" w:eastAsia="Arial" w:hAnsi="Arial"/>
+          <w:sz w:val="20"/>
+          <w:szCs w:val="20"/>
+        </w:rPr>
+        <w:t xml:space="preserve">- woda morska: 0,008111 mg/l</w:t>
+      </w:r>
+    </w:p>
+    <w:p>
+      <w:pPr>
+        <w:spacing w:after="80"/>
+      </w:pPr>
+      <w:r>
+        <w:rPr>
+          <w:rFonts w:ascii="Arial" w:cs="Arial" w:eastAsia="Arial" w:hAnsi="Arial"/>
+          <w:sz w:val="20"/>
+          <w:szCs w:val="20"/>
+        </w:rPr>
+        <w:t xml:space="preserve">- osady słodkowodne: 0,409 mg/kg</w:t>
+      </w:r>
+    </w:p>
+    <w:p>
+      <w:pPr>
+        <w:spacing w:after="80"/>
+      </w:pPr>
+      <w:r>
+        <w:rPr>
+          <w:rFonts w:ascii="Arial" w:cs="Arial" w:eastAsia="Arial" w:hAnsi="Arial"/>
+          <w:sz w:val="20"/>
+          <w:szCs w:val="20"/>
+        </w:rPr>
+        <w:t xml:space="preserve">- osady morskie: 0,0409 mg/kg</w:t>
+      </w:r>
+    </w:p>
+    <w:p>
+      <w:pPr>
+        <w:spacing w:after="80"/>
+      </w:pPr>
+      <w:r>
+        <w:rPr>
+          <w:rFonts w:ascii="Arial" w:cs="Arial" w:eastAsia="Arial" w:hAnsi="Arial"/>
+          <w:sz w:val="20"/>
+          <w:szCs w:val="20"/>
+        </w:rPr>
+        <w:t xml:space="preserve">- woda (uwalnianie okresowe): 0,8111 mg/l</w:t>
+      </w:r>
+    </w:p>
+    <w:p>
+      <w:pPr>
+        <w:spacing w:after="80"/>
+      </w:pPr>
+      <w:r>
+        <w:rPr>
+          <w:rFonts w:ascii="Arial" w:cs="Arial" w:eastAsia="Arial" w:hAnsi="Arial"/>
+          <w:sz w:val="20"/>
+          <w:szCs w:val="20"/>
+        </w:rPr>
+        <w:t xml:space="preserve">- mikroorganizmy w oczyszczalni ścieków (STP): 4,5 mg/l</w:t>
+      </w:r>
+    </w:p>
+    <w:p>
+      <w:pPr>
+        <w:spacing w:after="80"/>
+      </w:pPr>
+      <w:r>
+        <w:rPr>
+          <w:rFonts w:ascii="Arial" w:cs="Arial" w:eastAsia="Arial" w:hAnsi="Arial"/>
+          <w:sz w:val="20"/>
+          <w:szCs w:val="20"/>
+        </w:rPr>
+        <w:t xml:space="preserve">- środowisko glebowe (gleba): 0,0967 mg/kg</w:t>
       </w:r>
     </w:p>
     <w:p>
@@ -2704,98 +2704,98 @@
           <w:sz w:val="20"/>
           <w:szCs w:val="20"/>
         </w:rPr>
-        <w:t xml:space="preserve">- woda słodka:0,019mg/l</w:t>
-      </w:r>
-    </w:p>
-    <w:p>
-      <w:pPr>
-        <w:spacing w:after="80"/>
-      </w:pPr>
-      <w:r>
-        <w:rPr>
-          <w:rFonts w:ascii="Arial" w:cs="Arial" w:eastAsia="Arial" w:hAnsi="Arial"/>
-          <w:sz w:val="20"/>
-          <w:szCs w:val="20"/>
-        </w:rPr>
-        <w:t xml:space="preserve">- woda morska:0,0019mg/l</w:t>
-      </w:r>
-    </w:p>
-    <w:p>
-      <w:pPr>
-        <w:spacing w:after="80"/>
-      </w:pPr>
-      <w:r>
-        <w:rPr>
-          <w:rFonts w:ascii="Arial" w:cs="Arial" w:eastAsia="Arial" w:hAnsi="Arial"/>
-          <w:sz w:val="20"/>
-          <w:szCs w:val="20"/>
-        </w:rPr>
-        <w:t xml:space="preserve">- osady słodkowodne:0,15mg/kg</w:t>
-      </w:r>
-    </w:p>
-    <w:p>
-      <w:pPr>
-        <w:spacing w:after="80"/>
-      </w:pPr>
-      <w:r>
-        <w:rPr>
-          <w:rFonts w:ascii="Arial" w:cs="Arial" w:eastAsia="Arial" w:hAnsi="Arial"/>
-          <w:sz w:val="20"/>
-          <w:szCs w:val="20"/>
-        </w:rPr>
-        <w:t xml:space="preserve">- osady morskie:0,015mg/kg</w:t>
-      </w:r>
-    </w:p>
-    <w:p>
-      <w:pPr>
-        <w:spacing w:after="80"/>
-      </w:pPr>
-      <w:r>
-        <w:rPr>
-          <w:rFonts w:ascii="Arial" w:cs="Arial" w:eastAsia="Arial" w:hAnsi="Arial"/>
-          <w:sz w:val="20"/>
-          <w:szCs w:val="20"/>
-        </w:rPr>
-        <w:t xml:space="preserve">- woda (uwalnianie okresowe):0,0142mg/l</w:t>
-      </w:r>
-    </w:p>
-    <w:p>
-      <w:pPr>
-        <w:spacing w:after="80"/>
-      </w:pPr>
-      <w:r>
-        <w:rPr>
-          <w:rFonts w:ascii="Arial" w:cs="Arial" w:eastAsia="Arial" w:hAnsi="Arial"/>
-          <w:sz w:val="20"/>
-          <w:szCs w:val="20"/>
-        </w:rPr>
-        <w:t xml:space="preserve">- mikroorganizmy w oczyszczalni ścieków (STP):6,4mg/l</w:t>
-      </w:r>
-    </w:p>
-    <w:p>
-      <w:pPr>
-        <w:spacing w:after="80"/>
-      </w:pPr>
-      <w:r>
-        <w:rPr>
-          <w:rFonts w:ascii="Arial" w:cs="Arial" w:eastAsia="Arial" w:hAnsi="Arial"/>
-          <w:sz w:val="20"/>
-          <w:szCs w:val="20"/>
-        </w:rPr>
-        <w:t xml:space="preserve">- łańcuch pokarmowy (zatrucie wtórne):30,7mg/kg</w:t>
-      </w:r>
-    </w:p>
-    <w:p>
-      <w:pPr>
-        <w:spacing w:after="80"/>
-      </w:pPr>
-      <w:r>
-        <w:rPr>
-          <w:rFonts w:ascii="Arial" w:cs="Arial" w:eastAsia="Arial" w:hAnsi="Arial"/>
-          <w:sz w:val="20"/>
-          <w:szCs w:val="20"/>
-        </w:rPr>
-        <w:t xml:space="preserve">- środowisko glebowe (gleba):0,018mg/kg</w:t>
+        <w:t xml:space="preserve">- woda słodka: 0,019 mg/l</w:t>
+      </w:r>
+    </w:p>
+    <w:p>
+      <w:pPr>
+        <w:spacing w:after="80"/>
+      </w:pPr>
+      <w:r>
+        <w:rPr>
+          <w:rFonts w:ascii="Arial" w:cs="Arial" w:eastAsia="Arial" w:hAnsi="Arial"/>
+          <w:sz w:val="20"/>
+          <w:szCs w:val="20"/>
+        </w:rPr>
+        <w:t xml:space="preserve">- woda morska: 0,0019 mg/l</w:t>
+      </w:r>
+    </w:p>
+    <w:p>
+      <w:pPr>
+        <w:spacing w:after="80"/>
+      </w:pPr>
+      <w:r>
+        <w:rPr>
+          <w:rFonts w:ascii="Arial" w:cs="Arial" w:eastAsia="Arial" w:hAnsi="Arial"/>
+          <w:sz w:val="20"/>
+          <w:szCs w:val="20"/>
+        </w:rPr>
+        <w:t xml:space="preserve">- osady słodkowodne: 0,15 mg/kg</w:t>
+      </w:r>
+    </w:p>
+    <w:p>
+      <w:pPr>
+        <w:spacing w:after="80"/>
+      </w:pPr>
+      <w:r>
+        <w:rPr>
+          <w:rFonts w:ascii="Arial" w:cs="Arial" w:eastAsia="Arial" w:hAnsi="Arial"/>
+          <w:sz w:val="20"/>
+          <w:szCs w:val="20"/>
+        </w:rPr>
+        <w:t xml:space="preserve">- osady morskie: 0,015 mg/kg</w:t>
+      </w:r>
+    </w:p>
+    <w:p>
+      <w:pPr>
+        <w:spacing w:after="80"/>
+      </w:pPr>
+      <w:r>
+        <w:rPr>
+          <w:rFonts w:ascii="Arial" w:cs="Arial" w:eastAsia="Arial" w:hAnsi="Arial"/>
+          <w:sz w:val="20"/>
+          <w:szCs w:val="20"/>
+        </w:rPr>
+        <w:t xml:space="preserve">- woda (uwalnianie okresowe): 0,0142 mg/l</w:t>
+      </w:r>
+    </w:p>
+    <w:p>
+      <w:pPr>
+        <w:spacing w:after="80"/>
+      </w:pPr>
+      <w:r>
+        <w:rPr>
+          <w:rFonts w:ascii="Arial" w:cs="Arial" w:eastAsia="Arial" w:hAnsi="Arial"/>
+          <w:sz w:val="20"/>
+          <w:szCs w:val="20"/>
+        </w:rPr>
+        <w:t xml:space="preserve">- mikroorganizmy w oczyszczalni ścieków (STP): 6,4 mg/l</w:t>
+      </w:r>
+    </w:p>
+    <w:p>
+      <w:pPr>
+        <w:spacing w:after="80"/>
+      </w:pPr>
+      <w:r>
+        <w:rPr>
+          <w:rFonts w:ascii="Arial" w:cs="Arial" w:eastAsia="Arial" w:hAnsi="Arial"/>
+          <w:sz w:val="20"/>
+          <w:szCs w:val="20"/>
+        </w:rPr>
+        <w:t xml:space="preserve">- łańcuch pokarmowy (zatrucie wtórne): 30,7 mg/kg</w:t>
+      </w:r>
+    </w:p>
+    <w:p>
+      <w:pPr>
+        <w:spacing w:after="80"/>
+      </w:pPr>
+      <w:r>
+        <w:rPr>
+          <w:rFonts w:ascii="Arial" w:cs="Arial" w:eastAsia="Arial" w:hAnsi="Arial"/>
+          <w:sz w:val="20"/>
+          <w:szCs w:val="20"/>
+        </w:rPr>
+        <w:t xml:space="preserve">- środowisko glebowe (gleba): 0,018 mg/kg</w:t>
       </w:r>
     </w:p>
     <w:p>
@@ -2938,98 +2938,98 @@
           <w:sz w:val="20"/>
           <w:szCs w:val="20"/>
         </w:rPr>
-        <w:t xml:space="preserve">- woda słodka:0,000199mg/l</w:t>
-      </w:r>
-    </w:p>
-    <w:p>
-      <w:pPr>
-        <w:spacing w:after="80"/>
-      </w:pPr>
-      <w:r>
-        <w:rPr>
-          <w:rFonts w:ascii="Arial" w:cs="Arial" w:eastAsia="Arial" w:hAnsi="Arial"/>
-          <w:sz w:val="20"/>
-          <w:szCs w:val="20"/>
-        </w:rPr>
-        <w:t xml:space="preserve">- woda morska:0,02 μg/l</w:t>
-      </w:r>
-    </w:p>
-    <w:p>
-      <w:pPr>
-        <w:spacing w:after="80"/>
-      </w:pPr>
-      <w:r>
-        <w:rPr>
-          <w:rFonts w:ascii="Arial" w:cs="Arial" w:eastAsia="Arial" w:hAnsi="Arial"/>
-          <w:sz w:val="20"/>
-          <w:szCs w:val="20"/>
-        </w:rPr>
-        <w:t xml:space="preserve">- osady słodkowodne:0,0996mg/kg</w:t>
-      </w:r>
-    </w:p>
-    <w:p>
-      <w:pPr>
-        <w:spacing w:after="80"/>
-      </w:pPr>
-      <w:r>
-        <w:rPr>
-          <w:rFonts w:ascii="Arial" w:cs="Arial" w:eastAsia="Arial" w:hAnsi="Arial"/>
-          <w:sz w:val="20"/>
-          <w:szCs w:val="20"/>
-        </w:rPr>
-        <w:t xml:space="preserve">- osady morskie:0,00996mg/kg</w:t>
-      </w:r>
-    </w:p>
-    <w:p>
-      <w:pPr>
-        <w:spacing w:after="80"/>
-      </w:pPr>
-      <w:r>
-        <w:rPr>
-          <w:rFonts w:ascii="Arial" w:cs="Arial" w:eastAsia="Arial" w:hAnsi="Arial"/>
-          <w:sz w:val="20"/>
-          <w:szCs w:val="20"/>
-        </w:rPr>
-        <w:t xml:space="preserve">- woda (uwalnianie okresowe):0,00199mg/l</w:t>
-      </w:r>
-    </w:p>
-    <w:p>
-      <w:pPr>
-        <w:spacing w:after="80"/>
-      </w:pPr>
-      <w:r>
-        <w:rPr>
-          <w:rFonts w:ascii="Arial" w:cs="Arial" w:eastAsia="Arial" w:hAnsi="Arial"/>
-          <w:sz w:val="20"/>
-          <w:szCs w:val="20"/>
-        </w:rPr>
-        <w:t xml:space="preserve">- mikroorganizmy w oczyszczalni ścieków (STP):0,17mg/l</w:t>
-      </w:r>
-    </w:p>
-    <w:p>
-      <w:pPr>
-        <w:spacing w:after="80"/>
-      </w:pPr>
-      <w:r>
-        <w:rPr>
-          <w:rFonts w:ascii="Arial" w:cs="Arial" w:eastAsia="Arial" w:hAnsi="Arial"/>
-          <w:sz w:val="20"/>
-          <w:szCs w:val="20"/>
-        </w:rPr>
-        <w:t xml:space="preserve">- łańcuch pokarmowy (zatrucie wtórne):8,33mg/kg</w:t>
-      </w:r>
-    </w:p>
-    <w:p>
-      <w:pPr>
-        <w:spacing w:after="80"/>
-      </w:pPr>
-      <w:r>
-        <w:rPr>
-          <w:rFonts w:ascii="Arial" w:cs="Arial" w:eastAsia="Arial" w:hAnsi="Arial"/>
-          <w:sz w:val="20"/>
-          <w:szCs w:val="20"/>
-        </w:rPr>
-        <w:t xml:space="preserve">- środowisko glebowe (gleba):0,04769mg/kg</w:t>
+        <w:t xml:space="preserve">- woda słodka: 0,000199 mg/l</w:t>
+      </w:r>
+    </w:p>
+    <w:p>
+      <w:pPr>
+        <w:spacing w:after="80"/>
+      </w:pPr>
+      <w:r>
+        <w:rPr>
+          <w:rFonts w:ascii="Arial" w:cs="Arial" w:eastAsia="Arial" w:hAnsi="Arial"/>
+          <w:sz w:val="20"/>
+          <w:szCs w:val="20"/>
+        </w:rPr>
+        <w:t xml:space="preserve">- woda morska: 0,02 μg/l</w:t>
+      </w:r>
+    </w:p>
+    <w:p>
+      <w:pPr>
+        <w:spacing w:after="80"/>
+      </w:pPr>
+      <w:r>
+        <w:rPr>
+          <w:rFonts w:ascii="Arial" w:cs="Arial" w:eastAsia="Arial" w:hAnsi="Arial"/>
+          <w:sz w:val="20"/>
+          <w:szCs w:val="20"/>
+        </w:rPr>
+        <w:t xml:space="preserve">- osady słodkowodne: 0,0996 mg/kg</w:t>
+      </w:r>
+    </w:p>
+    <w:p>
+      <w:pPr>
+        <w:spacing w:after="80"/>
+      </w:pPr>
+      <w:r>
+        <w:rPr>
+          <w:rFonts w:ascii="Arial" w:cs="Arial" w:eastAsia="Arial" w:hAnsi="Arial"/>
+          <w:sz w:val="20"/>
+          <w:szCs w:val="20"/>
+        </w:rPr>
+        <w:t xml:space="preserve">- osady morskie: 0,00996 mg/kg</w:t>
+      </w:r>
+    </w:p>
+    <w:p>
+      <w:pPr>
+        <w:spacing w:after="80"/>
+      </w:pPr>
+      <w:r>
+        <w:rPr>
+          <w:rFonts w:ascii="Arial" w:cs="Arial" w:eastAsia="Arial" w:hAnsi="Arial"/>
+          <w:sz w:val="20"/>
+          <w:szCs w:val="20"/>
+        </w:rPr>
+        <w:t xml:space="preserve">- woda (uwalnianie okresowe): 0,00199 mg/l</w:t>
+      </w:r>
+    </w:p>
+    <w:p>
+      <w:pPr>
+        <w:spacing w:after="80"/>
+      </w:pPr>
+      <w:r>
+        <w:rPr>
+          <w:rFonts w:ascii="Arial" w:cs="Arial" w:eastAsia="Arial" w:hAnsi="Arial"/>
+          <w:sz w:val="20"/>
+          <w:szCs w:val="20"/>
+        </w:rPr>
+        <w:t xml:space="preserve">- mikroorganizmy w oczyszczalni ścieków (STP): 0,17 mg/l</w:t>
+      </w:r>
+    </w:p>
+    <w:p>
+      <w:pPr>
+        <w:spacing w:after="80"/>
+      </w:pPr>
+      <w:r>
+        <w:rPr>
+          <w:rFonts w:ascii="Arial" w:cs="Arial" w:eastAsia="Arial" w:hAnsi="Arial"/>
+          <w:sz w:val="20"/>
+          <w:szCs w:val="20"/>
+        </w:rPr>
+        <w:t xml:space="preserve">- łańcuch pokarmowy (zatrucie wtórne): 8,33 mg/kg</w:t>
+      </w:r>
+    </w:p>
+    <w:p>
+      <w:pPr>
+        <w:spacing w:after="80"/>
+      </w:pPr>
+      <w:r>
+        <w:rPr>
+          <w:rFonts w:ascii="Arial" w:cs="Arial" w:eastAsia="Arial" w:hAnsi="Arial"/>
+          <w:sz w:val="20"/>
+          <w:szCs w:val="20"/>
+        </w:rPr>
+        <w:t xml:space="preserve">- środowisko glebowe (gleba): 0,04769 mg/kg</w:t>
       </w:r>
     </w:p>
     <w:p>
@@ -3172,85 +3172,85 @@
           <w:sz w:val="20"/>
           <w:szCs w:val="20"/>
         </w:rPr>
-        <w:t xml:space="preserve">- woda słodka:0,68mg/l</w:t>
-      </w:r>
-    </w:p>
-    <w:p>
-      <w:pPr>
-        <w:spacing w:after="80"/>
-      </w:pPr>
-      <w:r>
-        <w:rPr>
-          <w:rFonts w:ascii="Arial" w:cs="Arial" w:eastAsia="Arial" w:hAnsi="Arial"/>
-          <w:sz w:val="20"/>
-          <w:szCs w:val="20"/>
-        </w:rPr>
-        <w:t xml:space="preserve">- woda morska:0,68mg/l</w:t>
-      </w:r>
-    </w:p>
-    <w:p>
-      <w:pPr>
-        <w:spacing w:after="80"/>
-      </w:pPr>
-      <w:r>
-        <w:rPr>
-          <w:rFonts w:ascii="Arial" w:cs="Arial" w:eastAsia="Arial" w:hAnsi="Arial"/>
-          <w:sz w:val="20"/>
-          <w:szCs w:val="20"/>
-        </w:rPr>
-        <w:t xml:space="preserve">- osady słodkowodne:16,39mg/kg/d</w:t>
-      </w:r>
-    </w:p>
-    <w:p>
-      <w:pPr>
-        <w:spacing w:after="80"/>
-      </w:pPr>
-      <w:r>
-        <w:rPr>
-          <w:rFonts w:ascii="Arial" w:cs="Arial" w:eastAsia="Arial" w:hAnsi="Arial"/>
-          <w:sz w:val="20"/>
-          <w:szCs w:val="20"/>
-        </w:rPr>
-        <w:t xml:space="preserve">- osady morskie:16,39mg/kg/d</w:t>
-      </w:r>
-    </w:p>
-    <w:p>
-      <w:pPr>
-        <w:spacing w:after="80"/>
-      </w:pPr>
-      <w:r>
-        <w:rPr>
-          <w:rFonts w:ascii="Arial" w:cs="Arial" w:eastAsia="Arial" w:hAnsi="Arial"/>
-          <w:sz w:val="20"/>
-          <w:szCs w:val="20"/>
-        </w:rPr>
-        <w:t xml:space="preserve">- woda (uwalnianie okresowe):0,68mg/l</w:t>
-      </w:r>
-    </w:p>
-    <w:p>
-      <w:pPr>
-        <w:spacing w:after="80"/>
-      </w:pPr>
-      <w:r>
-        <w:rPr>
-          <w:rFonts w:ascii="Arial" w:cs="Arial" w:eastAsia="Arial" w:hAnsi="Arial"/>
-          <w:sz w:val="20"/>
-          <w:szCs w:val="20"/>
-        </w:rPr>
-        <w:t xml:space="preserve">- mikroorganizmy w oczyszczalni ścieków (STP):13,61mg/l</w:t>
-      </w:r>
-    </w:p>
-    <w:p>
-      <w:pPr>
-        <w:spacing w:after="80"/>
-      </w:pPr>
-      <w:r>
-        <w:rPr>
-          <w:rFonts w:ascii="Arial" w:cs="Arial" w:eastAsia="Arial" w:hAnsi="Arial"/>
-          <w:sz w:val="20"/>
-          <w:szCs w:val="20"/>
-        </w:rPr>
-        <w:t xml:space="preserve">- łańcuch pokarmowy (zatrucie wtórne):2,89mg/kg soil dw</w:t>
+        <w:t xml:space="preserve">- woda słodka: 0,68 mg/l</w:t>
+      </w:r>
+    </w:p>
+    <w:p>
+      <w:pPr>
+        <w:spacing w:after="80"/>
+      </w:pPr>
+      <w:r>
+        <w:rPr>
+          <w:rFonts w:ascii="Arial" w:cs="Arial" w:eastAsia="Arial" w:hAnsi="Arial"/>
+          <w:sz w:val="20"/>
+          <w:szCs w:val="20"/>
+        </w:rPr>
+        <w:t xml:space="preserve">- woda morska: 0,68 mg/l</w:t>
+      </w:r>
+    </w:p>
+    <w:p>
+      <w:pPr>
+        <w:spacing w:after="80"/>
+      </w:pPr>
+      <w:r>
+        <w:rPr>
+          <w:rFonts w:ascii="Arial" w:cs="Arial" w:eastAsia="Arial" w:hAnsi="Arial"/>
+          <w:sz w:val="20"/>
+          <w:szCs w:val="20"/>
+        </w:rPr>
+        <w:t xml:space="preserve">- osady słodkowodne: 16,39 mg/kg suchej masy</w:t>
+      </w:r>
+    </w:p>
+    <w:p>
+      <w:pPr>
+        <w:spacing w:after="80"/>
+      </w:pPr>
+      <w:r>
+        <w:rPr>
+          <w:rFonts w:ascii="Arial" w:cs="Arial" w:eastAsia="Arial" w:hAnsi="Arial"/>
+          <w:sz w:val="20"/>
+          <w:szCs w:val="20"/>
+        </w:rPr>
+        <w:t xml:space="preserve">- osady morskie: 16,39 mg/kg suchej masy</w:t>
+      </w:r>
+    </w:p>
+    <w:p>
+      <w:pPr>
+        <w:spacing w:after="80"/>
+      </w:pPr>
+      <w:r>
+        <w:rPr>
+          <w:rFonts w:ascii="Arial" w:cs="Arial" w:eastAsia="Arial" w:hAnsi="Arial"/>
+          <w:sz w:val="20"/>
+          <w:szCs w:val="20"/>
+        </w:rPr>
+        <w:t xml:space="preserve">- woda (uwalnianie okresowe): 0,68 mg/l</w:t>
+      </w:r>
+    </w:p>
+    <w:p>
+      <w:pPr>
+        <w:spacing w:after="80"/>
+      </w:pPr>
+      <w:r>
+        <w:rPr>
+          <w:rFonts w:ascii="Arial" w:cs="Arial" w:eastAsia="Arial" w:hAnsi="Arial"/>
+          <w:sz w:val="20"/>
+          <w:szCs w:val="20"/>
+        </w:rPr>
+        <w:t xml:space="preserve">- mikroorganizmy w oczyszczalni ścieków (STP): 13,61 mg/l</w:t>
+      </w:r>
+    </w:p>
+    <w:p>
+      <w:pPr>
+        <w:spacing w:after="80"/>
+      </w:pPr>
+      <w:r>
+        <w:rPr>
+          <w:rFonts w:ascii="Arial" w:cs="Arial" w:eastAsia="Arial" w:hAnsi="Arial"/>
+          <w:sz w:val="20"/>
+          <w:szCs w:val="20"/>
+        </w:rPr>
+        <w:t xml:space="preserve">- łańcuch pokarmowy (zatrucie wtórne): 2,89 mg/kg suchej masy gleby</w:t>
       </w:r>
     </w:p>
     <w:p>
@@ -4063,46 +4063,563 @@
           <w:sz w:val="20"/>
           <w:szCs w:val="20"/>
         </w:rPr>
-        <w:t xml:space="preserve">W przypadku braku danych doświadczalnych dla samego produktu, zagrożenia dla zdrowia ocenia się zgodnie z właściwościami substancji w nim zawartych, stosując kryteria określone w odpowiednich przepisach dotyczących klasyfikacji.</w:t>
-      </w:r>
-    </w:p>
-    <w:p>
-      <w:pPr>
-        <w:spacing w:after="80"/>
-      </w:pPr>
-      <w:r>
-        <w:rPr>
-          <w:rFonts w:ascii="Arial" w:cs="Arial" w:eastAsia="Arial" w:hAnsi="Arial"/>
-          <w:sz w:val="20"/>
-          <w:szCs w:val="20"/>
-        </w:rPr>
-        <w:t xml:space="preserve">Należy zatem wziąć pod uwagę stężenia poszczególnych substancji niebezpiecznych wskazanych w sekcji 3, aby ocenić skutki toksykologiczne narażenia na produkt.</w:t>
-      </w:r>
-    </w:p>
-    <w:p>
-      <w:pPr>
-        <w:spacing w:after="80"/>
-      </w:pPr>
-      <w:r>
-        <w:rPr>
-          <w:rFonts w:ascii="Arial" w:cs="Arial" w:eastAsia="Arial" w:hAnsi="Arial"/>
-          <w:sz w:val="20"/>
-          <w:szCs w:val="20"/>
-        </w:rPr>
-        <w:t xml:space="preserve">Metabolizm, toksykokinetyka, mechanizm działania i inne informacje:</w:t>
-      </w:r>
-    </w:p>
-    <w:p>
-      <w:pPr>
-        <w:spacing w:after="80"/>
-      </w:pPr>
-      <w:r>
-        <w:rPr>
-          <w:rFonts w:ascii="Arial" w:cs="Arial" w:eastAsia="Arial" w:hAnsi="Arial"/>
-          <w:sz w:val="20"/>
-          <w:szCs w:val="20"/>
-        </w:rPr>
-        <w:t xml:space="preserve">Brak dostępnych danych.</w:t>
+        <w:t xml:space="preserve">W przypadku braku danych doświadczalnych dla samego produktu, zagrożenia dla zdrowia oceniono na podstawie właściwości substancji składowych, zgodnie z kryteriami określonymi w odpowiednich przepisach klasyfikacyjnych. Przy ocenie skutków toksykologicznych narażenia na produkt uwzględniono stężenia poszczególnych substancji niebezpiecznych wskazanych w sekcji 3.</w:t>
+      </w:r>
+    </w:p>
+    <w:p>
+      <w:pPr>
+        <w:spacing w:after="80"/>
+      </w:pPr>
+      <w:r>
+        <w:rPr>
+          <w:rFonts w:ascii="Arial" w:cs="Arial" w:eastAsia="Arial" w:hAnsi="Arial"/>
+          <w:sz w:val="20"/>
+          <w:szCs w:val="20"/>
+        </w:rPr>
+        <w:t xml:space="preserve">Toksyczność ostra:</w:t>
+      </w:r>
+    </w:p>
+    <w:p>
+      <w:pPr>
+        <w:spacing w:after="80"/>
+      </w:pPr>
+      <w:r>
+        <w:rPr>
+          <w:rFonts w:ascii="Arial" w:cs="Arial" w:eastAsia="Arial" w:hAnsi="Arial"/>
+          <w:sz w:val="20"/>
+          <w:szCs w:val="20"/>
+        </w:rPr>
+        <w:t xml:space="preserve">Mieszanina nie spełnia kryteriów klasyfikacji w tej klasie zagrożenia.</w:t>
+      </w:r>
+    </w:p>
+    <w:p>
+      <w:pPr>
+        <w:spacing w:after="80"/>
+      </w:pPr>
+      <w:r>
+        <w:rPr>
+          <w:rFonts w:ascii="Arial" w:cs="Arial" w:eastAsia="Arial" w:hAnsi="Arial"/>
+          <w:sz w:val="20"/>
+          <w:szCs w:val="20"/>
+        </w:rPr>
+        <w:t xml:space="preserve">- ATE mieszaniny (drogi oddechowe): Nie sklasyfikowano (brak istotnych składników stwarzających zagrożenie drogą oddechową w stężeniach wymagających klasyfikacji)</w:t>
+      </w:r>
+    </w:p>
+    <w:p>
+      <w:pPr>
+        <w:spacing w:after="80"/>
+      </w:pPr>
+      <w:r>
+        <w:rPr>
+          <w:rFonts w:ascii="Arial" w:cs="Arial" w:eastAsia="Arial" w:hAnsi="Arial"/>
+          <w:sz w:val="20"/>
+          <w:szCs w:val="20"/>
+        </w:rPr>
+        <w:t xml:space="preserve">- ATE mieszaniny (droga pokarmowa): Nie sklasyfikowano (wartość obliczona znacznie przekracza 2000 mg/kg)</w:t>
+      </w:r>
+    </w:p>
+    <w:p>
+      <w:pPr>
+        <w:spacing w:after="80"/>
+      </w:pPr>
+      <w:r>
+        <w:rPr>
+          <w:rFonts w:ascii="Arial" w:cs="Arial" w:eastAsia="Arial" w:hAnsi="Arial"/>
+          <w:sz w:val="20"/>
+          <w:szCs w:val="20"/>
+        </w:rPr>
+        <w:t xml:space="preserve">- ATE mieszaniny (na skórę): Nie sklasyfikowano (brak istotnych składników)</w:t>
+      </w:r>
+    </w:p>
+    <w:p>
+      <w:pPr>
+        <w:spacing w:after="80"/>
+      </w:pPr>
+      <w:r>
+        <w:rPr>
+          <w:rFonts w:ascii="Arial" w:cs="Arial" w:eastAsia="Arial" w:hAnsi="Arial"/>
+          <w:sz w:val="20"/>
+          <w:szCs w:val="20"/>
+        </w:rPr>
+        <w:t xml:space="preserve">Dane dotyczące składników:</w:t>
+      </w:r>
+    </w:p>
+    <w:p>
+      <w:pPr>
+        <w:spacing w:after="80" w:before="150"/>
+      </w:pPr>
+      <w:r>
+        <w:rPr>
+          <w:rFonts w:ascii="Arial" w:cs="Arial" w:eastAsia="Arial" w:hAnsi="Arial"/>
+          <w:b/>
+          <w:bCs/>
+          <w:sz w:val="20"/>
+          <w:szCs w:val="20"/>
+        </w:rPr>
+        <w:t xml:space="preserve">Etanol (CAS: 64-17-5):</w:t>
+      </w:r>
+    </w:p>
+    <w:p>
+      <w:pPr>
+        <w:spacing w:after="80"/>
+      </w:pPr>
+      <w:r>
+        <w:rPr>
+          <w:rFonts w:ascii="Arial" w:cs="Arial" w:eastAsia="Arial" w:hAnsi="Arial"/>
+          <w:sz w:val="20"/>
+          <w:szCs w:val="20"/>
+        </w:rPr>
+        <w:t xml:space="preserve">- LD50 (doustnie, szczur): &gt; 5000 mg/kg</w:t>
+      </w:r>
+    </w:p>
+    <w:p>
+      <w:pPr>
+        <w:spacing w:after="80"/>
+      </w:pPr>
+      <w:r>
+        <w:rPr>
+          <w:rFonts w:ascii="Arial" w:cs="Arial" w:eastAsia="Arial" w:hAnsi="Arial"/>
+          <w:sz w:val="20"/>
+          <w:szCs w:val="20"/>
+        </w:rPr>
+        <w:t xml:space="preserve">- LC50 (inhalacyjnie - pary, szczur): &gt; 50 mg/l/4h</w:t>
+      </w:r>
+    </w:p>
+    <w:p>
+      <w:pPr>
+        <w:spacing w:after="80" w:before="150"/>
+      </w:pPr>
+      <w:r>
+        <w:rPr>
+          <w:rFonts w:ascii="Arial" w:cs="Arial" w:eastAsia="Arial" w:hAnsi="Arial"/>
+          <w:b/>
+          <w:bCs/>
+          <w:sz w:val="20"/>
+          <w:szCs w:val="20"/>
+        </w:rPr>
+        <w:t xml:space="preserve">Aldehyd anyżowy (CAS: 123-11-5):</w:t>
+      </w:r>
+    </w:p>
+    <w:p>
+      <w:pPr>
+        <w:spacing w:after="80"/>
+      </w:pPr>
+      <w:r>
+        <w:rPr>
+          <w:rFonts w:ascii="Arial" w:cs="Arial" w:eastAsia="Arial" w:hAnsi="Arial"/>
+          <w:sz w:val="20"/>
+          <w:szCs w:val="20"/>
+        </w:rPr>
+        <w:t xml:space="preserve">- LD50 (skóra, królik): &gt; 5000 mg/kg</w:t>
+      </w:r>
+    </w:p>
+    <w:p>
+      <w:pPr>
+        <w:spacing w:after="80"/>
+      </w:pPr>
+      <w:r>
+        <w:rPr>
+          <w:rFonts w:ascii="Arial" w:cs="Arial" w:eastAsia="Arial" w:hAnsi="Arial"/>
+          <w:sz w:val="20"/>
+          <w:szCs w:val="20"/>
+        </w:rPr>
+        <w:t xml:space="preserve">- LD50 (doustnie, szczur): 3210 mg/kg</w:t>
+      </w:r>
+    </w:p>
+    <w:p>
+      <w:pPr>
+        <w:spacing w:after="80"/>
+      </w:pPr>
+      <w:r>
+        <w:rPr>
+          <w:rFonts w:ascii="Arial" w:cs="Arial" w:eastAsia="Arial" w:hAnsi="Arial"/>
+          <w:sz w:val="20"/>
+          <w:szCs w:val="20"/>
+        </w:rPr>
+        <w:t xml:space="preserve">- LC50 (inhalacyjnie - pary, szczur): 0,32 mg/l/7h</w:t>
+      </w:r>
+    </w:p>
+    <w:p>
+      <w:pPr>
+        <w:spacing w:after="80" w:before="150"/>
+      </w:pPr>
+      <w:r>
+        <w:rPr>
+          <w:rFonts w:ascii="Arial" w:cs="Arial" w:eastAsia="Arial" w:hAnsi="Arial"/>
+          <w:b/>
+          <w:bCs/>
+          <w:sz w:val="20"/>
+          <w:szCs w:val="20"/>
+        </w:rPr>
+        <w:t xml:space="preserve">Kumaryna (CAS: 91-64-5):</w:t>
+      </w:r>
+    </w:p>
+    <w:p>
+      <w:pPr>
+        <w:spacing w:after="80"/>
+      </w:pPr>
+      <w:r>
+        <w:rPr>
+          <w:rFonts w:ascii="Arial" w:cs="Arial" w:eastAsia="Arial" w:hAnsi="Arial"/>
+          <w:sz w:val="20"/>
+          <w:szCs w:val="20"/>
+        </w:rPr>
+        <w:t xml:space="preserve">- LD50 (skóra, szczur): 293 mg/kg m.c.</w:t>
+      </w:r>
+    </w:p>
+    <w:p>
+      <w:pPr>
+        <w:spacing w:after="80"/>
+      </w:pPr>
+      <w:r>
+        <w:rPr>
+          <w:rFonts w:ascii="Arial" w:cs="Arial" w:eastAsia="Arial" w:hAnsi="Arial"/>
+          <w:sz w:val="20"/>
+          <w:szCs w:val="20"/>
+        </w:rPr>
+        <w:t xml:space="preserve">- LD50 (doustnie, szczur): 290 mg/kg m.c. (ATE = 500 mg/kg)</w:t>
+      </w:r>
+    </w:p>
+    <w:p>
+      <w:pPr>
+        <w:spacing w:after="80"/>
+      </w:pPr>
+      <w:r>
+        <w:rPr>
+          <w:rFonts w:ascii="Arial" w:cs="Arial" w:eastAsia="Arial" w:hAnsi="Arial"/>
+          <w:sz w:val="20"/>
+          <w:szCs w:val="20"/>
+        </w:rPr>
+        <w:t xml:space="preserve">- LC50 (inhalacyjnie - pyły/mgły, szczur): 293 mg/m³</w:t>
+      </w:r>
+    </w:p>
+    <w:p>
+      <w:pPr>
+        <w:spacing w:after="80" w:before="150"/>
+      </w:pPr>
+      <w:r>
+        <w:rPr>
+          <w:rFonts w:ascii="Arial" w:cs="Arial" w:eastAsia="Arial" w:hAnsi="Arial"/>
+          <w:b/>
+          <w:bCs/>
+          <w:sz w:val="20"/>
+          <w:szCs w:val="20"/>
+        </w:rPr>
+        <w:t xml:space="preserve">2,6-di-tert-butylo-4-metylofenol (BHT) (CAS: 128-37-0):</w:t>
+      </w:r>
+    </w:p>
+    <w:p>
+      <w:pPr>
+        <w:spacing w:after="80"/>
+      </w:pPr>
+      <w:r>
+        <w:rPr>
+          <w:rFonts w:ascii="Arial" w:cs="Arial" w:eastAsia="Arial" w:hAnsi="Arial"/>
+          <w:sz w:val="20"/>
+          <w:szCs w:val="20"/>
+        </w:rPr>
+        <w:t xml:space="preserve">- LD50 (skóra, szczur): &gt; 2000 mg/kg</w:t>
+      </w:r>
+    </w:p>
+    <w:p>
+      <w:pPr>
+        <w:spacing w:after="80"/>
+      </w:pPr>
+      <w:r>
+        <w:rPr>
+          <w:rFonts w:ascii="Arial" w:cs="Arial" w:eastAsia="Arial" w:hAnsi="Arial"/>
+          <w:sz w:val="20"/>
+          <w:szCs w:val="20"/>
+        </w:rPr>
+        <w:t xml:space="preserve">- LD50 (doustnie, szczur): 2930 mg/kg</w:t>
+      </w:r>
+    </w:p>
+    <w:p>
+      <w:pPr>
+        <w:spacing w:after="80" w:before="150"/>
+      </w:pPr>
+      <w:r>
+        <w:rPr>
+          <w:rFonts w:ascii="Arial" w:cs="Arial" w:eastAsia="Arial" w:hAnsi="Arial"/>
+          <w:b/>
+          <w:bCs/>
+          <w:sz w:val="20"/>
+          <w:szCs w:val="20"/>
+        </w:rPr>
+        <w:t xml:space="preserve">Toluen (CAS: 108-88-3):</w:t>
+      </w:r>
+    </w:p>
+    <w:p>
+      <w:pPr>
+        <w:spacing w:after="80"/>
+      </w:pPr>
+      <w:r>
+        <w:rPr>
+          <w:rFonts w:ascii="Arial" w:cs="Arial" w:eastAsia="Arial" w:hAnsi="Arial"/>
+          <w:sz w:val="20"/>
+          <w:szCs w:val="20"/>
+        </w:rPr>
+        <w:t xml:space="preserve">- LD50 (skóra, królik): &gt; 5000 mg/kg m.c.</w:t>
+      </w:r>
+    </w:p>
+    <w:p>
+      <w:pPr>
+        <w:spacing w:after="80"/>
+      </w:pPr>
+      <w:r>
+        <w:rPr>
+          <w:rFonts w:ascii="Arial" w:cs="Arial" w:eastAsia="Arial" w:hAnsi="Arial"/>
+          <w:sz w:val="20"/>
+          <w:szCs w:val="20"/>
+        </w:rPr>
+        <w:t xml:space="preserve">- LD50 (doustnie, szczur): &gt; 5000 mg/kg m.c.</w:t>
+      </w:r>
+    </w:p>
+    <w:p>
+      <w:pPr>
+        <w:spacing w:after="80"/>
+      </w:pPr>
+      <w:r>
+        <w:rPr>
+          <w:rFonts w:ascii="Arial" w:cs="Arial" w:eastAsia="Arial" w:hAnsi="Arial"/>
+          <w:sz w:val="20"/>
+          <w:szCs w:val="20"/>
+        </w:rPr>
+        <w:t xml:space="preserve">- LC50 (inhalacyjnie - pary, człowiek): 100 ppm</w:t>
+      </w:r>
+    </w:p>
+    <w:p>
+      <w:pPr>
+        <w:spacing w:after="80"/>
+      </w:pPr>
+      <w:r>
+        <w:rPr>
+          <w:rFonts w:ascii="Arial" w:cs="Arial" w:eastAsia="Arial" w:hAnsi="Arial"/>
+          <w:sz w:val="20"/>
+          <w:szCs w:val="20"/>
+        </w:rPr>
+        <w:t xml:space="preserve">Działanie żrące/drażniące na skórę:</w:t>
+      </w:r>
+    </w:p>
+    <w:p>
+      <w:pPr>
+        <w:spacing w:after="80"/>
+      </w:pPr>
+      <w:r>
+        <w:rPr>
+          <w:rFonts w:ascii="Arial" w:cs="Arial" w:eastAsia="Arial" w:hAnsi="Arial"/>
+          <w:sz w:val="20"/>
+          <w:szCs w:val="20"/>
+        </w:rPr>
+        <w:t xml:space="preserve">W oparciu o dostępne dane, kryteria klasyfikacji nie są spełnione.</w:t>
+      </w:r>
+    </w:p>
+    <w:p>
+      <w:pPr>
+        <w:spacing w:after="80"/>
+      </w:pPr>
+      <w:r>
+        <w:rPr>
+          <w:rFonts w:ascii="Arial" w:cs="Arial" w:eastAsia="Arial" w:hAnsi="Arial"/>
+          <w:sz w:val="20"/>
+          <w:szCs w:val="20"/>
+        </w:rPr>
+        <w:t xml:space="preserve">Poważne uszkodzenie oczu/działanie drażniące na oczy:</w:t>
+      </w:r>
+    </w:p>
+    <w:p>
+      <w:pPr>
+        <w:spacing w:after="80"/>
+      </w:pPr>
+      <w:r>
+        <w:rPr>
+          <w:rFonts w:ascii="Arial" w:cs="Arial" w:eastAsia="Arial" w:hAnsi="Arial"/>
+          <w:sz w:val="20"/>
+          <w:szCs w:val="20"/>
+        </w:rPr>
+        <w:t xml:space="preserve">Działa drażniąco na oczy (Kategoria 2, H319). Produkt zawiera etanol w stężeniu ≥ 50 %.</w:t>
+      </w:r>
+    </w:p>
+    <w:p>
+      <w:pPr>
+        <w:spacing w:after="80"/>
+      </w:pPr>
+      <w:r>
+        <w:rPr>
+          <w:rFonts w:ascii="Arial" w:cs="Arial" w:eastAsia="Arial" w:hAnsi="Arial"/>
+          <w:sz w:val="20"/>
+          <w:szCs w:val="20"/>
+        </w:rPr>
+        <w:t xml:space="preserve">Działanie uczulające na drogi oddechowe lub skórę:</w:t>
+      </w:r>
+    </w:p>
+    <w:p>
+      <w:pPr>
+        <w:spacing w:after="80"/>
+      </w:pPr>
+      <w:r>
+        <w:rPr>
+          <w:rFonts w:ascii="Arial" w:cs="Arial" w:eastAsia="Arial" w:hAnsi="Arial"/>
+          <w:sz w:val="20"/>
+          <w:szCs w:val="20"/>
+        </w:rPr>
+        <w:t xml:space="preserve">W oparciu o dostępne dane, kryteria klasyfikacji nie są spełnione. Może powodować wystąpienie reakcji alergicznej. Zawiera: kumarynę (2H-chromen-2-on) (EUH208).</w:t>
+      </w:r>
+    </w:p>
+    <w:p>
+      <w:pPr>
+        <w:spacing w:after="80"/>
+      </w:pPr>
+      <w:r>
+        <w:rPr>
+          <w:rFonts w:ascii="Arial" w:cs="Arial" w:eastAsia="Arial" w:hAnsi="Arial"/>
+          <w:sz w:val="20"/>
+          <w:szCs w:val="20"/>
+        </w:rPr>
+        <w:t xml:space="preserve">Działanie mutagenne na komórki rozrodcze:</w:t>
+      </w:r>
+    </w:p>
+    <w:p>
+      <w:pPr>
+        <w:spacing w:after="80"/>
+      </w:pPr>
+      <w:r>
+        <w:rPr>
+          <w:rFonts w:ascii="Arial" w:cs="Arial" w:eastAsia="Arial" w:hAnsi="Arial"/>
+          <w:sz w:val="20"/>
+          <w:szCs w:val="20"/>
+        </w:rPr>
+        <w:t xml:space="preserve">W oparciu o dostępne dane, kryteria klasyfikacji nie są spełnione.</w:t>
+      </w:r>
+    </w:p>
+    <w:p>
+      <w:pPr>
+        <w:spacing w:after="80"/>
+      </w:pPr>
+      <w:r>
+        <w:rPr>
+          <w:rFonts w:ascii="Arial" w:cs="Arial" w:eastAsia="Arial" w:hAnsi="Arial"/>
+          <w:sz w:val="20"/>
+          <w:szCs w:val="20"/>
+        </w:rPr>
+        <w:t xml:space="preserve">Rakotwórczość:</w:t>
+      </w:r>
+    </w:p>
+    <w:p>
+      <w:pPr>
+        <w:spacing w:after="80"/>
+      </w:pPr>
+      <w:r>
+        <w:rPr>
+          <w:rFonts w:ascii="Arial" w:cs="Arial" w:eastAsia="Arial" w:hAnsi="Arial"/>
+          <w:sz w:val="20"/>
+          <w:szCs w:val="20"/>
+        </w:rPr>
+        <w:t xml:space="preserve">W oparciu o dostępne dane, kryteria klasyfikacji nie są spełnione. Toluen został zaklasyfikowany do Grupy 3 (brak możliwości zaklasyfikowania jako rakotwórczy dla ludzi) przez Międzynarodową Agencję Badań nad Rakiem (IARC, 1999). Agencja Ochrony Środowiska Stanów Zjednoczonych (US EPA) wskazuje, że dane są niewystarczające do oceny potencjału rakotwórczego.</w:t>
+      </w:r>
+    </w:p>
+    <w:p>
+      <w:pPr>
+        <w:spacing w:after="80"/>
+      </w:pPr>
+      <w:r>
+        <w:rPr>
+          <w:rFonts w:ascii="Arial" w:cs="Arial" w:eastAsia="Arial" w:hAnsi="Arial"/>
+          <w:sz w:val="20"/>
+          <w:szCs w:val="20"/>
+        </w:rPr>
+        <w:t xml:space="preserve">Szkodliwe działanie na rozrodczość:</w:t>
+      </w:r>
+    </w:p>
+    <w:p>
+      <w:pPr>
+        <w:spacing w:after="80"/>
+      </w:pPr>
+      <w:r>
+        <w:rPr>
+          <w:rFonts w:ascii="Arial" w:cs="Arial" w:eastAsia="Arial" w:hAnsi="Arial"/>
+          <w:sz w:val="20"/>
+          <w:szCs w:val="20"/>
+        </w:rPr>
+        <w:t xml:space="preserve">W oparciu o dostępne dane, kryteria klasyfikacji nie są spełnione. Zawiera aldehyd anyżowy (Repr. 2 H361fd) i toluen (Repr. 2 H361d) w stężeniach poniżej wartości progowych skutkujących klasyfikacją mieszaniny.</w:t>
+      </w:r>
+    </w:p>
+    <w:p>
+      <w:pPr>
+        <w:spacing w:after="80"/>
+      </w:pPr>
+      <w:r>
+        <w:rPr>
+          <w:rFonts w:ascii="Arial" w:cs="Arial" w:eastAsia="Arial" w:hAnsi="Arial"/>
+          <w:sz w:val="20"/>
+          <w:szCs w:val="20"/>
+        </w:rPr>
+        <w:t xml:space="preserve">Działanie toksyczne na narządy docelowe – narażenie jednorazowe (STOT SE):</w:t>
+      </w:r>
+    </w:p>
+    <w:p>
+      <w:pPr>
+        <w:spacing w:after="80"/>
+      </w:pPr>
+      <w:r>
+        <w:rPr>
+          <w:rFonts w:ascii="Arial" w:cs="Arial" w:eastAsia="Arial" w:hAnsi="Arial"/>
+          <w:sz w:val="20"/>
+          <w:szCs w:val="20"/>
+        </w:rPr>
+        <w:t xml:space="preserve">W oparciu o dostępne dane, kryteria klasyfikacji nie są spełnione.</w:t>
+      </w:r>
+    </w:p>
+    <w:p>
+      <w:pPr>
+        <w:spacing w:after="80"/>
+      </w:pPr>
+      <w:r>
+        <w:rPr>
+          <w:rFonts w:ascii="Arial" w:cs="Arial" w:eastAsia="Arial" w:hAnsi="Arial"/>
+          <w:sz w:val="20"/>
+          <w:szCs w:val="20"/>
+        </w:rPr>
+        <w:t xml:space="preserve">Działanie toksyczne na narządy docelowe – narażenie powtarzane (STOT RE):</w:t>
+      </w:r>
+    </w:p>
+    <w:p>
+      <w:pPr>
+        <w:spacing w:after="80"/>
+      </w:pPr>
+      <w:r>
+        <w:rPr>
+          <w:rFonts w:ascii="Arial" w:cs="Arial" w:eastAsia="Arial" w:hAnsi="Arial"/>
+          <w:sz w:val="20"/>
+          <w:szCs w:val="20"/>
+        </w:rPr>
+        <w:t xml:space="preserve">W oparciu o dostępne dane, kryteria klasyfikacji nie są spełnione.</w:t>
+      </w:r>
+    </w:p>
+    <w:p>
+      <w:pPr>
+        <w:spacing w:after="80"/>
+      </w:pPr>
+      <w:r>
+        <w:rPr>
+          <w:rFonts w:ascii="Arial" w:cs="Arial" w:eastAsia="Arial" w:hAnsi="Arial"/>
+          <w:sz w:val="20"/>
+          <w:szCs w:val="20"/>
+        </w:rPr>
+        <w:t xml:space="preserve">Zagrożenie spowodowane aspiracją:</w:t>
+      </w:r>
+    </w:p>
+    <w:p>
+      <w:pPr>
+        <w:spacing w:after="80"/>
+      </w:pPr>
+      <w:r>
+        <w:rPr>
+          <w:rFonts w:ascii="Arial" w:cs="Arial" w:eastAsia="Arial" w:hAnsi="Arial"/>
+          <w:sz w:val="20"/>
+          <w:szCs w:val="20"/>
+        </w:rPr>
+        <w:t xml:space="preserve">W oparciu o dostępne dane, kryteria klasyfikacji nie są spełnione.</w:t>
       </w:r>
     </w:p>
     <w:p>
@@ -4128,669 +4645,72 @@
           <w:sz w:val="20"/>
           <w:szCs w:val="20"/>
         </w:rPr>
-        <w:t xml:space="preserve">Toluen:</w:t>
-      </w:r>
-    </w:p>
-    <w:p>
-      <w:pPr>
-        <w:spacing w:after="80"/>
-      </w:pPr>
-      <w:r>
-        <w:rPr>
-          <w:rFonts w:ascii="Arial" w:cs="Arial" w:eastAsia="Arial" w:hAnsi="Arial"/>
-          <w:sz w:val="20"/>
-          <w:szCs w:val="20"/>
-        </w:rPr>
-        <w:t xml:space="preserve">Pracownicy: przez drogi oddechowe (inhalacyjnie); kontakt ze skórą.</w:t>
-      </w:r>
-    </w:p>
-    <w:p>
-      <w:pPr>
-        <w:spacing w:after="80"/>
-      </w:pPr>
-      <w:r>
-        <w:rPr>
-          <w:rFonts w:ascii="Arial" w:cs="Arial" w:eastAsia="Arial" w:hAnsi="Arial"/>
-          <w:sz w:val="20"/>
-          <w:szCs w:val="20"/>
-        </w:rPr>
-        <w:t xml:space="preserve">Konsumenci: spożycie skażonej żywności lub wody; przez drogi oddechowe (inhalacyjnie) z powietrza otoczenia; kontakt ze skórą z produktami zawierającymi substancję.</w:t>
-      </w:r>
-    </w:p>
-    <w:p>
-      <w:pPr>
-        <w:spacing w:after="80"/>
-      </w:pPr>
-      <w:r>
-        <w:rPr>
-          <w:rFonts w:ascii="Arial" w:cs="Arial" w:eastAsia="Arial" w:hAnsi="Arial"/>
-          <w:sz w:val="20"/>
-          <w:szCs w:val="20"/>
-        </w:rPr>
-        <w:t xml:space="preserve">Skutki opóźnione i bezpośrednie oraz skutki przewlekłe spowodowane krótko- i długotrwałym narażeniem:</w:t>
-      </w:r>
-    </w:p>
-    <w:p>
-      <w:pPr>
-        <w:spacing w:after="80"/>
-      </w:pPr>
-      <w:r>
-        <w:rPr>
-          <w:rFonts w:ascii="Arial" w:cs="Arial" w:eastAsia="Arial" w:hAnsi="Arial"/>
-          <w:sz w:val="20"/>
-          <w:szCs w:val="20"/>
-        </w:rPr>
-        <w:t xml:space="preserve">Toluen:</w:t>
-      </w:r>
-    </w:p>
-    <w:p>
-      <w:pPr>
-        <w:spacing w:after="80"/>
-      </w:pPr>
-      <w:r>
-        <w:rPr>
-          <w:rFonts w:ascii="Arial" w:cs="Arial" w:eastAsia="Arial" w:hAnsi="Arial"/>
-          <w:sz w:val="20"/>
-          <w:szCs w:val="20"/>
-        </w:rPr>
-        <w:t xml:space="preserve">Działanie toksyczne na ośrodkowy i obwodowy układ nerwowy z encefalopatią i polineuropatią; działa drażniąco na skórę, spojówki, rogówkę i drogi oddechowe.</w:t>
-      </w:r>
-    </w:p>
-    <w:p>
-      <w:pPr>
-        <w:spacing w:after="80"/>
-      </w:pPr>
-      <w:r>
-        <w:rPr>
-          <w:rFonts w:ascii="Arial" w:cs="Arial" w:eastAsia="Arial" w:hAnsi="Arial"/>
-          <w:sz w:val="20"/>
-          <w:szCs w:val="20"/>
-        </w:rPr>
-        <w:t xml:space="preserve">Działanie wzajemne:</w:t>
-      </w:r>
-    </w:p>
-    <w:p>
-      <w:pPr>
-        <w:spacing w:after="80"/>
-      </w:pPr>
-      <w:r>
-        <w:rPr>
-          <w:rFonts w:ascii="Arial" w:cs="Arial" w:eastAsia="Arial" w:hAnsi="Arial"/>
-          <w:sz w:val="20"/>
-          <w:szCs w:val="20"/>
-        </w:rPr>
-        <w:t xml:space="preserve">Toluen:</w:t>
-      </w:r>
-    </w:p>
-    <w:p>
-      <w:pPr>
-        <w:spacing w:after="80"/>
-      </w:pPr>
-      <w:r>
-        <w:rPr>
-          <w:rFonts w:ascii="Arial" w:cs="Arial" w:eastAsia="Arial" w:hAnsi="Arial"/>
-          <w:sz w:val="20"/>
-          <w:szCs w:val="20"/>
-        </w:rPr>
-        <w:t xml:space="preserve">Niektóre leki i inne produkty przemysłowe mogą zakłócać metabolizm toluenu.</w:t>
-      </w:r>
-    </w:p>
-    <w:p>
-      <w:pPr>
-        <w:spacing w:after="80"/>
-      </w:pPr>
-      <w:r>
-        <w:rPr>
-          <w:rFonts w:ascii="Arial" w:cs="Arial" w:eastAsia="Arial" w:hAnsi="Arial"/>
-          <w:sz w:val="20"/>
-          <w:szCs w:val="20"/>
-        </w:rPr>
-        <w:t xml:space="preserve">Toksyczność ostra:</w:t>
-      </w:r>
-    </w:p>
-    <w:p>
-      <w:pPr>
-        <w:spacing w:after="80"/>
-      </w:pPr>
-      <w:r>
-        <w:rPr>
-          <w:rFonts w:ascii="Arial" w:cs="Arial" w:eastAsia="Arial" w:hAnsi="Arial"/>
-          <w:sz w:val="20"/>
-          <w:szCs w:val="20"/>
-        </w:rPr>
-        <w:t xml:space="preserve">ATE (drogi oddechowe - inhalacyjnie) mieszaniny: Nie sklasyfikowano (brak istotnych składników)</w:t>
-      </w:r>
-    </w:p>
-    <w:p>
-      <w:pPr>
-        <w:spacing w:after="80"/>
-      </w:pPr>
-      <w:r>
-        <w:rPr>
-          <w:rFonts w:ascii="Arial" w:cs="Arial" w:eastAsia="Arial" w:hAnsi="Arial"/>
-          <w:sz w:val="20"/>
-          <w:szCs w:val="20"/>
-        </w:rPr>
-        <w:t xml:space="preserve">ATE (droga pokarmowa - doustnie) mieszaniny: Nie sklasyfikowano (brak istotnych składników)</w:t>
-      </w:r>
-    </w:p>
-    <w:p>
-      <w:pPr>
-        <w:spacing w:after="80"/>
-      </w:pPr>
-      <w:r>
-        <w:rPr>
-          <w:rFonts w:ascii="Arial" w:cs="Arial" w:eastAsia="Arial" w:hAnsi="Arial"/>
-          <w:sz w:val="20"/>
-          <w:szCs w:val="20"/>
-        </w:rPr>
-        <w:t xml:space="preserve">ATE (na skórę) mieszaniny: Nie sklasyfikowano (brak istotnych składników)</w:t>
-      </w:r>
-    </w:p>
-    <w:p>
-      <w:pPr>
-        <w:spacing w:after="80" w:before="150"/>
-      </w:pPr>
-      <w:r>
-        <w:rPr>
-          <w:rFonts w:ascii="Arial" w:cs="Arial" w:eastAsia="Arial" w:hAnsi="Arial"/>
-          <w:b/>
-          <w:bCs/>
-          <w:sz w:val="20"/>
-          <w:szCs w:val="20"/>
-        </w:rPr>
-        <w:t xml:space="preserve">Informacje dotyczące składników:</w:t>
-      </w:r>
-    </w:p>
-    <w:p>
-      <w:pPr>
-        <w:spacing w:after="80" w:before="150"/>
-      </w:pPr>
-      <w:r>
-        <w:rPr>
-          <w:rFonts w:ascii="Arial" w:cs="Arial" w:eastAsia="Arial" w:hAnsi="Arial"/>
-          <w:b/>
-          <w:bCs/>
-          <w:sz w:val="20"/>
-          <w:szCs w:val="20"/>
-        </w:rPr>
-        <w:t xml:space="preserve">Etanol (CAS: 64-17-5):</w:t>
-      </w:r>
-    </w:p>
-    <w:p>
-      <w:pPr>
-        <w:spacing w:after="80"/>
-      </w:pPr>
-      <w:r>
-        <w:rPr>
-          <w:rFonts w:ascii="Arial" w:cs="Arial" w:eastAsia="Arial" w:hAnsi="Arial"/>
-          <w:sz w:val="20"/>
-          <w:szCs w:val="20"/>
-        </w:rPr>
-        <w:t xml:space="preserve">LD50 (droga pokarmowa, szczur): &gt; 5000 mg/kg</w:t>
-      </w:r>
-    </w:p>
-    <w:p>
-      <w:pPr>
-        <w:spacing w:after="80"/>
-      </w:pPr>
-      <w:r>
-        <w:rPr>
-          <w:rFonts w:ascii="Arial" w:cs="Arial" w:eastAsia="Arial" w:hAnsi="Arial"/>
-          <w:sz w:val="20"/>
-          <w:szCs w:val="20"/>
-        </w:rPr>
-        <w:t xml:space="preserve">LC50 (przez drogi oddechowe - pary, szczur): &gt; 50 mg/l/4 h</w:t>
-      </w:r>
-    </w:p>
-    <w:p>
-      <w:pPr>
-        <w:spacing w:after="80" w:before="150"/>
-      </w:pPr>
-      <w:r>
-        <w:rPr>
-          <w:rFonts w:ascii="Arial" w:cs="Arial" w:eastAsia="Arial" w:hAnsi="Arial"/>
-          <w:b/>
-          <w:bCs/>
-          <w:sz w:val="20"/>
-          <w:szCs w:val="20"/>
-        </w:rPr>
-        <w:t xml:space="preserve">Aldehyd anyżowy (4-metoksybenzaldehyd) (CAS: 123-11-5):</w:t>
-      </w:r>
-    </w:p>
-    <w:p>
-      <w:pPr>
-        <w:spacing w:after="80"/>
-      </w:pPr>
-      <w:r>
-        <w:rPr>
-          <w:rFonts w:ascii="Arial" w:cs="Arial" w:eastAsia="Arial" w:hAnsi="Arial"/>
-          <w:sz w:val="20"/>
-          <w:szCs w:val="20"/>
-        </w:rPr>
-        <w:t xml:space="preserve">LD50 (na skórę, królik): &gt; 5000 mg/kg</w:t>
-      </w:r>
-    </w:p>
-    <w:p>
-      <w:pPr>
-        <w:spacing w:after="80"/>
-      </w:pPr>
-      <w:r>
-        <w:rPr>
-          <w:rFonts w:ascii="Arial" w:cs="Arial" w:eastAsia="Arial" w:hAnsi="Arial"/>
-          <w:sz w:val="20"/>
-          <w:szCs w:val="20"/>
-        </w:rPr>
-        <w:t xml:space="preserve">LD50 (droga pokarmowa, szczur): 3210 mg/kg</w:t>
-      </w:r>
-    </w:p>
-    <w:p>
-      <w:pPr>
-        <w:spacing w:after="80"/>
-      </w:pPr>
-      <w:r>
-        <w:rPr>
-          <w:rFonts w:ascii="Arial" w:cs="Arial" w:eastAsia="Arial" w:hAnsi="Arial"/>
-          <w:sz w:val="20"/>
-          <w:szCs w:val="20"/>
-        </w:rPr>
-        <w:t xml:space="preserve">LC50 (przez drogi oddechowe - pary, szczur): 0,32 mg/l/7 h</w:t>
-      </w:r>
-    </w:p>
-    <w:p>
-      <w:pPr>
-        <w:spacing w:after="80" w:before="150"/>
-      </w:pPr>
-      <w:r>
-        <w:rPr>
-          <w:rFonts w:ascii="Arial" w:cs="Arial" w:eastAsia="Arial" w:hAnsi="Arial"/>
-          <w:b/>
-          <w:bCs/>
-          <w:sz w:val="20"/>
-          <w:szCs w:val="20"/>
-        </w:rPr>
-        <w:t xml:space="preserve">Kumaryna (2H-chromen-2-on) (CAS: 91-64-5):</w:t>
-      </w:r>
-    </w:p>
-    <w:p>
-      <w:pPr>
-        <w:spacing w:after="80"/>
-      </w:pPr>
-      <w:r>
-        <w:rPr>
-          <w:rFonts w:ascii="Arial" w:cs="Arial" w:eastAsia="Arial" w:hAnsi="Arial"/>
-          <w:sz w:val="20"/>
-          <w:szCs w:val="20"/>
-        </w:rPr>
-        <w:t xml:space="preserve">LD50 (na skórę, szczur): 293 mg/kg m.c.</w:t>
-      </w:r>
-    </w:p>
-    <w:p>
-      <w:pPr>
-        <w:spacing w:after="80"/>
-      </w:pPr>
-      <w:r>
-        <w:rPr>
-          <w:rFonts w:ascii="Arial" w:cs="Arial" w:eastAsia="Arial" w:hAnsi="Arial"/>
-          <w:sz w:val="20"/>
-          <w:szCs w:val="20"/>
-        </w:rPr>
-        <w:t xml:space="preserve">LD50 (droga pokarmowa, szczur): 290 mg/kg m.c. (ATE oszacowane = 500 mg/kg m.c.)</w:t>
-      </w:r>
-    </w:p>
-    <w:p>
-      <w:pPr>
-        <w:spacing w:after="80"/>
-      </w:pPr>
-      <w:r>
-        <w:rPr>
-          <w:rFonts w:ascii="Arial" w:cs="Arial" w:eastAsia="Arial" w:hAnsi="Arial"/>
-          <w:sz w:val="20"/>
-          <w:szCs w:val="20"/>
-        </w:rPr>
-        <w:t xml:space="preserve">LC50 (przez drogi oddechowe - pyły/mgły, szczur): 293 mg/m³</w:t>
-      </w:r>
-    </w:p>
-    <w:p>
-      <w:pPr>
-        <w:spacing w:after="80" w:before="150"/>
-      </w:pPr>
-      <w:r>
-        <w:rPr>
-          <w:rFonts w:ascii="Arial" w:cs="Arial" w:eastAsia="Arial" w:hAnsi="Arial"/>
-          <w:b/>
-          <w:bCs/>
-          <w:sz w:val="20"/>
-          <w:szCs w:val="20"/>
-        </w:rPr>
-        <w:t xml:space="preserve">2,6-di-tert-butylo-4-metylofenol (BHT) (CAS: 128-37-0):</w:t>
-      </w:r>
-    </w:p>
-    <w:p>
-      <w:pPr>
-        <w:spacing w:after="80"/>
-      </w:pPr>
-      <w:r>
-        <w:rPr>
-          <w:rFonts w:ascii="Arial" w:cs="Arial" w:eastAsia="Arial" w:hAnsi="Arial"/>
-          <w:sz w:val="20"/>
-          <w:szCs w:val="20"/>
-        </w:rPr>
-        <w:t xml:space="preserve">LD50 (na skórę, szczur): &gt; 2000 mg/kg</w:t>
-      </w:r>
-    </w:p>
-    <w:p>
-      <w:pPr>
-        <w:spacing w:after="80"/>
-      </w:pPr>
-      <w:r>
-        <w:rPr>
-          <w:rFonts w:ascii="Arial" w:cs="Arial" w:eastAsia="Arial" w:hAnsi="Arial"/>
-          <w:sz w:val="20"/>
-          <w:szCs w:val="20"/>
-        </w:rPr>
-        <w:t xml:space="preserve">LD50 (droga pokarmowa, szczur): 2930 mg/kg</w:t>
-      </w:r>
-    </w:p>
-    <w:p>
-      <w:pPr>
-        <w:spacing w:after="80" w:before="150"/>
-      </w:pPr>
-      <w:r>
-        <w:rPr>
-          <w:rFonts w:ascii="Arial" w:cs="Arial" w:eastAsia="Arial" w:hAnsi="Arial"/>
-          <w:b/>
-          <w:bCs/>
-          <w:sz w:val="20"/>
-          <w:szCs w:val="20"/>
-        </w:rPr>
-        <w:t xml:space="preserve">Toluen (CAS: 108-88-3):</w:t>
-      </w:r>
-    </w:p>
-    <w:p>
-      <w:pPr>
-        <w:spacing w:after="80"/>
-      </w:pPr>
-      <w:r>
-        <w:rPr>
-          <w:rFonts w:ascii="Arial" w:cs="Arial" w:eastAsia="Arial" w:hAnsi="Arial"/>
-          <w:sz w:val="20"/>
-          <w:szCs w:val="20"/>
-        </w:rPr>
-        <w:t xml:space="preserve">LD50 (na skórę, królik): &gt; 5000 mg/kg m.c.</w:t>
-      </w:r>
-    </w:p>
-    <w:p>
-      <w:pPr>
-        <w:spacing w:after="80"/>
-      </w:pPr>
-      <w:r>
-        <w:rPr>
-          <w:rFonts w:ascii="Arial" w:cs="Arial" w:eastAsia="Arial" w:hAnsi="Arial"/>
-          <w:sz w:val="20"/>
-          <w:szCs w:val="20"/>
-        </w:rPr>
-        <w:t xml:space="preserve">LD50 (droga pokarmowa, szczur): &gt; 5000 mg/kg m.c.</w:t>
-      </w:r>
-    </w:p>
-    <w:p>
-      <w:pPr>
-        <w:spacing w:after="80"/>
-      </w:pPr>
-      <w:r>
-        <w:rPr>
-          <w:rFonts w:ascii="Arial" w:cs="Arial" w:eastAsia="Arial" w:hAnsi="Arial"/>
-          <w:sz w:val="20"/>
-          <w:szCs w:val="20"/>
-        </w:rPr>
-        <w:t xml:space="preserve">LC50 (przez drogi oddechowe - pary, człowiek): 100 ppm</w:t>
-      </w:r>
-    </w:p>
-    <w:p>
-      <w:pPr>
-        <w:spacing w:after="80"/>
-      </w:pPr>
-      <w:r>
-        <w:rPr>
-          <w:rFonts w:ascii="Arial" w:cs="Arial" w:eastAsia="Arial" w:hAnsi="Arial"/>
-          <w:sz w:val="20"/>
-          <w:szCs w:val="20"/>
-        </w:rPr>
-        <w:t xml:space="preserve">Działanie żrące/drażniące na skórę:</w:t>
-      </w:r>
-    </w:p>
-    <w:p>
-      <w:pPr>
-        <w:spacing w:after="80"/>
-      </w:pPr>
-      <w:r>
-        <w:rPr>
-          <w:rFonts w:ascii="Arial" w:cs="Arial" w:eastAsia="Arial" w:hAnsi="Arial"/>
-          <w:sz w:val="20"/>
-          <w:szCs w:val="20"/>
-        </w:rPr>
-        <w:t xml:space="preserve">W oparciu o dostępne dane, kryteria klasyfikacji nie są spełnione.</w:t>
-      </w:r>
-    </w:p>
-    <w:p>
-      <w:pPr>
-        <w:spacing w:after="80"/>
-      </w:pPr>
-      <w:r>
-        <w:rPr>
-          <w:rFonts w:ascii="Arial" w:cs="Arial" w:eastAsia="Arial" w:hAnsi="Arial"/>
-          <w:sz w:val="20"/>
-          <w:szCs w:val="20"/>
-        </w:rPr>
-        <w:t xml:space="preserve">Poważne uszkodzenie oczu/działanie drażniące na oczy:</w:t>
-      </w:r>
-    </w:p>
-    <w:p>
-      <w:pPr>
-        <w:spacing w:after="80"/>
-      </w:pPr>
-      <w:r>
-        <w:rPr>
-          <w:rFonts w:ascii="Arial" w:cs="Arial" w:eastAsia="Arial" w:hAnsi="Arial"/>
-          <w:sz w:val="20"/>
-          <w:szCs w:val="20"/>
-        </w:rPr>
-        <w:t xml:space="preserve">Działa drażniąco na oczy (mieszanina zaklasyfikowana do kategorii Eye Irrit. 2, H319 z uwagi na zawartość etanolu ≥ 50%).</w:t>
-      </w:r>
-    </w:p>
-    <w:p>
-      <w:pPr>
-        <w:spacing w:after="80"/>
-      </w:pPr>
-      <w:r>
-        <w:rPr>
-          <w:rFonts w:ascii="Arial" w:cs="Arial" w:eastAsia="Arial" w:hAnsi="Arial"/>
-          <w:sz w:val="20"/>
-          <w:szCs w:val="20"/>
-        </w:rPr>
-        <w:t xml:space="preserve">Działanie uczulające na drogi oddechowe lub skórę:</w:t>
-      </w:r>
-    </w:p>
-    <w:p>
-      <w:pPr>
-        <w:spacing w:after="80"/>
-      </w:pPr>
-      <w:r>
-        <w:rPr>
-          <w:rFonts w:ascii="Arial" w:cs="Arial" w:eastAsia="Arial" w:hAnsi="Arial"/>
-          <w:sz w:val="20"/>
-          <w:szCs w:val="20"/>
-        </w:rPr>
-        <w:t xml:space="preserve">Może powodować wystąpienie reakcji alergicznej skóry (zawiera kumarynę).</w:t>
-      </w:r>
-    </w:p>
-    <w:p>
-      <w:pPr>
-        <w:spacing w:after="80"/>
-      </w:pPr>
-      <w:r>
-        <w:rPr>
-          <w:rFonts w:ascii="Arial" w:cs="Arial" w:eastAsia="Arial" w:hAnsi="Arial"/>
-          <w:sz w:val="20"/>
-          <w:szCs w:val="20"/>
-        </w:rPr>
-        <w:t xml:space="preserve">Działanie mutagenne na komórki rozrodcze:</w:t>
-      </w:r>
-    </w:p>
-    <w:p>
-      <w:pPr>
-        <w:spacing w:after="80"/>
-      </w:pPr>
-      <w:r>
-        <w:rPr>
-          <w:rFonts w:ascii="Arial" w:cs="Arial" w:eastAsia="Arial" w:hAnsi="Arial"/>
-          <w:sz w:val="20"/>
-          <w:szCs w:val="20"/>
-        </w:rPr>
-        <w:t xml:space="preserve">W oparciu o dostępne dane, kryteria klasyfikacji nie są spełnione.</w:t>
-      </w:r>
-    </w:p>
-    <w:p>
-      <w:pPr>
-        <w:spacing w:after="80"/>
-      </w:pPr>
-      <w:r>
-        <w:rPr>
-          <w:rFonts w:ascii="Arial" w:cs="Arial" w:eastAsia="Arial" w:hAnsi="Arial"/>
-          <w:sz w:val="20"/>
-          <w:szCs w:val="20"/>
-        </w:rPr>
-        <w:t xml:space="preserve">Rakotwórczość:</w:t>
-      </w:r>
-    </w:p>
-    <w:p>
-      <w:pPr>
-        <w:spacing w:after="80"/>
-      </w:pPr>
-      <w:r>
-        <w:rPr>
-          <w:rFonts w:ascii="Arial" w:cs="Arial" w:eastAsia="Arial" w:hAnsi="Arial"/>
-          <w:sz w:val="20"/>
-          <w:szCs w:val="20"/>
-        </w:rPr>
-        <w:t xml:space="preserve">W oparciu o dostępne dane, kryteria klasyfikacji nie są spełnione.</w:t>
-      </w:r>
-    </w:p>
-    <w:p>
-      <w:pPr>
-        <w:spacing w:after="80"/>
-      </w:pPr>
-      <w:r>
-        <w:rPr>
-          <w:rFonts w:ascii="Arial" w:cs="Arial" w:eastAsia="Arial" w:hAnsi="Arial"/>
-          <w:sz w:val="20"/>
-          <w:szCs w:val="20"/>
-        </w:rPr>
-        <w:t xml:space="preserve">Toluen został sklasyfikowany w Grupie 3 (nie można zaklasyfikować jako rakotwórczy dla ludzi) przez Międzynarodową Agencję Badań nad Rakiem (IARC - 1999). Amerykańska Agencja Ochrony Środowiska (EPA) stwierdza, że dane są niewystarczające do oceny potencjału rakotwórczego.</w:t>
-      </w:r>
-    </w:p>
-    <w:p>
-      <w:pPr>
-        <w:spacing w:after="80"/>
-      </w:pPr>
-      <w:r>
-        <w:rPr>
-          <w:rFonts w:ascii="Arial" w:cs="Arial" w:eastAsia="Arial" w:hAnsi="Arial"/>
-          <w:sz w:val="20"/>
-          <w:szCs w:val="20"/>
-        </w:rPr>
-        <w:t xml:space="preserve">Szkodliwe działanie na rozrodczość:</w:t>
-      </w:r>
-    </w:p>
-    <w:p>
-      <w:pPr>
-        <w:spacing w:after="80"/>
-      </w:pPr>
-      <w:r>
-        <w:rPr>
-          <w:rFonts w:ascii="Arial" w:cs="Arial" w:eastAsia="Arial" w:hAnsi="Arial"/>
-          <w:sz w:val="20"/>
-          <w:szCs w:val="20"/>
-        </w:rPr>
-        <w:t xml:space="preserve">W oparciu o dostępne dane, kryteria klasyfikacji nie są spełnione.</w:t>
-      </w:r>
-    </w:p>
-    <w:p>
-      <w:pPr>
-        <w:spacing w:after="80"/>
-      </w:pPr>
-      <w:r>
-        <w:rPr>
-          <w:rFonts w:ascii="Arial" w:cs="Arial" w:eastAsia="Arial" w:hAnsi="Arial"/>
-          <w:sz w:val="20"/>
-          <w:szCs w:val="20"/>
-        </w:rPr>
-        <w:t xml:space="preserve">Działanie toksyczne na narządy docelowe – narażenie jednorazowe:</w:t>
-      </w:r>
-    </w:p>
-    <w:p>
-      <w:pPr>
-        <w:spacing w:after="80"/>
-      </w:pPr>
-      <w:r>
-        <w:rPr>
-          <w:rFonts w:ascii="Arial" w:cs="Arial" w:eastAsia="Arial" w:hAnsi="Arial"/>
-          <w:sz w:val="20"/>
-          <w:szCs w:val="20"/>
-        </w:rPr>
-        <w:t xml:space="preserve">W oparciu o dostępne dane, kryteria klasyfikacji nie są spełnione.</w:t>
-      </w:r>
-    </w:p>
-    <w:p>
-      <w:pPr>
-        <w:spacing w:after="80"/>
-      </w:pPr>
-      <w:r>
-        <w:rPr>
-          <w:rFonts w:ascii="Arial" w:cs="Arial" w:eastAsia="Arial" w:hAnsi="Arial"/>
-          <w:sz w:val="20"/>
-          <w:szCs w:val="20"/>
-        </w:rPr>
-        <w:t xml:space="preserve">Działanie toksyczne na narządy docelowe – narażenie powtarzane:</w:t>
-      </w:r>
-    </w:p>
-    <w:p>
-      <w:pPr>
-        <w:spacing w:after="80"/>
-      </w:pPr>
-      <w:r>
-        <w:rPr>
-          <w:rFonts w:ascii="Arial" w:cs="Arial" w:eastAsia="Arial" w:hAnsi="Arial"/>
-          <w:sz w:val="20"/>
-          <w:szCs w:val="20"/>
-        </w:rPr>
-        <w:t xml:space="preserve">W oparciu o dostępne dane, kryteria klasyfikacji nie są spełnione.</w:t>
-      </w:r>
-    </w:p>
-    <w:p>
-      <w:pPr>
-        <w:spacing w:after="80"/>
-      </w:pPr>
-      <w:r>
-        <w:rPr>
-          <w:rFonts w:ascii="Arial" w:cs="Arial" w:eastAsia="Arial" w:hAnsi="Arial"/>
-          <w:sz w:val="20"/>
-          <w:szCs w:val="20"/>
-        </w:rPr>
-        <w:t xml:space="preserve">Zagrożenie spowodowane aspiracją:</w:t>
-      </w:r>
-    </w:p>
-    <w:p>
-      <w:pPr>
-        <w:spacing w:after="80"/>
-      </w:pPr>
-      <w:r>
-        <w:rPr>
-          <w:rFonts w:ascii="Arial" w:cs="Arial" w:eastAsia="Arial" w:hAnsi="Arial"/>
-          <w:sz w:val="20"/>
-          <w:szCs w:val="20"/>
-        </w:rPr>
-        <w:t xml:space="preserve">W oparciu o dostępne dane, kryteria klasyfikacji nie są spełnione.</w:t>
+        <w:t xml:space="preserve">- Pracownicy: wdychanie par, kontakt ze skórą, kontakt z oczami.</w:t>
+      </w:r>
+    </w:p>
+    <w:p>
+      <w:pPr>
+        <w:spacing w:after="80"/>
+      </w:pPr>
+      <w:r>
+        <w:rPr>
+          <w:rFonts w:ascii="Arial" w:cs="Arial" w:eastAsia="Arial" w:hAnsi="Arial"/>
+          <w:sz w:val="20"/>
+          <w:szCs w:val="20"/>
+        </w:rPr>
+        <w:t xml:space="preserve">- Konsumenci: wdychanie par z powietrza otoczenia, kontakt ze skórą, przypadkowe spożycie.</w:t>
+      </w:r>
+    </w:p>
+    <w:p>
+      <w:pPr>
+        <w:spacing w:after="80"/>
+      </w:pPr>
+      <w:r>
+        <w:rPr>
+          <w:rFonts w:ascii="Arial" w:cs="Arial" w:eastAsia="Arial" w:hAnsi="Arial"/>
+          <w:sz w:val="20"/>
+          <w:szCs w:val="20"/>
+        </w:rPr>
+        <w:t xml:space="preserve">Skutki opóźnione, bezpośrednie oraz przewlekłe spowodowane krótko- i długotrwałym narażeniem:</w:t>
+      </w:r>
+    </w:p>
+    <w:p>
+      <w:pPr>
+        <w:spacing w:after="80"/>
+      </w:pPr>
+      <w:r>
+        <w:rPr>
+          <w:rFonts w:ascii="Arial" w:cs="Arial" w:eastAsia="Arial" w:hAnsi="Arial"/>
+          <w:sz w:val="20"/>
+          <w:szCs w:val="20"/>
+        </w:rPr>
+        <w:t xml:space="preserve">Kontakt z oczami powoduje podrażnienie, zaczerwienienie i łzawienie. U osób szczególnie wrażliwych kontakt ze skórą może wywołać reakcję alergiczną.</w:t>
+      </w:r>
+    </w:p>
+    <w:p>
+      <w:pPr>
+        <w:spacing w:after="80"/>
+      </w:pPr>
+      <w:r>
+        <w:rPr>
+          <w:rFonts w:ascii="Arial" w:cs="Arial" w:eastAsia="Arial" w:hAnsi="Arial"/>
+          <w:sz w:val="20"/>
+          <w:szCs w:val="20"/>
+        </w:rPr>
+        <w:t xml:space="preserve">Skutki wzajemnego oddziaływania:</w:t>
+      </w:r>
+    </w:p>
+    <w:p>
+      <w:pPr>
+        <w:spacing w:after="80"/>
+      </w:pPr>
+      <w:r>
+        <w:rPr>
+          <w:rFonts w:ascii="Arial" w:cs="Arial" w:eastAsia="Arial" w:hAnsi="Arial"/>
+          <w:sz w:val="20"/>
+          <w:szCs w:val="20"/>
+        </w:rPr>
+        <w:t xml:space="preserve">Brak danych dotyczących wzajemnego oddziaływania dla mieszaniny.</w:t>
       </w:r>
     </w:p>
     <w:p>
@@ -4833,7 +4753,7 @@
           <w:sz w:val="20"/>
           <w:szCs w:val="20"/>
         </w:rPr>
-        <w:t xml:space="preserve">W oparciu o dostępne dane, produkt nie zawiera substancji o właściwościach zaburzających funkcjonowanie układu hormonalnego w odniesieniu do zdrowia ludzkiego w stężeniu równym lub większym niż 0,1% wag.</w:t>
+        <w:t xml:space="preserve">Produkt nie zawiera substancji o właściwościach zaburzających funkcjonowanie układu hormonalnego w odniesieniu do zdrowia ludzkiego zgodnie z kryteriami określonymi w rozporządzeniu (UE) 2017/2100 lub rozporządzeniu (UE) 2018/605 w stężeniu równym lub większym niż 0,1 % wag.</w:t>
       </w:r>
     </w:p>
     <w:p>
@@ -4861,7 +4781,7 @@
           <w:sz w:val="20"/>
           <w:szCs w:val="20"/>
         </w:rPr>
-        <w:t xml:space="preserve">Brak innych danych.</w:t>
+        <w:t xml:space="preserve">Brak dodatkowych danych.</w:t>
       </w:r>
     </w:p>
     <w:p>

</xml_diff>

<commit_message>
feat(sds): update supplier company data to ITALLUX Sp. z o.o. (ADR-071)
</commit_message>
<xml_diff>
--- a/docs/SDS/Karta_Charakterystyki_8034055535448_SDS_ORCHIDEA_E_VANIGLIA_V2_PL.docx
+++ b/docs/SDS/Karta_Charakterystyki_8034055535448_SDS_ORCHIDEA_E_VANIGLIA_V2_PL.docx
@@ -214,7 +214,7 @@
           <w:sz w:val="20"/>
           <w:szCs w:val="20"/>
         </w:rPr>
-        <w:t xml:space="preserve"> MITRANS Weronika Grzesiak</w:t>
+        <w:t xml:space="preserve"> ITALLUX Sp. z o.o.</w:t>
       </w:r>
     </w:p>
     <w:p>
@@ -237,7 +237,30 @@
           <w:sz w:val="20"/>
           <w:szCs w:val="20"/>
         </w:rPr>
-        <w:t xml:space="preserve"> ul. Wesoła 16, 63-600 Kępno, woj. wielkopolskie</w:t>
+        <w:t xml:space="preserve"> ul. Wesoła 16, 63-600 Kępno</w:t>
+      </w:r>
+    </w:p>
+    <w:p>
+      <w:pPr>
+        <w:spacing w:after="80" w:before="80"/>
+      </w:pPr>
+      <w:r>
+        <w:rPr>
+          <w:rFonts w:ascii="Arial" w:cs="Arial" w:eastAsia="Arial" w:hAnsi="Arial"/>
+          <w:b/>
+          <w:bCs/>
+          <w:sz w:val="20"/>
+          <w:szCs w:val="20"/>
+        </w:rPr>
+        <w:t xml:space="preserve">Strona www:</w:t>
+      </w:r>
+      <w:r>
+        <w:rPr>
+          <w:rFonts w:ascii="Arial" w:cs="Arial" w:eastAsia="Arial" w:hAnsi="Arial"/>
+          <w:sz w:val="20"/>
+          <w:szCs w:val="20"/>
+        </w:rPr>
+        <w:t xml:space="preserve"> www.prostozwloch.pl</w:t>
       </w:r>
     </w:p>
     <w:p>
@@ -260,7 +283,7 @@
           <w:sz w:val="20"/>
           <w:szCs w:val="20"/>
         </w:rPr>
-        <w:t xml:space="preserve"> kontakt@prostozwloch.com.pl</w:t>
+        <w:t xml:space="preserve"> kontakt@prostozwloch.pl</w:t>
       </w:r>
     </w:p>
     <w:p>
@@ -2249,98 +2272,98 @@
           <w:sz w:val="20"/>
           <w:szCs w:val="20"/>
         </w:rPr>
-        <w:t xml:space="preserve">- woda słodka: 0,96 mg/l</w:t>
-      </w:r>
-    </w:p>
-    <w:p>
-      <w:pPr>
-        <w:spacing w:after="80"/>
-      </w:pPr>
-      <w:r>
-        <w:rPr>
-          <w:rFonts w:ascii="Arial" w:cs="Arial" w:eastAsia="Arial" w:hAnsi="Arial"/>
-          <w:sz w:val="20"/>
-          <w:szCs w:val="20"/>
-        </w:rPr>
-        <w:t xml:space="preserve">- woda morska: 0,79 mg/l</w:t>
-      </w:r>
-    </w:p>
-    <w:p>
-      <w:pPr>
-        <w:spacing w:after="80"/>
-      </w:pPr>
-      <w:r>
-        <w:rPr>
-          <w:rFonts w:ascii="Arial" w:cs="Arial" w:eastAsia="Arial" w:hAnsi="Arial"/>
-          <w:sz w:val="20"/>
-          <w:szCs w:val="20"/>
-        </w:rPr>
-        <w:t xml:space="preserve">- osady słodkowodne: 3,6 mg/kg</w:t>
-      </w:r>
-    </w:p>
-    <w:p>
-      <w:pPr>
-        <w:spacing w:after="80"/>
-      </w:pPr>
-      <w:r>
-        <w:rPr>
-          <w:rFonts w:ascii="Arial" w:cs="Arial" w:eastAsia="Arial" w:hAnsi="Arial"/>
-          <w:sz w:val="20"/>
-          <w:szCs w:val="20"/>
-        </w:rPr>
-        <w:t xml:space="preserve">- osady morskie: 2,9 mg/kg</w:t>
-      </w:r>
-    </w:p>
-    <w:p>
-      <w:pPr>
-        <w:spacing w:after="80"/>
-      </w:pPr>
-      <w:r>
-        <w:rPr>
-          <w:rFonts w:ascii="Arial" w:cs="Arial" w:eastAsia="Arial" w:hAnsi="Arial"/>
-          <w:sz w:val="20"/>
-          <w:szCs w:val="20"/>
-        </w:rPr>
-        <w:t xml:space="preserve">- woda (uwalnianie okresowe): 2,75 mg/l</w:t>
-      </w:r>
-    </w:p>
-    <w:p>
-      <w:pPr>
-        <w:spacing w:after="80"/>
-      </w:pPr>
-      <w:r>
-        <w:rPr>
-          <w:rFonts w:ascii="Arial" w:cs="Arial" w:eastAsia="Arial" w:hAnsi="Arial"/>
-          <w:sz w:val="20"/>
-          <w:szCs w:val="20"/>
-        </w:rPr>
-        <w:t xml:space="preserve">- mikroorganizmy w oczyszczalni ścieków (STP): 580 mg/l</w:t>
-      </w:r>
-    </w:p>
-    <w:p>
-      <w:pPr>
-        <w:spacing w:after="80"/>
-      </w:pPr>
-      <w:r>
-        <w:rPr>
-          <w:rFonts w:ascii="Arial" w:cs="Arial" w:eastAsia="Arial" w:hAnsi="Arial"/>
-          <w:sz w:val="20"/>
-          <w:szCs w:val="20"/>
-        </w:rPr>
-        <w:t xml:space="preserve">- łańcuch pokarmowy (zatrucie wtórne): 0,38 mg/kg</w:t>
-      </w:r>
-    </w:p>
-    <w:p>
-      <w:pPr>
-        <w:spacing w:after="80"/>
-      </w:pPr>
-      <w:r>
-        <w:rPr>
-          <w:rFonts w:ascii="Arial" w:cs="Arial" w:eastAsia="Arial" w:hAnsi="Arial"/>
-          <w:sz w:val="20"/>
-          <w:szCs w:val="20"/>
-        </w:rPr>
-        <w:t xml:space="preserve">- środowisko glebowe (gleba): 0,63 mg/kg</w:t>
+        <w:t xml:space="preserve">- woda słodka:0,96mg/l</w:t>
+      </w:r>
+    </w:p>
+    <w:p>
+      <w:pPr>
+        <w:spacing w:after="80"/>
+      </w:pPr>
+      <w:r>
+        <w:rPr>
+          <w:rFonts w:ascii="Arial" w:cs="Arial" w:eastAsia="Arial" w:hAnsi="Arial"/>
+          <w:sz w:val="20"/>
+          <w:szCs w:val="20"/>
+        </w:rPr>
+        <w:t xml:space="preserve">- woda morska:0,79mg/l</w:t>
+      </w:r>
+    </w:p>
+    <w:p>
+      <w:pPr>
+        <w:spacing w:after="80"/>
+      </w:pPr>
+      <w:r>
+        <w:rPr>
+          <w:rFonts w:ascii="Arial" w:cs="Arial" w:eastAsia="Arial" w:hAnsi="Arial"/>
+          <w:sz w:val="20"/>
+          <w:szCs w:val="20"/>
+        </w:rPr>
+        <w:t xml:space="preserve">- osady słodkowodne:3,6mg/kg</w:t>
+      </w:r>
+    </w:p>
+    <w:p>
+      <w:pPr>
+        <w:spacing w:after="80"/>
+      </w:pPr>
+      <w:r>
+        <w:rPr>
+          <w:rFonts w:ascii="Arial" w:cs="Arial" w:eastAsia="Arial" w:hAnsi="Arial"/>
+          <w:sz w:val="20"/>
+          <w:szCs w:val="20"/>
+        </w:rPr>
+        <w:t xml:space="preserve">- osady morskie:2,9mg/kg</w:t>
+      </w:r>
+    </w:p>
+    <w:p>
+      <w:pPr>
+        <w:spacing w:after="80"/>
+      </w:pPr>
+      <w:r>
+        <w:rPr>
+          <w:rFonts w:ascii="Arial" w:cs="Arial" w:eastAsia="Arial" w:hAnsi="Arial"/>
+          <w:sz w:val="20"/>
+          <w:szCs w:val="20"/>
+        </w:rPr>
+        <w:t xml:space="preserve">- woda (uwalnianie okresowe):2,75mg/l</w:t>
+      </w:r>
+    </w:p>
+    <w:p>
+      <w:pPr>
+        <w:spacing w:after="80"/>
+      </w:pPr>
+      <w:r>
+        <w:rPr>
+          <w:rFonts w:ascii="Arial" w:cs="Arial" w:eastAsia="Arial" w:hAnsi="Arial"/>
+          <w:sz w:val="20"/>
+          <w:szCs w:val="20"/>
+        </w:rPr>
+        <w:t xml:space="preserve">- mikroorganizmy w oczyszczalni ścieków (STP):580mg/l</w:t>
+      </w:r>
+    </w:p>
+    <w:p>
+      <w:pPr>
+        <w:spacing w:after="80"/>
+      </w:pPr>
+      <w:r>
+        <w:rPr>
+          <w:rFonts w:ascii="Arial" w:cs="Arial" w:eastAsia="Arial" w:hAnsi="Arial"/>
+          <w:sz w:val="20"/>
+          <w:szCs w:val="20"/>
+        </w:rPr>
+        <w:t xml:space="preserve">- łańcuch pokarmowy (zatrucie wtórne):0,38mg/kg</w:t>
+      </w:r>
+    </w:p>
+    <w:p>
+      <w:pPr>
+        <w:spacing w:after="80"/>
+      </w:pPr>
+      <w:r>
+        <w:rPr>
+          <w:rFonts w:ascii="Arial" w:cs="Arial" w:eastAsia="Arial" w:hAnsi="Arial"/>
+          <w:sz w:val="20"/>
+          <w:szCs w:val="20"/>
+        </w:rPr>
+        <w:t xml:space="preserve">- środowisko glebowe (gleba):0,63mg/kg</w:t>
       </w:r>
     </w:p>
     <w:p>
@@ -2483,85 +2506,85 @@
           <w:sz w:val="20"/>
           <w:szCs w:val="20"/>
         </w:rPr>
-        <w:t xml:space="preserve">- woda słodka: 0,081 mg/l</w:t>
-      </w:r>
-    </w:p>
-    <w:p>
-      <w:pPr>
-        <w:spacing w:after="80"/>
-      </w:pPr>
-      <w:r>
-        <w:rPr>
-          <w:rFonts w:ascii="Arial" w:cs="Arial" w:eastAsia="Arial" w:hAnsi="Arial"/>
-          <w:sz w:val="20"/>
-          <w:szCs w:val="20"/>
-        </w:rPr>
-        <w:t xml:space="preserve">- woda morska: 0,008111 mg/l</w:t>
-      </w:r>
-    </w:p>
-    <w:p>
-      <w:pPr>
-        <w:spacing w:after="80"/>
-      </w:pPr>
-      <w:r>
-        <w:rPr>
-          <w:rFonts w:ascii="Arial" w:cs="Arial" w:eastAsia="Arial" w:hAnsi="Arial"/>
-          <w:sz w:val="20"/>
-          <w:szCs w:val="20"/>
-        </w:rPr>
-        <w:t xml:space="preserve">- osady słodkowodne: 0,409 mg/kg</w:t>
-      </w:r>
-    </w:p>
-    <w:p>
-      <w:pPr>
-        <w:spacing w:after="80"/>
-      </w:pPr>
-      <w:r>
-        <w:rPr>
-          <w:rFonts w:ascii="Arial" w:cs="Arial" w:eastAsia="Arial" w:hAnsi="Arial"/>
-          <w:sz w:val="20"/>
-          <w:szCs w:val="20"/>
-        </w:rPr>
-        <w:t xml:space="preserve">- osady morskie: 0,0409 mg/kg</w:t>
-      </w:r>
-    </w:p>
-    <w:p>
-      <w:pPr>
-        <w:spacing w:after="80"/>
-      </w:pPr>
-      <w:r>
-        <w:rPr>
-          <w:rFonts w:ascii="Arial" w:cs="Arial" w:eastAsia="Arial" w:hAnsi="Arial"/>
-          <w:sz w:val="20"/>
-          <w:szCs w:val="20"/>
-        </w:rPr>
-        <w:t xml:space="preserve">- woda (uwalnianie okresowe): 0,8111 mg/l</w:t>
-      </w:r>
-    </w:p>
-    <w:p>
-      <w:pPr>
-        <w:spacing w:after="80"/>
-      </w:pPr>
-      <w:r>
-        <w:rPr>
-          <w:rFonts w:ascii="Arial" w:cs="Arial" w:eastAsia="Arial" w:hAnsi="Arial"/>
-          <w:sz w:val="20"/>
-          <w:szCs w:val="20"/>
-        </w:rPr>
-        <w:t xml:space="preserve">- mikroorganizmy w oczyszczalni ścieków (STP): 4,5 mg/l</w:t>
-      </w:r>
-    </w:p>
-    <w:p>
-      <w:pPr>
-        <w:spacing w:after="80"/>
-      </w:pPr>
-      <w:r>
-        <w:rPr>
-          <w:rFonts w:ascii="Arial" w:cs="Arial" w:eastAsia="Arial" w:hAnsi="Arial"/>
-          <w:sz w:val="20"/>
-          <w:szCs w:val="20"/>
-        </w:rPr>
-        <w:t xml:space="preserve">- środowisko glebowe (gleba): 0,0967 mg/kg</w:t>
+        <w:t xml:space="preserve">- woda słodka:0,081mg/l</w:t>
+      </w:r>
+    </w:p>
+    <w:p>
+      <w:pPr>
+        <w:spacing w:after="80"/>
+      </w:pPr>
+      <w:r>
+        <w:rPr>
+          <w:rFonts w:ascii="Arial" w:cs="Arial" w:eastAsia="Arial" w:hAnsi="Arial"/>
+          <w:sz w:val="20"/>
+          <w:szCs w:val="20"/>
+        </w:rPr>
+        <w:t xml:space="preserve">- woda morska:0,008111mg/l</w:t>
+      </w:r>
+    </w:p>
+    <w:p>
+      <w:pPr>
+        <w:spacing w:after="80"/>
+      </w:pPr>
+      <w:r>
+        <w:rPr>
+          <w:rFonts w:ascii="Arial" w:cs="Arial" w:eastAsia="Arial" w:hAnsi="Arial"/>
+          <w:sz w:val="20"/>
+          <w:szCs w:val="20"/>
+        </w:rPr>
+        <w:t xml:space="preserve">- osady słodkowodne:0,409mg/kg</w:t>
+      </w:r>
+    </w:p>
+    <w:p>
+      <w:pPr>
+        <w:spacing w:after="80"/>
+      </w:pPr>
+      <w:r>
+        <w:rPr>
+          <w:rFonts w:ascii="Arial" w:cs="Arial" w:eastAsia="Arial" w:hAnsi="Arial"/>
+          <w:sz w:val="20"/>
+          <w:szCs w:val="20"/>
+        </w:rPr>
+        <w:t xml:space="preserve">- osady morskie:0,0409mg/kg</w:t>
+      </w:r>
+    </w:p>
+    <w:p>
+      <w:pPr>
+        <w:spacing w:after="80"/>
+      </w:pPr>
+      <w:r>
+        <w:rPr>
+          <w:rFonts w:ascii="Arial" w:cs="Arial" w:eastAsia="Arial" w:hAnsi="Arial"/>
+          <w:sz w:val="20"/>
+          <w:szCs w:val="20"/>
+        </w:rPr>
+        <w:t xml:space="preserve">- woda (uwalnianie okresowe):0,8111mg/l</w:t>
+      </w:r>
+    </w:p>
+    <w:p>
+      <w:pPr>
+        <w:spacing w:after="80"/>
+      </w:pPr>
+      <w:r>
+        <w:rPr>
+          <w:rFonts w:ascii="Arial" w:cs="Arial" w:eastAsia="Arial" w:hAnsi="Arial"/>
+          <w:sz w:val="20"/>
+          <w:szCs w:val="20"/>
+        </w:rPr>
+        <w:t xml:space="preserve">- mikroorganizmy w oczyszczalni ścieków (STP):4,5mg/l</w:t>
+      </w:r>
+    </w:p>
+    <w:p>
+      <w:pPr>
+        <w:spacing w:after="80"/>
+      </w:pPr>
+      <w:r>
+        <w:rPr>
+          <w:rFonts w:ascii="Arial" w:cs="Arial" w:eastAsia="Arial" w:hAnsi="Arial"/>
+          <w:sz w:val="20"/>
+          <w:szCs w:val="20"/>
+        </w:rPr>
+        <w:t xml:space="preserve">- środowisko glebowe (gleba):0,0967mg/kg</w:t>
       </w:r>
     </w:p>
     <w:p>
@@ -2704,98 +2727,98 @@
           <w:sz w:val="20"/>
           <w:szCs w:val="20"/>
         </w:rPr>
-        <w:t xml:space="preserve">- woda słodka: 0,019 mg/l</w:t>
-      </w:r>
-    </w:p>
-    <w:p>
-      <w:pPr>
-        <w:spacing w:after="80"/>
-      </w:pPr>
-      <w:r>
-        <w:rPr>
-          <w:rFonts w:ascii="Arial" w:cs="Arial" w:eastAsia="Arial" w:hAnsi="Arial"/>
-          <w:sz w:val="20"/>
-          <w:szCs w:val="20"/>
-        </w:rPr>
-        <w:t xml:space="preserve">- woda morska: 0,0019 mg/l</w:t>
-      </w:r>
-    </w:p>
-    <w:p>
-      <w:pPr>
-        <w:spacing w:after="80"/>
-      </w:pPr>
-      <w:r>
-        <w:rPr>
-          <w:rFonts w:ascii="Arial" w:cs="Arial" w:eastAsia="Arial" w:hAnsi="Arial"/>
-          <w:sz w:val="20"/>
-          <w:szCs w:val="20"/>
-        </w:rPr>
-        <w:t xml:space="preserve">- osady słodkowodne: 0,15 mg/kg</w:t>
-      </w:r>
-    </w:p>
-    <w:p>
-      <w:pPr>
-        <w:spacing w:after="80"/>
-      </w:pPr>
-      <w:r>
-        <w:rPr>
-          <w:rFonts w:ascii="Arial" w:cs="Arial" w:eastAsia="Arial" w:hAnsi="Arial"/>
-          <w:sz w:val="20"/>
-          <w:szCs w:val="20"/>
-        </w:rPr>
-        <w:t xml:space="preserve">- osady morskie: 0,015 mg/kg</w:t>
-      </w:r>
-    </w:p>
-    <w:p>
-      <w:pPr>
-        <w:spacing w:after="80"/>
-      </w:pPr>
-      <w:r>
-        <w:rPr>
-          <w:rFonts w:ascii="Arial" w:cs="Arial" w:eastAsia="Arial" w:hAnsi="Arial"/>
-          <w:sz w:val="20"/>
-          <w:szCs w:val="20"/>
-        </w:rPr>
-        <w:t xml:space="preserve">- woda (uwalnianie okresowe): 0,0142 mg/l</w:t>
-      </w:r>
-    </w:p>
-    <w:p>
-      <w:pPr>
-        <w:spacing w:after="80"/>
-      </w:pPr>
-      <w:r>
-        <w:rPr>
-          <w:rFonts w:ascii="Arial" w:cs="Arial" w:eastAsia="Arial" w:hAnsi="Arial"/>
-          <w:sz w:val="20"/>
-          <w:szCs w:val="20"/>
-        </w:rPr>
-        <w:t xml:space="preserve">- mikroorganizmy w oczyszczalni ścieków (STP): 6,4 mg/l</w:t>
-      </w:r>
-    </w:p>
-    <w:p>
-      <w:pPr>
-        <w:spacing w:after="80"/>
-      </w:pPr>
-      <w:r>
-        <w:rPr>
-          <w:rFonts w:ascii="Arial" w:cs="Arial" w:eastAsia="Arial" w:hAnsi="Arial"/>
-          <w:sz w:val="20"/>
-          <w:szCs w:val="20"/>
-        </w:rPr>
-        <w:t xml:space="preserve">- łańcuch pokarmowy (zatrucie wtórne): 30,7 mg/kg</w:t>
-      </w:r>
-    </w:p>
-    <w:p>
-      <w:pPr>
-        <w:spacing w:after="80"/>
-      </w:pPr>
-      <w:r>
-        <w:rPr>
-          <w:rFonts w:ascii="Arial" w:cs="Arial" w:eastAsia="Arial" w:hAnsi="Arial"/>
-          <w:sz w:val="20"/>
-          <w:szCs w:val="20"/>
-        </w:rPr>
-        <w:t xml:space="preserve">- środowisko glebowe (gleba): 0,018 mg/kg</w:t>
+        <w:t xml:space="preserve">- woda słodka:0,019mg/l</w:t>
+      </w:r>
+    </w:p>
+    <w:p>
+      <w:pPr>
+        <w:spacing w:after="80"/>
+      </w:pPr>
+      <w:r>
+        <w:rPr>
+          <w:rFonts w:ascii="Arial" w:cs="Arial" w:eastAsia="Arial" w:hAnsi="Arial"/>
+          <w:sz w:val="20"/>
+          <w:szCs w:val="20"/>
+        </w:rPr>
+        <w:t xml:space="preserve">- woda morska:0,0019mg/l</w:t>
+      </w:r>
+    </w:p>
+    <w:p>
+      <w:pPr>
+        <w:spacing w:after="80"/>
+      </w:pPr>
+      <w:r>
+        <w:rPr>
+          <w:rFonts w:ascii="Arial" w:cs="Arial" w:eastAsia="Arial" w:hAnsi="Arial"/>
+          <w:sz w:val="20"/>
+          <w:szCs w:val="20"/>
+        </w:rPr>
+        <w:t xml:space="preserve">- osady słodkowodne:0,15mg/kg</w:t>
+      </w:r>
+    </w:p>
+    <w:p>
+      <w:pPr>
+        <w:spacing w:after="80"/>
+      </w:pPr>
+      <w:r>
+        <w:rPr>
+          <w:rFonts w:ascii="Arial" w:cs="Arial" w:eastAsia="Arial" w:hAnsi="Arial"/>
+          <w:sz w:val="20"/>
+          <w:szCs w:val="20"/>
+        </w:rPr>
+        <w:t xml:space="preserve">- osady morskie:0,015mg/kg</w:t>
+      </w:r>
+    </w:p>
+    <w:p>
+      <w:pPr>
+        <w:spacing w:after="80"/>
+      </w:pPr>
+      <w:r>
+        <w:rPr>
+          <w:rFonts w:ascii="Arial" w:cs="Arial" w:eastAsia="Arial" w:hAnsi="Arial"/>
+          <w:sz w:val="20"/>
+          <w:szCs w:val="20"/>
+        </w:rPr>
+        <w:t xml:space="preserve">- woda (uwalnianie okresowe):0,0142mg/l</w:t>
+      </w:r>
+    </w:p>
+    <w:p>
+      <w:pPr>
+        <w:spacing w:after="80"/>
+      </w:pPr>
+      <w:r>
+        <w:rPr>
+          <w:rFonts w:ascii="Arial" w:cs="Arial" w:eastAsia="Arial" w:hAnsi="Arial"/>
+          <w:sz w:val="20"/>
+          <w:szCs w:val="20"/>
+        </w:rPr>
+        <w:t xml:space="preserve">- mikroorganizmy w oczyszczalni ścieków (STP):6,4mg/l</w:t>
+      </w:r>
+    </w:p>
+    <w:p>
+      <w:pPr>
+        <w:spacing w:after="80"/>
+      </w:pPr>
+      <w:r>
+        <w:rPr>
+          <w:rFonts w:ascii="Arial" w:cs="Arial" w:eastAsia="Arial" w:hAnsi="Arial"/>
+          <w:sz w:val="20"/>
+          <w:szCs w:val="20"/>
+        </w:rPr>
+        <w:t xml:space="preserve">- łańcuch pokarmowy (zatrucie wtórne):30,7mg/kg</w:t>
+      </w:r>
+    </w:p>
+    <w:p>
+      <w:pPr>
+        <w:spacing w:after="80"/>
+      </w:pPr>
+      <w:r>
+        <w:rPr>
+          <w:rFonts w:ascii="Arial" w:cs="Arial" w:eastAsia="Arial" w:hAnsi="Arial"/>
+          <w:sz w:val="20"/>
+          <w:szCs w:val="20"/>
+        </w:rPr>
+        <w:t xml:space="preserve">- środowisko glebowe (gleba):0,018mg/kg</w:t>
       </w:r>
     </w:p>
     <w:p>
@@ -2938,98 +2961,98 @@
           <w:sz w:val="20"/>
           <w:szCs w:val="20"/>
         </w:rPr>
-        <w:t xml:space="preserve">- woda słodka: 0,000199 mg/l</w:t>
-      </w:r>
-    </w:p>
-    <w:p>
-      <w:pPr>
-        <w:spacing w:after="80"/>
-      </w:pPr>
-      <w:r>
-        <w:rPr>
-          <w:rFonts w:ascii="Arial" w:cs="Arial" w:eastAsia="Arial" w:hAnsi="Arial"/>
-          <w:sz w:val="20"/>
-          <w:szCs w:val="20"/>
-        </w:rPr>
-        <w:t xml:space="preserve">- woda morska: 0,02 μg/l</w:t>
-      </w:r>
-    </w:p>
-    <w:p>
-      <w:pPr>
-        <w:spacing w:after="80"/>
-      </w:pPr>
-      <w:r>
-        <w:rPr>
-          <w:rFonts w:ascii="Arial" w:cs="Arial" w:eastAsia="Arial" w:hAnsi="Arial"/>
-          <w:sz w:val="20"/>
-          <w:szCs w:val="20"/>
-        </w:rPr>
-        <w:t xml:space="preserve">- osady słodkowodne: 0,0996 mg/kg</w:t>
-      </w:r>
-    </w:p>
-    <w:p>
-      <w:pPr>
-        <w:spacing w:after="80"/>
-      </w:pPr>
-      <w:r>
-        <w:rPr>
-          <w:rFonts w:ascii="Arial" w:cs="Arial" w:eastAsia="Arial" w:hAnsi="Arial"/>
-          <w:sz w:val="20"/>
-          <w:szCs w:val="20"/>
-        </w:rPr>
-        <w:t xml:space="preserve">- osady morskie: 0,00996 mg/kg</w:t>
-      </w:r>
-    </w:p>
-    <w:p>
-      <w:pPr>
-        <w:spacing w:after="80"/>
-      </w:pPr>
-      <w:r>
-        <w:rPr>
-          <w:rFonts w:ascii="Arial" w:cs="Arial" w:eastAsia="Arial" w:hAnsi="Arial"/>
-          <w:sz w:val="20"/>
-          <w:szCs w:val="20"/>
-        </w:rPr>
-        <w:t xml:space="preserve">- woda (uwalnianie okresowe): 0,00199 mg/l</w:t>
-      </w:r>
-    </w:p>
-    <w:p>
-      <w:pPr>
-        <w:spacing w:after="80"/>
-      </w:pPr>
-      <w:r>
-        <w:rPr>
-          <w:rFonts w:ascii="Arial" w:cs="Arial" w:eastAsia="Arial" w:hAnsi="Arial"/>
-          <w:sz w:val="20"/>
-          <w:szCs w:val="20"/>
-        </w:rPr>
-        <w:t xml:space="preserve">- mikroorganizmy w oczyszczalni ścieków (STP): 0,17 mg/l</w:t>
-      </w:r>
-    </w:p>
-    <w:p>
-      <w:pPr>
-        <w:spacing w:after="80"/>
-      </w:pPr>
-      <w:r>
-        <w:rPr>
-          <w:rFonts w:ascii="Arial" w:cs="Arial" w:eastAsia="Arial" w:hAnsi="Arial"/>
-          <w:sz w:val="20"/>
-          <w:szCs w:val="20"/>
-        </w:rPr>
-        <w:t xml:space="preserve">- łańcuch pokarmowy (zatrucie wtórne): 8,33 mg/kg</w:t>
-      </w:r>
-    </w:p>
-    <w:p>
-      <w:pPr>
-        <w:spacing w:after="80"/>
-      </w:pPr>
-      <w:r>
-        <w:rPr>
-          <w:rFonts w:ascii="Arial" w:cs="Arial" w:eastAsia="Arial" w:hAnsi="Arial"/>
-          <w:sz w:val="20"/>
-          <w:szCs w:val="20"/>
-        </w:rPr>
-        <w:t xml:space="preserve">- środowisko glebowe (gleba): 0,04769 mg/kg</w:t>
+        <w:t xml:space="preserve">- woda słodka:0,000199mg/l</w:t>
+      </w:r>
+    </w:p>
+    <w:p>
+      <w:pPr>
+        <w:spacing w:after="80"/>
+      </w:pPr>
+      <w:r>
+        <w:rPr>
+          <w:rFonts w:ascii="Arial" w:cs="Arial" w:eastAsia="Arial" w:hAnsi="Arial"/>
+          <w:sz w:val="20"/>
+          <w:szCs w:val="20"/>
+        </w:rPr>
+        <w:t xml:space="preserve">- woda morska:0,02 μg/l</w:t>
+      </w:r>
+    </w:p>
+    <w:p>
+      <w:pPr>
+        <w:spacing w:after="80"/>
+      </w:pPr>
+      <w:r>
+        <w:rPr>
+          <w:rFonts w:ascii="Arial" w:cs="Arial" w:eastAsia="Arial" w:hAnsi="Arial"/>
+          <w:sz w:val="20"/>
+          <w:szCs w:val="20"/>
+        </w:rPr>
+        <w:t xml:space="preserve">- osady słodkowodne:0,0996mg/kg</w:t>
+      </w:r>
+    </w:p>
+    <w:p>
+      <w:pPr>
+        <w:spacing w:after="80"/>
+      </w:pPr>
+      <w:r>
+        <w:rPr>
+          <w:rFonts w:ascii="Arial" w:cs="Arial" w:eastAsia="Arial" w:hAnsi="Arial"/>
+          <w:sz w:val="20"/>
+          <w:szCs w:val="20"/>
+        </w:rPr>
+        <w:t xml:space="preserve">- osady morskie:0,00996mg/kg</w:t>
+      </w:r>
+    </w:p>
+    <w:p>
+      <w:pPr>
+        <w:spacing w:after="80"/>
+      </w:pPr>
+      <w:r>
+        <w:rPr>
+          <w:rFonts w:ascii="Arial" w:cs="Arial" w:eastAsia="Arial" w:hAnsi="Arial"/>
+          <w:sz w:val="20"/>
+          <w:szCs w:val="20"/>
+        </w:rPr>
+        <w:t xml:space="preserve">- woda (uwalnianie okresowe):0,00199mg/l</w:t>
+      </w:r>
+    </w:p>
+    <w:p>
+      <w:pPr>
+        <w:spacing w:after="80"/>
+      </w:pPr>
+      <w:r>
+        <w:rPr>
+          <w:rFonts w:ascii="Arial" w:cs="Arial" w:eastAsia="Arial" w:hAnsi="Arial"/>
+          <w:sz w:val="20"/>
+          <w:szCs w:val="20"/>
+        </w:rPr>
+        <w:t xml:space="preserve">- mikroorganizmy w oczyszczalni ścieków (STP):0,17mg/l</w:t>
+      </w:r>
+    </w:p>
+    <w:p>
+      <w:pPr>
+        <w:spacing w:after="80"/>
+      </w:pPr>
+      <w:r>
+        <w:rPr>
+          <w:rFonts w:ascii="Arial" w:cs="Arial" w:eastAsia="Arial" w:hAnsi="Arial"/>
+          <w:sz w:val="20"/>
+          <w:szCs w:val="20"/>
+        </w:rPr>
+        <w:t xml:space="preserve">- łańcuch pokarmowy (zatrucie wtórne):8,33mg/kg</w:t>
+      </w:r>
+    </w:p>
+    <w:p>
+      <w:pPr>
+        <w:spacing w:after="80"/>
+      </w:pPr>
+      <w:r>
+        <w:rPr>
+          <w:rFonts w:ascii="Arial" w:cs="Arial" w:eastAsia="Arial" w:hAnsi="Arial"/>
+          <w:sz w:val="20"/>
+          <w:szCs w:val="20"/>
+        </w:rPr>
+        <w:t xml:space="preserve">- środowisko glebowe (gleba):0,04769mg/kg</w:t>
       </w:r>
     </w:p>
     <w:p>
@@ -3172,85 +3195,85 @@
           <w:sz w:val="20"/>
           <w:szCs w:val="20"/>
         </w:rPr>
-        <w:t xml:space="preserve">- woda słodka: 0,68 mg/l</w:t>
-      </w:r>
-    </w:p>
-    <w:p>
-      <w:pPr>
-        <w:spacing w:after="80"/>
-      </w:pPr>
-      <w:r>
-        <w:rPr>
-          <w:rFonts w:ascii="Arial" w:cs="Arial" w:eastAsia="Arial" w:hAnsi="Arial"/>
-          <w:sz w:val="20"/>
-          <w:szCs w:val="20"/>
-        </w:rPr>
-        <w:t xml:space="preserve">- woda morska: 0,68 mg/l</w:t>
-      </w:r>
-    </w:p>
-    <w:p>
-      <w:pPr>
-        <w:spacing w:after="80"/>
-      </w:pPr>
-      <w:r>
-        <w:rPr>
-          <w:rFonts w:ascii="Arial" w:cs="Arial" w:eastAsia="Arial" w:hAnsi="Arial"/>
-          <w:sz w:val="20"/>
-          <w:szCs w:val="20"/>
-        </w:rPr>
-        <w:t xml:space="preserve">- osady słodkowodne: 16,39 mg/kg suchej masy</w:t>
-      </w:r>
-    </w:p>
-    <w:p>
-      <w:pPr>
-        <w:spacing w:after="80"/>
-      </w:pPr>
-      <w:r>
-        <w:rPr>
-          <w:rFonts w:ascii="Arial" w:cs="Arial" w:eastAsia="Arial" w:hAnsi="Arial"/>
-          <w:sz w:val="20"/>
-          <w:szCs w:val="20"/>
-        </w:rPr>
-        <w:t xml:space="preserve">- osady morskie: 16,39 mg/kg suchej masy</w:t>
-      </w:r>
-    </w:p>
-    <w:p>
-      <w:pPr>
-        <w:spacing w:after="80"/>
-      </w:pPr>
-      <w:r>
-        <w:rPr>
-          <w:rFonts w:ascii="Arial" w:cs="Arial" w:eastAsia="Arial" w:hAnsi="Arial"/>
-          <w:sz w:val="20"/>
-          <w:szCs w:val="20"/>
-        </w:rPr>
-        <w:t xml:space="preserve">- woda (uwalnianie okresowe): 0,68 mg/l</w:t>
-      </w:r>
-    </w:p>
-    <w:p>
-      <w:pPr>
-        <w:spacing w:after="80"/>
-      </w:pPr>
-      <w:r>
-        <w:rPr>
-          <w:rFonts w:ascii="Arial" w:cs="Arial" w:eastAsia="Arial" w:hAnsi="Arial"/>
-          <w:sz w:val="20"/>
-          <w:szCs w:val="20"/>
-        </w:rPr>
-        <w:t xml:space="preserve">- mikroorganizmy w oczyszczalni ścieków (STP): 13,61 mg/l</w:t>
-      </w:r>
-    </w:p>
-    <w:p>
-      <w:pPr>
-        <w:spacing w:after="80"/>
-      </w:pPr>
-      <w:r>
-        <w:rPr>
-          <w:rFonts w:ascii="Arial" w:cs="Arial" w:eastAsia="Arial" w:hAnsi="Arial"/>
-          <w:sz w:val="20"/>
-          <w:szCs w:val="20"/>
-        </w:rPr>
-        <w:t xml:space="preserve">- łańcuch pokarmowy (zatrucie wtórne): 2,89 mg/kg suchej masy gleby</w:t>
+        <w:t xml:space="preserve">- woda słodka:0,68mg/l</w:t>
+      </w:r>
+    </w:p>
+    <w:p>
+      <w:pPr>
+        <w:spacing w:after="80"/>
+      </w:pPr>
+      <w:r>
+        <w:rPr>
+          <w:rFonts w:ascii="Arial" w:cs="Arial" w:eastAsia="Arial" w:hAnsi="Arial"/>
+          <w:sz w:val="20"/>
+          <w:szCs w:val="20"/>
+        </w:rPr>
+        <w:t xml:space="preserve">- woda morska:0,68mg/l</w:t>
+      </w:r>
+    </w:p>
+    <w:p>
+      <w:pPr>
+        <w:spacing w:after="80"/>
+      </w:pPr>
+      <w:r>
+        <w:rPr>
+          <w:rFonts w:ascii="Arial" w:cs="Arial" w:eastAsia="Arial" w:hAnsi="Arial"/>
+          <w:sz w:val="20"/>
+          <w:szCs w:val="20"/>
+        </w:rPr>
+        <w:t xml:space="preserve">- osady słodkowodne:16,39mg/kg/d</w:t>
+      </w:r>
+    </w:p>
+    <w:p>
+      <w:pPr>
+        <w:spacing w:after="80"/>
+      </w:pPr>
+      <w:r>
+        <w:rPr>
+          <w:rFonts w:ascii="Arial" w:cs="Arial" w:eastAsia="Arial" w:hAnsi="Arial"/>
+          <w:sz w:val="20"/>
+          <w:szCs w:val="20"/>
+        </w:rPr>
+        <w:t xml:space="preserve">- osady morskie:16,39mg/kg/d</w:t>
+      </w:r>
+    </w:p>
+    <w:p>
+      <w:pPr>
+        <w:spacing w:after="80"/>
+      </w:pPr>
+      <w:r>
+        <w:rPr>
+          <w:rFonts w:ascii="Arial" w:cs="Arial" w:eastAsia="Arial" w:hAnsi="Arial"/>
+          <w:sz w:val="20"/>
+          <w:szCs w:val="20"/>
+        </w:rPr>
+        <w:t xml:space="preserve">- woda (uwalnianie okresowe):0,68mg/l</w:t>
+      </w:r>
+    </w:p>
+    <w:p>
+      <w:pPr>
+        <w:spacing w:after="80"/>
+      </w:pPr>
+      <w:r>
+        <w:rPr>
+          <w:rFonts w:ascii="Arial" w:cs="Arial" w:eastAsia="Arial" w:hAnsi="Arial"/>
+          <w:sz w:val="20"/>
+          <w:szCs w:val="20"/>
+        </w:rPr>
+        <w:t xml:space="preserve">- mikroorganizmy w oczyszczalni ścieków (STP):13,61mg/l</w:t>
+      </w:r>
+    </w:p>
+    <w:p>
+      <w:pPr>
+        <w:spacing w:after="80"/>
+      </w:pPr>
+      <w:r>
+        <w:rPr>
+          <w:rFonts w:ascii="Arial" w:cs="Arial" w:eastAsia="Arial" w:hAnsi="Arial"/>
+          <w:sz w:val="20"/>
+          <w:szCs w:val="20"/>
+        </w:rPr>
+        <w:t xml:space="preserve">- łańcuch pokarmowy (zatrucie wtórne):2,89mg/kg soil dw</w:t>
       </w:r>
     </w:p>
     <w:p>
@@ -4063,7 +4086,150 @@
           <w:sz w:val="20"/>
           <w:szCs w:val="20"/>
         </w:rPr>
-        <w:t xml:space="preserve">W przypadku braku danych doświadczalnych dla samego produktu, zagrożenia dla zdrowia oceniono na podstawie właściwości substancji składowych, zgodnie z kryteriami określonymi w odpowiednich przepisach klasyfikacyjnych. Przy ocenie skutków toksykologicznych narażenia na produkt uwzględniono stężenia poszczególnych substancji niebezpiecznych wskazanych w sekcji 3.</w:t>
+        <w:t xml:space="preserve">Wobec braku danych doświadczalnych dla samego produktu, zagrożenia dla zdrowia ludzi oceniono na podstawie właściwości zawartych w nim substancji, stosując kryteria określone w obowiązujących przepisach dotyczących klasyfikacji.</w:t>
+      </w:r>
+    </w:p>
+    <w:p>
+      <w:pPr>
+        <w:spacing w:after="80"/>
+      </w:pPr>
+      <w:r>
+        <w:rPr>
+          <w:rFonts w:ascii="Arial" w:cs="Arial" w:eastAsia="Arial" w:hAnsi="Arial"/>
+          <w:sz w:val="20"/>
+          <w:szCs w:val="20"/>
+        </w:rPr>
+        <w:t xml:space="preserve">W związku z tym oceniając skutki toksykologiczne narażenia na produkt, należy wziąć pod uwagę stężenia poszczególnych substancji niebezpiecznych wskazanych w sekcji 3.</w:t>
+      </w:r>
+    </w:p>
+    <w:p>
+      <w:pPr>
+        <w:spacing w:after="80"/>
+      </w:pPr>
+      <w:r>
+        <w:rPr>
+          <w:rFonts w:ascii="Arial" w:cs="Arial" w:eastAsia="Arial" w:hAnsi="Arial"/>
+          <w:sz w:val="20"/>
+          <w:szCs w:val="20"/>
+        </w:rPr>
+        <w:t xml:space="preserve">Metabolizm, toksykokinetyka, mechanizm działania i inne informacje:</w:t>
+      </w:r>
+    </w:p>
+    <w:p>
+      <w:pPr>
+        <w:spacing w:after="80"/>
+      </w:pPr>
+      <w:r>
+        <w:rPr>
+          <w:rFonts w:ascii="Arial" w:cs="Arial" w:eastAsia="Arial" w:hAnsi="Arial"/>
+          <w:sz w:val="20"/>
+          <w:szCs w:val="20"/>
+        </w:rPr>
+        <w:t xml:space="preserve">Brak dostępnych informacji.</w:t>
+      </w:r>
+    </w:p>
+    <w:p>
+      <w:pPr>
+        <w:spacing w:after="80"/>
+      </w:pPr>
+      <w:r>
+        <w:rPr>
+          <w:rFonts w:ascii="Arial" w:cs="Arial" w:eastAsia="Arial" w:hAnsi="Arial"/>
+          <w:sz w:val="20"/>
+          <w:szCs w:val="20"/>
+        </w:rPr>
+        <w:t xml:space="preserve">Informacje dotyczące prawdopodobnych dróg narażenia:</w:t>
+      </w:r>
+    </w:p>
+    <w:p>
+      <w:pPr>
+        <w:spacing w:after="80"/>
+      </w:pPr>
+      <w:r>
+        <w:rPr>
+          <w:rFonts w:ascii="Arial" w:cs="Arial" w:eastAsia="Arial" w:hAnsi="Arial"/>
+          <w:sz w:val="20"/>
+          <w:szCs w:val="20"/>
+        </w:rPr>
+        <w:t xml:space="preserve">Toluen:</w:t>
+      </w:r>
+    </w:p>
+    <w:p>
+      <w:pPr>
+        <w:spacing w:after="80"/>
+      </w:pPr>
+      <w:r>
+        <w:rPr>
+          <w:rFonts w:ascii="Arial" w:cs="Arial" w:eastAsia="Arial" w:hAnsi="Arial"/>
+          <w:sz w:val="20"/>
+          <w:szCs w:val="20"/>
+        </w:rPr>
+        <w:t xml:space="preserve">Pracownicy: przez drogi oddechowe (inhalacyjnie); kontakt ze skórą.</w:t>
+      </w:r>
+    </w:p>
+    <w:p>
+      <w:pPr>
+        <w:spacing w:after="80"/>
+      </w:pPr>
+      <w:r>
+        <w:rPr>
+          <w:rFonts w:ascii="Arial" w:cs="Arial" w:eastAsia="Arial" w:hAnsi="Arial"/>
+          <w:sz w:val="20"/>
+          <w:szCs w:val="20"/>
+        </w:rPr>
+        <w:t xml:space="preserve">Konsumenci: spożycie skażonej żywności lub wody; wdychanie powietrza otoczenia; kontakt ze skórą z produktami zawierającymi substancję.</w:t>
+      </w:r>
+    </w:p>
+    <w:p>
+      <w:pPr>
+        <w:spacing w:after="80"/>
+      </w:pPr>
+      <w:r>
+        <w:rPr>
+          <w:rFonts w:ascii="Arial" w:cs="Arial" w:eastAsia="Arial" w:hAnsi="Arial"/>
+          <w:sz w:val="20"/>
+          <w:szCs w:val="20"/>
+        </w:rPr>
+        <w:t xml:space="preserve">Skutki opóźnione, bezpośrednie oraz przewlekłe spowodowane krótko- i długotrwałym narażeniem:</w:t>
+      </w:r>
+    </w:p>
+    <w:p>
+      <w:pPr>
+        <w:spacing w:after="80"/>
+      </w:pPr>
+      <w:r>
+        <w:rPr>
+          <w:rFonts w:ascii="Arial" w:cs="Arial" w:eastAsia="Arial" w:hAnsi="Arial"/>
+          <w:sz w:val="20"/>
+          <w:szCs w:val="20"/>
+        </w:rPr>
+        <w:t xml:space="preserve">Toluen: Działanie toksyczne na ośrodkowy i obwodowy układ nerwowy z encefalopatią i zapaleniem wielonerwowym; działanie drażniące na skórę, spojówki, rogówkę i układ oddechowy.</w:t>
+      </w:r>
+    </w:p>
+    <w:p>
+      <w:pPr>
+        <w:spacing w:after="80"/>
+      </w:pPr>
+      <w:r>
+        <w:rPr>
+          <w:rFonts w:ascii="Arial" w:cs="Arial" w:eastAsia="Arial" w:hAnsi="Arial"/>
+          <w:sz w:val="20"/>
+          <w:szCs w:val="20"/>
+        </w:rPr>
+        <w:t xml:space="preserve">Skutki wzajemnego oddziaływania:</w:t>
+      </w:r>
+    </w:p>
+    <w:p>
+      <w:pPr>
+        <w:spacing w:after="80"/>
+      </w:pPr>
+      <w:r>
+        <w:rPr>
+          <w:rFonts w:ascii="Arial" w:cs="Arial" w:eastAsia="Arial" w:hAnsi="Arial"/>
+          <w:sz w:val="20"/>
+          <w:szCs w:val="20"/>
+        </w:rPr>
+        <w:t xml:space="preserve">Toluen: Niektóre leki i inne substancje chemiczne mogą wchodzić w interakcje z metabolizmem toluenu.</w:t>
       </w:r>
     </w:p>
     <w:p>
@@ -4089,303 +4255,280 @@
           <w:sz w:val="20"/>
           <w:szCs w:val="20"/>
         </w:rPr>
-        <w:t xml:space="preserve">Mieszanina nie spełnia kryteriów klasyfikacji w tej klasie zagrożenia.</w:t>
-      </w:r>
-    </w:p>
-    <w:p>
-      <w:pPr>
-        <w:spacing w:after="80"/>
-      </w:pPr>
-      <w:r>
-        <w:rPr>
-          <w:rFonts w:ascii="Arial" w:cs="Arial" w:eastAsia="Arial" w:hAnsi="Arial"/>
-          <w:sz w:val="20"/>
-          <w:szCs w:val="20"/>
-        </w:rPr>
-        <w:t xml:space="preserve">- ATE mieszaniny (drogi oddechowe): Nie sklasyfikowano (brak istotnych składników stwarzających zagrożenie drogą oddechową w stężeniach wymagających klasyfikacji)</w:t>
-      </w:r>
-    </w:p>
-    <w:p>
-      <w:pPr>
-        <w:spacing w:after="80"/>
-      </w:pPr>
-      <w:r>
-        <w:rPr>
-          <w:rFonts w:ascii="Arial" w:cs="Arial" w:eastAsia="Arial" w:hAnsi="Arial"/>
-          <w:sz w:val="20"/>
-          <w:szCs w:val="20"/>
-        </w:rPr>
-        <w:t xml:space="preserve">- ATE mieszaniny (droga pokarmowa): Nie sklasyfikowano (wartość obliczona znacznie przekracza 2000 mg/kg)</w:t>
-      </w:r>
-    </w:p>
-    <w:p>
-      <w:pPr>
-        <w:spacing w:after="80"/>
-      </w:pPr>
-      <w:r>
-        <w:rPr>
-          <w:rFonts w:ascii="Arial" w:cs="Arial" w:eastAsia="Arial" w:hAnsi="Arial"/>
-          <w:sz w:val="20"/>
-          <w:szCs w:val="20"/>
-        </w:rPr>
-        <w:t xml:space="preserve">- ATE mieszaniny (na skórę): Nie sklasyfikowano (brak istotnych składników)</w:t>
-      </w:r>
-    </w:p>
-    <w:p>
-      <w:pPr>
-        <w:spacing w:after="80"/>
-      </w:pPr>
-      <w:r>
-        <w:rPr>
-          <w:rFonts w:ascii="Arial" w:cs="Arial" w:eastAsia="Arial" w:hAnsi="Arial"/>
-          <w:sz w:val="20"/>
-          <w:szCs w:val="20"/>
-        </w:rPr>
-        <w:t xml:space="preserve">Dane dotyczące składników:</w:t>
-      </w:r>
-    </w:p>
-    <w:p>
-      <w:pPr>
-        <w:spacing w:after="80" w:before="150"/>
-      </w:pPr>
-      <w:r>
-        <w:rPr>
-          <w:rFonts w:ascii="Arial" w:cs="Arial" w:eastAsia="Arial" w:hAnsi="Arial"/>
-          <w:b/>
-          <w:bCs/>
-          <w:sz w:val="20"/>
-          <w:szCs w:val="20"/>
-        </w:rPr>
-        <w:t xml:space="preserve">Etanol (CAS: 64-17-5):</w:t>
-      </w:r>
-    </w:p>
-    <w:p>
-      <w:pPr>
-        <w:spacing w:after="80"/>
-      </w:pPr>
-      <w:r>
-        <w:rPr>
-          <w:rFonts w:ascii="Arial" w:cs="Arial" w:eastAsia="Arial" w:hAnsi="Arial"/>
-          <w:sz w:val="20"/>
-          <w:szCs w:val="20"/>
-        </w:rPr>
-        <w:t xml:space="preserve">- LD50 (doustnie, szczur): &gt; 5000 mg/kg</w:t>
-      </w:r>
-    </w:p>
-    <w:p>
-      <w:pPr>
-        <w:spacing w:after="80"/>
-      </w:pPr>
-      <w:r>
-        <w:rPr>
-          <w:rFonts w:ascii="Arial" w:cs="Arial" w:eastAsia="Arial" w:hAnsi="Arial"/>
-          <w:sz w:val="20"/>
-          <w:szCs w:val="20"/>
-        </w:rPr>
-        <w:t xml:space="preserve">- LC50 (inhalacyjnie - pary, szczur): &gt; 50 mg/l/4h</w:t>
-      </w:r>
-    </w:p>
-    <w:p>
-      <w:pPr>
-        <w:spacing w:after="80" w:before="150"/>
-      </w:pPr>
-      <w:r>
-        <w:rPr>
-          <w:rFonts w:ascii="Arial" w:cs="Arial" w:eastAsia="Arial" w:hAnsi="Arial"/>
-          <w:b/>
-          <w:bCs/>
-          <w:sz w:val="20"/>
-          <w:szCs w:val="20"/>
-        </w:rPr>
-        <w:t xml:space="preserve">Aldehyd anyżowy (CAS: 123-11-5):</w:t>
-      </w:r>
-    </w:p>
-    <w:p>
-      <w:pPr>
-        <w:spacing w:after="80"/>
-      </w:pPr>
-      <w:r>
-        <w:rPr>
-          <w:rFonts w:ascii="Arial" w:cs="Arial" w:eastAsia="Arial" w:hAnsi="Arial"/>
-          <w:sz w:val="20"/>
-          <w:szCs w:val="20"/>
-        </w:rPr>
-        <w:t xml:space="preserve">- LD50 (skóra, królik): &gt; 5000 mg/kg</w:t>
-      </w:r>
-    </w:p>
-    <w:p>
-      <w:pPr>
-        <w:spacing w:after="80"/>
-      </w:pPr>
-      <w:r>
-        <w:rPr>
-          <w:rFonts w:ascii="Arial" w:cs="Arial" w:eastAsia="Arial" w:hAnsi="Arial"/>
-          <w:sz w:val="20"/>
-          <w:szCs w:val="20"/>
-        </w:rPr>
-        <w:t xml:space="preserve">- LD50 (doustnie, szczur): 3210 mg/kg</w:t>
-      </w:r>
-    </w:p>
-    <w:p>
-      <w:pPr>
-        <w:spacing w:after="80"/>
-      </w:pPr>
-      <w:r>
-        <w:rPr>
-          <w:rFonts w:ascii="Arial" w:cs="Arial" w:eastAsia="Arial" w:hAnsi="Arial"/>
-          <w:sz w:val="20"/>
-          <w:szCs w:val="20"/>
-        </w:rPr>
-        <w:t xml:space="preserve">- LC50 (inhalacyjnie - pary, szczur): 0,32 mg/l/7h</w:t>
-      </w:r>
-    </w:p>
-    <w:p>
-      <w:pPr>
-        <w:spacing w:after="80" w:before="150"/>
-      </w:pPr>
-      <w:r>
-        <w:rPr>
-          <w:rFonts w:ascii="Arial" w:cs="Arial" w:eastAsia="Arial" w:hAnsi="Arial"/>
-          <w:b/>
-          <w:bCs/>
-          <w:sz w:val="20"/>
-          <w:szCs w:val="20"/>
-        </w:rPr>
-        <w:t xml:space="preserve">Kumaryna (CAS: 91-64-5):</w:t>
-      </w:r>
-    </w:p>
-    <w:p>
-      <w:pPr>
-        <w:spacing w:after="80"/>
-      </w:pPr>
-      <w:r>
-        <w:rPr>
-          <w:rFonts w:ascii="Arial" w:cs="Arial" w:eastAsia="Arial" w:hAnsi="Arial"/>
-          <w:sz w:val="20"/>
-          <w:szCs w:val="20"/>
-        </w:rPr>
-        <w:t xml:space="preserve">- LD50 (skóra, szczur): 293 mg/kg m.c.</w:t>
-      </w:r>
-    </w:p>
-    <w:p>
-      <w:pPr>
-        <w:spacing w:after="80"/>
-      </w:pPr>
-      <w:r>
-        <w:rPr>
-          <w:rFonts w:ascii="Arial" w:cs="Arial" w:eastAsia="Arial" w:hAnsi="Arial"/>
-          <w:sz w:val="20"/>
-          <w:szCs w:val="20"/>
-        </w:rPr>
-        <w:t xml:space="preserve">- LD50 (doustnie, szczur): 290 mg/kg m.c. (ATE = 500 mg/kg)</w:t>
-      </w:r>
-    </w:p>
-    <w:p>
-      <w:pPr>
-        <w:spacing w:after="80"/>
-      </w:pPr>
-      <w:r>
-        <w:rPr>
-          <w:rFonts w:ascii="Arial" w:cs="Arial" w:eastAsia="Arial" w:hAnsi="Arial"/>
-          <w:sz w:val="20"/>
-          <w:szCs w:val="20"/>
-        </w:rPr>
-        <w:t xml:space="preserve">- LC50 (inhalacyjnie - pyły/mgły, szczur): 293 mg/m³</w:t>
-      </w:r>
-    </w:p>
-    <w:p>
-      <w:pPr>
-        <w:spacing w:after="80" w:before="150"/>
-      </w:pPr>
-      <w:r>
-        <w:rPr>
-          <w:rFonts w:ascii="Arial" w:cs="Arial" w:eastAsia="Arial" w:hAnsi="Arial"/>
-          <w:b/>
-          <w:bCs/>
-          <w:sz w:val="20"/>
-          <w:szCs w:val="20"/>
-        </w:rPr>
-        <w:t xml:space="preserve">2,6-di-tert-butylo-4-metylofenol (BHT) (CAS: 128-37-0):</w:t>
-      </w:r>
-    </w:p>
-    <w:p>
-      <w:pPr>
-        <w:spacing w:after="80"/>
-      </w:pPr>
-      <w:r>
-        <w:rPr>
-          <w:rFonts w:ascii="Arial" w:cs="Arial" w:eastAsia="Arial" w:hAnsi="Arial"/>
-          <w:sz w:val="20"/>
-          <w:szCs w:val="20"/>
-        </w:rPr>
-        <w:t xml:space="preserve">- LD50 (skóra, szczur): &gt; 2000 mg/kg</w:t>
-      </w:r>
-    </w:p>
-    <w:p>
-      <w:pPr>
-        <w:spacing w:after="80"/>
-      </w:pPr>
-      <w:r>
-        <w:rPr>
-          <w:rFonts w:ascii="Arial" w:cs="Arial" w:eastAsia="Arial" w:hAnsi="Arial"/>
-          <w:sz w:val="20"/>
-          <w:szCs w:val="20"/>
-        </w:rPr>
-        <w:t xml:space="preserve">- LD50 (doustnie, szczur): 2930 mg/kg</w:t>
-      </w:r>
-    </w:p>
-    <w:p>
-      <w:pPr>
-        <w:spacing w:after="80" w:before="150"/>
-      </w:pPr>
-      <w:r>
-        <w:rPr>
-          <w:rFonts w:ascii="Arial" w:cs="Arial" w:eastAsia="Arial" w:hAnsi="Arial"/>
-          <w:b/>
-          <w:bCs/>
-          <w:sz w:val="20"/>
-          <w:szCs w:val="20"/>
-        </w:rPr>
-        <w:t xml:space="preserve">Toluen (CAS: 108-88-3):</w:t>
-      </w:r>
-    </w:p>
-    <w:p>
-      <w:pPr>
-        <w:spacing w:after="80"/>
-      </w:pPr>
-      <w:r>
-        <w:rPr>
-          <w:rFonts w:ascii="Arial" w:cs="Arial" w:eastAsia="Arial" w:hAnsi="Arial"/>
-          <w:sz w:val="20"/>
-          <w:szCs w:val="20"/>
-        </w:rPr>
-        <w:t xml:space="preserve">- LD50 (skóra, królik): &gt; 5000 mg/kg m.c.</w:t>
-      </w:r>
-    </w:p>
-    <w:p>
-      <w:pPr>
-        <w:spacing w:after="80"/>
-      </w:pPr>
-      <w:r>
-        <w:rPr>
-          <w:rFonts w:ascii="Arial" w:cs="Arial" w:eastAsia="Arial" w:hAnsi="Arial"/>
-          <w:sz w:val="20"/>
-          <w:szCs w:val="20"/>
-        </w:rPr>
-        <w:t xml:space="preserve">- LD50 (doustnie, szczur): &gt; 5000 mg/kg m.c.</w:t>
-      </w:r>
-    </w:p>
-    <w:p>
-      <w:pPr>
-        <w:spacing w:after="80"/>
-      </w:pPr>
-      <w:r>
-        <w:rPr>
-          <w:rFonts w:ascii="Arial" w:cs="Arial" w:eastAsia="Arial" w:hAnsi="Arial"/>
-          <w:sz w:val="20"/>
-          <w:szCs w:val="20"/>
-        </w:rPr>
-        <w:t xml:space="preserve">- LC50 (inhalacyjnie - pary, człowiek): 100 ppm</w:t>
+        <w:t xml:space="preserve">ATE (mieszaniny, inhalacyjnie): Nie sklasyfikowano (brak istotnych składników o toksyczności wziewnej)</w:t>
+      </w:r>
+    </w:p>
+    <w:p>
+      <w:pPr>
+        <w:spacing w:after="80"/>
+      </w:pPr>
+      <w:r>
+        <w:rPr>
+          <w:rFonts w:ascii="Arial" w:cs="Arial" w:eastAsia="Arial" w:hAnsi="Arial"/>
+          <w:sz w:val="20"/>
+          <w:szCs w:val="20"/>
+        </w:rPr>
+        <w:t xml:space="preserve">ATE (mieszaniny, droga pokarmowa): Nie sklasyfikowano (obliczona wartość ATE mieszaniny znacznie przewyższa 2000 mg/kg mc.)</w:t>
+      </w:r>
+    </w:p>
+    <w:p>
+      <w:pPr>
+        <w:spacing w:after="80"/>
+      </w:pPr>
+      <w:r>
+        <w:rPr>
+          <w:rFonts w:ascii="Arial" w:cs="Arial" w:eastAsia="Arial" w:hAnsi="Arial"/>
+          <w:sz w:val="20"/>
+          <w:szCs w:val="20"/>
+        </w:rPr>
+        <w:t xml:space="preserve">ATE (mieszaniny, na skórę): Nie sklasyfikowano (brak istotnych składników o toksyczności skórnej)</w:t>
+      </w:r>
+    </w:p>
+    <w:p>
+      <w:pPr>
+        <w:spacing w:after="80"/>
+      </w:pPr>
+      <w:r>
+        <w:rPr>
+          <w:rFonts w:ascii="Arial" w:cs="Arial" w:eastAsia="Arial" w:hAnsi="Arial"/>
+          <w:sz w:val="20"/>
+          <w:szCs w:val="20"/>
+        </w:rPr>
+        <w:t xml:space="preserve">Informacje toksykologiczne o składnikach:</w:t>
+      </w:r>
+    </w:p>
+    <w:p>
+      <w:pPr>
+        <w:spacing w:after="80"/>
+      </w:pPr>
+      <w:r>
+        <w:rPr>
+          <w:rFonts w:ascii="Arial" w:cs="Arial" w:eastAsia="Arial" w:hAnsi="Arial"/>
+          <w:sz w:val="20"/>
+          <w:szCs w:val="20"/>
+        </w:rPr>
+        <w:t xml:space="preserve">Etanol [CAS: 64-17-5]:</w:t>
+      </w:r>
+    </w:p>
+    <w:p>
+      <w:pPr>
+        <w:spacing w:after="80"/>
+      </w:pPr>
+      <w:r>
+        <w:rPr>
+          <w:rFonts w:ascii="Arial" w:cs="Arial" w:eastAsia="Arial" w:hAnsi="Arial"/>
+          <w:sz w:val="20"/>
+          <w:szCs w:val="20"/>
+        </w:rPr>
+        <w:t xml:space="preserve">LD50 (droga pokarmowa, szczur): &gt; 5000 mg/kg mc.</w:t>
+      </w:r>
+    </w:p>
+    <w:p>
+      <w:pPr>
+        <w:spacing w:after="80"/>
+      </w:pPr>
+      <w:r>
+        <w:rPr>
+          <w:rFonts w:ascii="Arial" w:cs="Arial" w:eastAsia="Arial" w:hAnsi="Arial"/>
+          <w:sz w:val="20"/>
+          <w:szCs w:val="20"/>
+        </w:rPr>
+        <w:t xml:space="preserve">LC50 (drogi oddechowe – pary, szczur): &gt; 50 mg/l/4h</w:t>
+      </w:r>
+    </w:p>
+    <w:p>
+      <w:pPr>
+        <w:spacing w:after="80"/>
+      </w:pPr>
+      <w:r>
+        <w:rPr>
+          <w:rFonts w:ascii="Arial" w:cs="Arial" w:eastAsia="Arial" w:hAnsi="Arial"/>
+          <w:sz w:val="20"/>
+          <w:szCs w:val="20"/>
+        </w:rPr>
+        <w:t xml:space="preserve">Aldehyd anyżowy [CAS: 123-11-5]:</w:t>
+      </w:r>
+    </w:p>
+    <w:p>
+      <w:pPr>
+        <w:spacing w:after="80"/>
+      </w:pPr>
+      <w:r>
+        <w:rPr>
+          <w:rFonts w:ascii="Arial" w:cs="Arial" w:eastAsia="Arial" w:hAnsi="Arial"/>
+          <w:sz w:val="20"/>
+          <w:szCs w:val="20"/>
+        </w:rPr>
+        <w:t xml:space="preserve">LD50 (na skórę, królik): &gt; 5000 mg/kg mc.</w:t>
+      </w:r>
+    </w:p>
+    <w:p>
+      <w:pPr>
+        <w:spacing w:after="80"/>
+      </w:pPr>
+      <w:r>
+        <w:rPr>
+          <w:rFonts w:ascii="Arial" w:cs="Arial" w:eastAsia="Arial" w:hAnsi="Arial"/>
+          <w:sz w:val="20"/>
+          <w:szCs w:val="20"/>
+        </w:rPr>
+        <w:t xml:space="preserve">LD50 (droga pokarmowa, szczur): 3210 mg/kg mc.</w:t>
+      </w:r>
+    </w:p>
+    <w:p>
+      <w:pPr>
+        <w:spacing w:after="80"/>
+      </w:pPr>
+      <w:r>
+        <w:rPr>
+          <w:rFonts w:ascii="Arial" w:cs="Arial" w:eastAsia="Arial" w:hAnsi="Arial"/>
+          <w:sz w:val="20"/>
+          <w:szCs w:val="20"/>
+        </w:rPr>
+        <w:t xml:space="preserve">LC50 (drogi oddechowe – pary, szczur): 0,32 mg/l/7h</w:t>
+      </w:r>
+    </w:p>
+    <w:p>
+      <w:pPr>
+        <w:spacing w:after="80"/>
+      </w:pPr>
+      <w:r>
+        <w:rPr>
+          <w:rFonts w:ascii="Arial" w:cs="Arial" w:eastAsia="Arial" w:hAnsi="Arial"/>
+          <w:sz w:val="20"/>
+          <w:szCs w:val="20"/>
+        </w:rPr>
+        <w:t xml:space="preserve">Kumaryna [CAS: 91-64-5]:</w:t>
+      </w:r>
+    </w:p>
+    <w:p>
+      <w:pPr>
+        <w:spacing w:after="80"/>
+      </w:pPr>
+      <w:r>
+        <w:rPr>
+          <w:rFonts w:ascii="Arial" w:cs="Arial" w:eastAsia="Arial" w:hAnsi="Arial"/>
+          <w:sz w:val="20"/>
+          <w:szCs w:val="20"/>
+        </w:rPr>
+        <w:t xml:space="preserve">LD50 (na skórę, szczur): 293 mg/kg mc.</w:t>
+      </w:r>
+    </w:p>
+    <w:p>
+      <w:pPr>
+        <w:spacing w:after="80"/>
+      </w:pPr>
+      <w:r>
+        <w:rPr>
+          <w:rFonts w:ascii="Arial" w:cs="Arial" w:eastAsia="Arial" w:hAnsi="Arial"/>
+          <w:sz w:val="20"/>
+          <w:szCs w:val="20"/>
+        </w:rPr>
+        <w:t xml:space="preserve">LD50 (droga pokarmowa, szczur): 290 mg/kg mc. (ATE do klasyfikacji mieszaniny: 500 mg/kg mc.)</w:t>
+      </w:r>
+    </w:p>
+    <w:p>
+      <w:pPr>
+        <w:spacing w:after="80"/>
+      </w:pPr>
+      <w:r>
+        <w:rPr>
+          <w:rFonts w:ascii="Arial" w:cs="Arial" w:eastAsia="Arial" w:hAnsi="Arial"/>
+          <w:sz w:val="20"/>
+          <w:szCs w:val="20"/>
+        </w:rPr>
+        <w:t xml:space="preserve">LC50 (drogi oddechowe – pyły/mgły, szczur): 293 mg/kg</w:t>
+      </w:r>
+    </w:p>
+    <w:p>
+      <w:pPr>
+        <w:spacing w:after="80"/>
+      </w:pPr>
+      <w:r>
+        <w:rPr>
+          <w:rFonts w:ascii="Arial" w:cs="Arial" w:eastAsia="Arial" w:hAnsi="Arial"/>
+          <w:sz w:val="20"/>
+          <w:szCs w:val="20"/>
+        </w:rPr>
+        <w:t xml:space="preserve">2,6-di-tert-butylo-4-metylofenol (BHT) [CAS: 128-37-0]:</w:t>
+      </w:r>
+    </w:p>
+    <w:p>
+      <w:pPr>
+        <w:spacing w:after="80"/>
+      </w:pPr>
+      <w:r>
+        <w:rPr>
+          <w:rFonts w:ascii="Arial" w:cs="Arial" w:eastAsia="Arial" w:hAnsi="Arial"/>
+          <w:sz w:val="20"/>
+          <w:szCs w:val="20"/>
+        </w:rPr>
+        <w:t xml:space="preserve">LD50 (na skórę, szczur): &gt; 2000 mg/kg mc.</w:t>
+      </w:r>
+    </w:p>
+    <w:p>
+      <w:pPr>
+        <w:spacing w:after="80"/>
+      </w:pPr>
+      <w:r>
+        <w:rPr>
+          <w:rFonts w:ascii="Arial" w:cs="Arial" w:eastAsia="Arial" w:hAnsi="Arial"/>
+          <w:sz w:val="20"/>
+          <w:szCs w:val="20"/>
+        </w:rPr>
+        <w:t xml:space="preserve">LD50 (droga pokarmowa, szczur): 2930 mg/kg mc.</w:t>
+      </w:r>
+    </w:p>
+    <w:p>
+      <w:pPr>
+        <w:spacing w:after="80"/>
+      </w:pPr>
+      <w:r>
+        <w:rPr>
+          <w:rFonts w:ascii="Arial" w:cs="Arial" w:eastAsia="Arial" w:hAnsi="Arial"/>
+          <w:sz w:val="20"/>
+          <w:szCs w:val="20"/>
+        </w:rPr>
+        <w:t xml:space="preserve">Toluen [CAS: 108-88-3]:</w:t>
+      </w:r>
+    </w:p>
+    <w:p>
+      <w:pPr>
+        <w:spacing w:after="80"/>
+      </w:pPr>
+      <w:r>
+        <w:rPr>
+          <w:rFonts w:ascii="Arial" w:cs="Arial" w:eastAsia="Arial" w:hAnsi="Arial"/>
+          <w:sz w:val="20"/>
+          <w:szCs w:val="20"/>
+        </w:rPr>
+        <w:t xml:space="preserve">LD50 (na skórę, królik): &gt; 5000 mg/kg mc.</w:t>
+      </w:r>
+    </w:p>
+    <w:p>
+      <w:pPr>
+        <w:spacing w:after="80"/>
+      </w:pPr>
+      <w:r>
+        <w:rPr>
+          <w:rFonts w:ascii="Arial" w:cs="Arial" w:eastAsia="Arial" w:hAnsi="Arial"/>
+          <w:sz w:val="20"/>
+          <w:szCs w:val="20"/>
+        </w:rPr>
+        <w:t xml:space="preserve">LD50 (droga pokarmowa, szczur): &gt; 5000 mg/kg mc.</w:t>
+      </w:r>
+    </w:p>
+    <w:p>
+      <w:pPr>
+        <w:spacing w:after="80"/>
+      </w:pPr>
+      <w:r>
+        <w:rPr>
+          <w:rFonts w:ascii="Arial" w:cs="Arial" w:eastAsia="Arial" w:hAnsi="Arial"/>
+          <w:sz w:val="20"/>
+          <w:szCs w:val="20"/>
+        </w:rPr>
+        <w:t xml:space="preserve">LC50 (drogi oddechowe – pary, człowiek): 100 ppm</w:t>
       </w:r>
     </w:p>
     <w:p>
@@ -4437,7 +4580,7 @@
           <w:sz w:val="20"/>
           <w:szCs w:val="20"/>
         </w:rPr>
-        <w:t xml:space="preserve">Działa drażniąco na oczy (Kategoria 2, H319). Produkt zawiera etanol w stężeniu ≥ 50 %.</w:t>
+        <w:t xml:space="preserve">Działa drażniąco na oczy (Eye Irrit. 2, H319).</w:t>
       </w:r>
     </w:p>
     <w:p>
@@ -4463,7 +4606,7 @@
           <w:sz w:val="20"/>
           <w:szCs w:val="20"/>
         </w:rPr>
-        <w:t xml:space="preserve">W oparciu o dostępne dane, kryteria klasyfikacji nie są spełnione. Może powodować wystąpienie reakcji alergicznej. Zawiera: kumarynę (2H-chromen-2-on) (EUH208).</w:t>
+        <w:t xml:space="preserve">Produkt zawiera kumarynę w stężeniu ≥ 0,1 % i może powodować wystąpienie reakcji alergicznej (EUH208). W oparciu o dostępne dane produkt nie spełnia kryteriów do sklasyfikowania jako działający uczulająco na skórę.</w:t>
       </w:r>
     </w:p>
     <w:p>
@@ -4515,7 +4658,20 @@
           <w:sz w:val="20"/>
           <w:szCs w:val="20"/>
         </w:rPr>
-        <w:t xml:space="preserve">W oparciu o dostępne dane, kryteria klasyfikacji nie są spełnione. Toluen został zaklasyfikowany do Grupy 3 (brak możliwości zaklasyfikowania jako rakotwórczy dla ludzi) przez Międzynarodową Agencję Badań nad Rakiem (IARC, 1999). Agencja Ochrony Środowiska Stanów Zjednoczonych (US EPA) wskazuje, że dane są niewystarczające do oceny potencjału rakotwórczego.</w:t>
+        <w:t xml:space="preserve">W oparciu o dostępne dane, kryteria klasyfikacji nie są spełnione.</w:t>
+      </w:r>
+    </w:p>
+    <w:p>
+      <w:pPr>
+        <w:spacing w:after="80"/>
+      </w:pPr>
+      <w:r>
+        <w:rPr>
+          <w:rFonts w:ascii="Arial" w:cs="Arial" w:eastAsia="Arial" w:hAnsi="Arial"/>
+          <w:sz w:val="20"/>
+          <w:szCs w:val="20"/>
+        </w:rPr>
+        <w:t xml:space="preserve">Toluen został zaklasyfikowany do Grupy 3 (nie można zakwalifikować jako rakotwórczy dla ludzi) przez Międzynarodową Agencję Badań nad Rakiem (IARC, 1999). Agencja EPA wskazuje na brak wystarczających danych do oceny potencjału rakotwórczego.</w:t>
       </w:r>
     </w:p>
     <w:p>
@@ -4541,7 +4697,7 @@
           <w:sz w:val="20"/>
           <w:szCs w:val="20"/>
         </w:rPr>
-        <w:t xml:space="preserve">W oparciu o dostępne dane, kryteria klasyfikacji nie są spełnione. Zawiera aldehyd anyżowy (Repr. 2 H361fd) i toluen (Repr. 2 H361d) w stężeniach poniżej wartości progowych skutkujących klasyfikacją mieszaniny.</w:t>
+        <w:t xml:space="preserve">W oparciu o dostępne dane, kryteria klasyfikacji nie są spełnione (składniki o podejrzeniu takiego działania występują w stężeniach poniżej progów klasyfikacyjnych).</w:t>
       </w:r>
     </w:p>
     <w:p>
@@ -4624,97 +4780,6 @@
     </w:p>
     <w:p>
       <w:pPr>
-        <w:spacing w:after="80"/>
-      </w:pPr>
-      <w:r>
-        <w:rPr>
-          <w:rFonts w:ascii="Arial" w:cs="Arial" w:eastAsia="Arial" w:hAnsi="Arial"/>
-          <w:sz w:val="20"/>
-          <w:szCs w:val="20"/>
-        </w:rPr>
-        <w:t xml:space="preserve">Informacje dotyczące prawdopodobnych dróg narażenia:</w:t>
-      </w:r>
-    </w:p>
-    <w:p>
-      <w:pPr>
-        <w:spacing w:after="80"/>
-      </w:pPr>
-      <w:r>
-        <w:rPr>
-          <w:rFonts w:ascii="Arial" w:cs="Arial" w:eastAsia="Arial" w:hAnsi="Arial"/>
-          <w:sz w:val="20"/>
-          <w:szCs w:val="20"/>
-        </w:rPr>
-        <w:t xml:space="preserve">- Pracownicy: wdychanie par, kontakt ze skórą, kontakt z oczami.</w:t>
-      </w:r>
-    </w:p>
-    <w:p>
-      <w:pPr>
-        <w:spacing w:after="80"/>
-      </w:pPr>
-      <w:r>
-        <w:rPr>
-          <w:rFonts w:ascii="Arial" w:cs="Arial" w:eastAsia="Arial" w:hAnsi="Arial"/>
-          <w:sz w:val="20"/>
-          <w:szCs w:val="20"/>
-        </w:rPr>
-        <w:t xml:space="preserve">- Konsumenci: wdychanie par z powietrza otoczenia, kontakt ze skórą, przypadkowe spożycie.</w:t>
-      </w:r>
-    </w:p>
-    <w:p>
-      <w:pPr>
-        <w:spacing w:after="80"/>
-      </w:pPr>
-      <w:r>
-        <w:rPr>
-          <w:rFonts w:ascii="Arial" w:cs="Arial" w:eastAsia="Arial" w:hAnsi="Arial"/>
-          <w:sz w:val="20"/>
-          <w:szCs w:val="20"/>
-        </w:rPr>
-        <w:t xml:space="preserve">Skutki opóźnione, bezpośrednie oraz przewlekłe spowodowane krótko- i długotrwałym narażeniem:</w:t>
-      </w:r>
-    </w:p>
-    <w:p>
-      <w:pPr>
-        <w:spacing w:after="80"/>
-      </w:pPr>
-      <w:r>
-        <w:rPr>
-          <w:rFonts w:ascii="Arial" w:cs="Arial" w:eastAsia="Arial" w:hAnsi="Arial"/>
-          <w:sz w:val="20"/>
-          <w:szCs w:val="20"/>
-        </w:rPr>
-        <w:t xml:space="preserve">Kontakt z oczami powoduje podrażnienie, zaczerwienienie i łzawienie. U osób szczególnie wrażliwych kontakt ze skórą może wywołać reakcję alergiczną.</w:t>
-      </w:r>
-    </w:p>
-    <w:p>
-      <w:pPr>
-        <w:spacing w:after="80"/>
-      </w:pPr>
-      <w:r>
-        <w:rPr>
-          <w:rFonts w:ascii="Arial" w:cs="Arial" w:eastAsia="Arial" w:hAnsi="Arial"/>
-          <w:sz w:val="20"/>
-          <w:szCs w:val="20"/>
-        </w:rPr>
-        <w:t xml:space="preserve">Skutki wzajemnego oddziaływania:</w:t>
-      </w:r>
-    </w:p>
-    <w:p>
-      <w:pPr>
-        <w:spacing w:after="80"/>
-      </w:pPr>
-      <w:r>
-        <w:rPr>
-          <w:rFonts w:ascii="Arial" w:cs="Arial" w:eastAsia="Arial" w:hAnsi="Arial"/>
-          <w:sz w:val="20"/>
-          <w:szCs w:val="20"/>
-        </w:rPr>
-        <w:t xml:space="preserve">Brak danych dotyczących wzajemnego oddziaływania dla mieszaniny.</w:t>
-      </w:r>
-    </w:p>
-    <w:p>
-      <w:pPr>
         <w:spacing w:after="100" w:before="200"/>
       </w:pPr>
       <w:r>
@@ -4753,7 +4818,7 @@
           <w:sz w:val="20"/>
           <w:szCs w:val="20"/>
         </w:rPr>
-        <w:t xml:space="preserve">Produkt nie zawiera substancji o właściwościach zaburzających funkcjonowanie układu hormonalnego w odniesieniu do zdrowia ludzkiego zgodnie z kryteriami określonymi w rozporządzeniu (UE) 2017/2100 lub rozporządzeniu (UE) 2018/605 w stężeniu równym lub większym niż 0,1 % wag.</w:t>
+        <w:t xml:space="preserve">Na podstawie dostępnych danych mieszanina nie zawiera substancji wpisanych do wykazu ustanowionego zgodnie z art. 59 ust. 1 rozporządzenia REACH ze względu na właściwości zaburzające gospodarkę hormonalną ani substancji o właściwościach zaburzających gospodarkę hormonalną u ludzi w stężeniu równym lub większym niż 0,1 % zgodnie z kryteriami określonymi w rozporządzeniach (UE) 2017/2100 lub (UE) 2018/605.</w:t>
       </w:r>
     </w:p>
     <w:p>
@@ -4781,7 +4846,7 @@
           <w:sz w:val="20"/>
           <w:szCs w:val="20"/>
         </w:rPr>
-        <w:t xml:space="preserve">Brak dodatkowych danych.</w:t>
+        <w:t xml:space="preserve">Brak innych istotnych informacji.</w:t>
       </w:r>
     </w:p>
     <w:p>

</xml_diff>

<commit_message>
feat(sds): format header, dates, versions table and copyright clause (ADR-072)
</commit_message>
<xml_diff>
--- a/docs/SDS/Karta_Charakterystyki_8034055535448_SDS_ORCHIDEA_E_VANIGLIA_V2_PL.docx
+++ b/docs/SDS/Karta_Charakterystyki_8034055535448_SDS_ORCHIDEA_E_VANIGLIA_V2_PL.docx
@@ -4,51 +4,170 @@
   <w:body>
     <w:p>
       <w:pPr>
+        <w:spacing w:after="80" w:before="100"/>
         <w:jc w:val="center"/>
       </w:pPr>
       <w:r>
         <w:rPr>
+          <w:rFonts w:ascii="Arial" w:cs="Arial" w:eastAsia="Arial" w:hAnsi="Arial"/>
           <w:b/>
           <w:bCs/>
           <w:sz w:val="36"/>
           <w:szCs w:val="36"/>
         </w:rPr>
-        <w:t xml:space="preserve">Karta Charakterystyki</w:t>
-      </w:r>
-    </w:p>
-    <w:p>
-      <w:pPr>
-        <w:spacing w:after="300"/>
+        <w:t xml:space="preserve">KARTA CHARAKTERYSTYKI</w:t>
+      </w:r>
+    </w:p>
+    <w:p>
+      <w:pPr>
+        <w:spacing w:after="200"/>
         <w:jc w:val="center"/>
       </w:pPr>
       <w:r>
         <w:rPr>
+          <w:rFonts w:ascii="Arial" w:cs="Arial" w:eastAsia="Arial" w:hAnsi="Arial"/>
+          <w:i/>
+          <w:iCs/>
+          <w:color w:val="444444"/>
           <w:sz w:val="16"/>
           <w:szCs w:val="16"/>
         </w:rPr>
-        <w:t xml:space="preserve">[Sporządzona zgodnie z rozporządzeniem WE 1907/2006(REACH) wraz z późn. zm.]</w:t>
-      </w:r>
-    </w:p>
-    <w:p>
-      <w:pPr>
-        <w:spacing w:after="400"/>
-        <w:jc w:val="right"/>
-      </w:pPr>
-      <w:r>
-        <w:rPr>
-          <w:sz w:val="16"/>
-          <w:szCs w:val="16"/>
-        </w:rPr>
-        <w:t xml:space="preserve">Data wystawienia: 15.09.2026</w:t>
-      </w:r>
-      <w:r>
-        <w:rPr>
-          <w:sz w:val="16"/>
-          <w:szCs w:val="16"/>
-        </w:rPr>
-        <w:t xml:space="preserve">
-Wersja: 2.0 / PL</w:t>
-      </w:r>
+        <w:t xml:space="preserve">[Sporządzona zgodnie z Rozporządzeniem (WE) nr 1907/2006 (REACH), zmienionym Rozporządzeniem Komisji (UE) 2020/878]</w:t>
+      </w:r>
+    </w:p>
+    <w:tbl>
+      <w:tblPr>
+        <w:tblW w:type="pct" w:w="100%"/>
+        <w:tblBorders>
+          <w:top w:val="single" w:color="00A651" w:sz="6"/>
+          <w:left w:val="single" w:color="D0D5DD" w:sz="4"/>
+          <w:bottom w:val="single" w:color="00A651" w:sz="6"/>
+          <w:right w:val="single" w:color="D0D5DD" w:sz="4"/>
+          <w:insideH w:val="none"/>
+          <w:insideV w:val="single" w:color="E5E7EB" w:sz="4"/>
+        </w:tblBorders>
+      </w:tblPr>
+      <w:tblGrid>
+        <w:gridCol w:w="100"/>
+        <w:gridCol w:w="100"/>
+      </w:tblGrid>
+      <w:tr>
+        <w:tc>
+          <w:tcPr>
+            <w:tcW w:type="pct" w:w="50%"/>
+            <w:shd w:fill="F9FAFB"/>
+            <w:tcMar>
+              <w:top w:type="dxa" w:w="100"/>
+              <w:left w:type="dxa" w:w="150"/>
+              <w:bottom w:type="dxa" w:w="100"/>
+              <w:right w:type="dxa" w:w="150"/>
+            </w:tcMar>
+          </w:tcPr>
+          <w:p>
+            <w:pPr>
+              <w:spacing w:after="60"/>
+            </w:pPr>
+            <w:r>
+              <w:rPr>
+                <w:rFonts w:ascii="Arial" w:cs="Arial" w:eastAsia="Arial" w:hAnsi="Arial"/>
+                <w:b/>
+                <w:bCs/>
+                <w:sz w:val="18"/>
+                <w:szCs w:val="18"/>
+              </w:rPr>
+              <w:t xml:space="preserve">Data sporządzenia: </w:t>
+            </w:r>
+            <w:r>
+              <w:rPr>
+                <w:rFonts w:ascii="Arial" w:cs="Arial" w:eastAsia="Arial" w:hAnsi="Arial"/>
+                <w:sz w:val="18"/>
+                <w:szCs w:val="18"/>
+              </w:rPr>
+              <w:t xml:space="preserve">15.09.2026</w:t>
+            </w:r>
+          </w:p>
+          <w:p>
+            <w:r>
+              <w:rPr>
+                <w:rFonts w:ascii="Arial" w:cs="Arial" w:eastAsia="Arial" w:hAnsi="Arial"/>
+                <w:b/>
+                <w:bCs/>
+                <w:sz w:val="18"/>
+                <w:szCs w:val="18"/>
+              </w:rPr>
+              <w:t xml:space="preserve">Aktualizacja: </w:t>
+            </w:r>
+            <w:r>
+              <w:rPr>
+                <w:rFonts w:ascii="Arial" w:cs="Arial" w:eastAsia="Arial" w:hAnsi="Arial"/>
+                <w:sz w:val="18"/>
+                <w:szCs w:val="18"/>
+              </w:rPr>
+              <w:t xml:space="preserve">15.09.2026</w:t>
+            </w:r>
+          </w:p>
+        </w:tc>
+        <w:tc>
+          <w:tcPr>
+            <w:tcW w:type="pct" w:w="50%"/>
+            <w:shd w:fill="F9FAFB"/>
+            <w:tcMar>
+              <w:top w:type="dxa" w:w="100"/>
+              <w:left w:type="dxa" w:w="150"/>
+              <w:bottom w:type="dxa" w:w="100"/>
+              <w:right w:type="dxa" w:w="150"/>
+            </w:tcMar>
+          </w:tcPr>
+          <w:p>
+            <w:pPr>
+              <w:spacing w:after="60"/>
+            </w:pPr>
+            <w:r>
+              <w:rPr>
+                <w:rFonts w:ascii="Arial" w:cs="Arial" w:eastAsia="Arial" w:hAnsi="Arial"/>
+                <w:b/>
+                <w:bCs/>
+                <w:sz w:val="18"/>
+                <w:szCs w:val="18"/>
+              </w:rPr>
+              <w:t xml:space="preserve">Wersja: </w:t>
+            </w:r>
+            <w:r>
+              <w:rPr>
+                <w:rFonts w:ascii="Arial" w:cs="Arial" w:eastAsia="Arial" w:hAnsi="Arial"/>
+                <w:sz w:val="18"/>
+                <w:szCs w:val="18"/>
+              </w:rPr>
+              <w:t xml:space="preserve">2.0 / PL</w:t>
+            </w:r>
+          </w:p>
+          <w:p>
+            <w:r>
+              <w:rPr>
+                <w:rFonts w:ascii="Arial" w:cs="Arial" w:eastAsia="Arial" w:hAnsi="Arial"/>
+                <w:b/>
+                <w:bCs/>
+                <w:sz w:val="18"/>
+                <w:szCs w:val="18"/>
+              </w:rPr>
+              <w:t xml:space="preserve">Zastępuje wersję: </w:t>
+            </w:r>
+            <w:r>
+              <w:rPr>
+                <w:rFonts w:ascii="Arial" w:cs="Arial" w:eastAsia="Arial" w:hAnsi="Arial"/>
+                <w:sz w:val="18"/>
+                <w:szCs w:val="18"/>
+              </w:rPr>
+              <w:t xml:space="preserve">1.0</w:t>
+            </w:r>
+          </w:p>
+        </w:tc>
+      </w:tr>
+    </w:tbl>
+    <w:p>
+      <w:pPr>
+        <w:spacing w:after="200"/>
+      </w:pPr>
     </w:p>
     <w:p>
       <w:pPr>
@@ -4063,6 +4182,32 @@
     </w:p>
     <w:p>
       <w:pPr>
+        <w:spacing w:after="80"/>
+      </w:pPr>
+      <w:r>
+        <w:rPr>
+          <w:rFonts w:ascii="Arial" w:cs="Arial" w:eastAsia="Arial" w:hAnsi="Arial"/>
+          <w:sz w:val="20"/>
+          <w:szCs w:val="20"/>
+        </w:rPr>
+        <w:t xml:space="preserve">Wobec braku danych doświadczalnych dla samego produktu, zagrożenia dla zdrowia oceniono na podstawie właściwości zawartych w nim substancji, zgodnie z kryteriami określonymi w odpowiednich przepisach dotyczących klasyfikacji.</w:t>
+      </w:r>
+    </w:p>
+    <w:p>
+      <w:pPr>
+        <w:spacing w:after="80"/>
+      </w:pPr>
+      <w:r>
+        <w:rPr>
+          <w:rFonts w:ascii="Arial" w:cs="Arial" w:eastAsia="Arial" w:hAnsi="Arial"/>
+          <w:sz w:val="20"/>
+          <w:szCs w:val="20"/>
+        </w:rPr>
+        <w:t xml:space="preserve">W związku z tym w celu oceny skutków toksykologicznych narażenia na produkt należy uwzględnić stężenia poszczególnych substancji niebezpiecznych wymienionych w sekcji 3.</w:t>
+      </w:r>
+    </w:p>
+    <w:p>
+      <w:pPr>
         <w:spacing w:after="100" w:before="200"/>
       </w:pPr>
       <w:r>
@@ -4086,32 +4231,6 @@
           <w:sz w:val="20"/>
           <w:szCs w:val="20"/>
         </w:rPr>
-        <w:t xml:space="preserve">Wobec braku danych doświadczalnych dla samego produktu, zagrożenia dla zdrowia ludzi oceniono na podstawie właściwości zawartych w nim substancji, stosując kryteria określone w obowiązujących przepisach dotyczących klasyfikacji.</w:t>
-      </w:r>
-    </w:p>
-    <w:p>
-      <w:pPr>
-        <w:spacing w:after="80"/>
-      </w:pPr>
-      <w:r>
-        <w:rPr>
-          <w:rFonts w:ascii="Arial" w:cs="Arial" w:eastAsia="Arial" w:hAnsi="Arial"/>
-          <w:sz w:val="20"/>
-          <w:szCs w:val="20"/>
-        </w:rPr>
-        <w:t xml:space="preserve">W związku z tym oceniając skutki toksykologiczne narażenia na produkt, należy wziąć pod uwagę stężenia poszczególnych substancji niebezpiecznych wskazanych w sekcji 3.</w:t>
-      </w:r>
-    </w:p>
-    <w:p>
-      <w:pPr>
-        <w:spacing w:after="80"/>
-      </w:pPr>
-      <w:r>
-        <w:rPr>
-          <w:rFonts w:ascii="Arial" w:cs="Arial" w:eastAsia="Arial" w:hAnsi="Arial"/>
-          <w:sz w:val="20"/>
-          <w:szCs w:val="20"/>
-        </w:rPr>
         <w:t xml:space="preserve">Metabolizm, toksykokinetyka, mechanizm działania i inne informacje:</w:t>
       </w:r>
     </w:p>
@@ -4164,46 +4283,59 @@
           <w:sz w:val="20"/>
           <w:szCs w:val="20"/>
         </w:rPr>
-        <w:t xml:space="preserve">Pracownicy: przez drogi oddechowe (inhalacyjnie); kontakt ze skórą.</w:t>
-      </w:r>
-    </w:p>
-    <w:p>
-      <w:pPr>
-        <w:spacing w:after="80"/>
-      </w:pPr>
-      <w:r>
-        <w:rPr>
-          <w:rFonts w:ascii="Arial" w:cs="Arial" w:eastAsia="Arial" w:hAnsi="Arial"/>
-          <w:sz w:val="20"/>
-          <w:szCs w:val="20"/>
-        </w:rPr>
-        <w:t xml:space="preserve">Konsumenci: spożycie skażonej żywności lub wody; wdychanie powietrza otoczenia; kontakt ze skórą z produktami zawierającymi substancję.</w:t>
-      </w:r>
-    </w:p>
-    <w:p>
-      <w:pPr>
-        <w:spacing w:after="80"/>
-      </w:pPr>
-      <w:r>
-        <w:rPr>
-          <w:rFonts w:ascii="Arial" w:cs="Arial" w:eastAsia="Arial" w:hAnsi="Arial"/>
-          <w:sz w:val="20"/>
-          <w:szCs w:val="20"/>
-        </w:rPr>
-        <w:t xml:space="preserve">Skutki opóźnione, bezpośrednie oraz przewlekłe spowodowane krótko- i długotrwałym narażeniem:</w:t>
-      </w:r>
-    </w:p>
-    <w:p>
-      <w:pPr>
-        <w:spacing w:after="80"/>
-      </w:pPr>
-      <w:r>
-        <w:rPr>
-          <w:rFonts w:ascii="Arial" w:cs="Arial" w:eastAsia="Arial" w:hAnsi="Arial"/>
-          <w:sz w:val="20"/>
-          <w:szCs w:val="20"/>
-        </w:rPr>
-        <w:t xml:space="preserve">Toluen: Działanie toksyczne na ośrodkowy i obwodowy układ nerwowy z encefalopatią i zapaleniem wielonerwowym; działanie drażniące na skórę, spojówki, rogówkę i układ oddechowy.</w:t>
+        <w:t xml:space="preserve">PRACOWNICY: przez drogi oddechowe (inhalacyjnie); kontakt ze skórą.</w:t>
+      </w:r>
+    </w:p>
+    <w:p>
+      <w:pPr>
+        <w:spacing w:after="80"/>
+      </w:pPr>
+      <w:r>
+        <w:rPr>
+          <w:rFonts w:ascii="Arial" w:cs="Arial" w:eastAsia="Arial" w:hAnsi="Arial"/>
+          <w:sz w:val="20"/>
+          <w:szCs w:val="20"/>
+        </w:rPr>
+        <w:t xml:space="preserve">LUDNOŚĆ: spożycie skażonej żywności lub wody; wdychanie powietrza atmosferycznego; kontakt ze skórą z produktami zawierającymi substancję.</w:t>
+      </w:r>
+    </w:p>
+    <w:p>
+      <w:pPr>
+        <w:spacing w:after="80"/>
+      </w:pPr>
+      <w:r>
+        <w:rPr>
+          <w:rFonts w:ascii="Arial" w:cs="Arial" w:eastAsia="Arial" w:hAnsi="Arial"/>
+          <w:sz w:val="20"/>
+          <w:szCs w:val="20"/>
+        </w:rPr>
+        <w:t xml:space="preserve">Opóźnione, bezpośrednie oraz przewlekłe skutki krótko- i długotrwałego narażenia:</w:t>
+      </w:r>
+    </w:p>
+    <w:p>
+      <w:pPr>
+        <w:spacing w:after="80"/>
+      </w:pPr>
+      <w:r>
+        <w:rPr>
+          <w:rFonts w:ascii="Arial" w:cs="Arial" w:eastAsia="Arial" w:hAnsi="Arial"/>
+          <w:sz w:val="20"/>
+          <w:szCs w:val="20"/>
+        </w:rPr>
+        <w:t xml:space="preserve">Toluen:</w:t>
+      </w:r>
+    </w:p>
+    <w:p>
+      <w:pPr>
+        <w:spacing w:after="80"/>
+      </w:pPr>
+      <w:r>
+        <w:rPr>
+          <w:rFonts w:ascii="Arial" w:cs="Arial" w:eastAsia="Arial" w:hAnsi="Arial"/>
+          <w:sz w:val="20"/>
+          <w:szCs w:val="20"/>
+        </w:rPr>
+        <w:t xml:space="preserve">Działanie toksyczne na ośrodkowy i obwodowy układ nerwowy z encefalopatią i zapaleniem wielonerwowym; działanie drażniące na skórę, spojówki, rogówkę i układ oddechowy.</w:t>
       </w:r>
     </w:p>
     <w:p>
@@ -4229,7 +4361,20 @@
           <w:sz w:val="20"/>
           <w:szCs w:val="20"/>
         </w:rPr>
-        <w:t xml:space="preserve">Toluen: Niektóre leki i inne substancje chemiczne mogą wchodzić w interakcje z metabolizmem toluenu.</w:t>
+        <w:t xml:space="preserve">Toluen:</w:t>
+      </w:r>
+    </w:p>
+    <w:p>
+      <w:pPr>
+        <w:spacing w:after="80"/>
+      </w:pPr>
+      <w:r>
+        <w:rPr>
+          <w:rFonts w:ascii="Arial" w:cs="Arial" w:eastAsia="Arial" w:hAnsi="Arial"/>
+          <w:sz w:val="20"/>
+          <w:szCs w:val="20"/>
+        </w:rPr>
+        <w:t xml:space="preserve">Niektóre leki i inne substancje chemiczne mogą wpływać na metabolizm toluenu.</w:t>
       </w:r>
     </w:p>
     <w:p>
@@ -4255,72 +4400,59 @@
           <w:sz w:val="20"/>
           <w:szCs w:val="20"/>
         </w:rPr>
-        <w:t xml:space="preserve">ATE (mieszaniny, inhalacyjnie): Nie sklasyfikowano (brak istotnych składników o toksyczności wziewnej)</w:t>
-      </w:r>
-    </w:p>
-    <w:p>
-      <w:pPr>
-        <w:spacing w:after="80"/>
-      </w:pPr>
-      <w:r>
-        <w:rPr>
-          <w:rFonts w:ascii="Arial" w:cs="Arial" w:eastAsia="Arial" w:hAnsi="Arial"/>
-          <w:sz w:val="20"/>
-          <w:szCs w:val="20"/>
-        </w:rPr>
-        <w:t xml:space="preserve">ATE (mieszaniny, droga pokarmowa): Nie sklasyfikowano (obliczona wartość ATE mieszaniny znacznie przewyższa 2000 mg/kg mc.)</w:t>
-      </w:r>
-    </w:p>
-    <w:p>
-      <w:pPr>
-        <w:spacing w:after="80"/>
-      </w:pPr>
-      <w:r>
-        <w:rPr>
-          <w:rFonts w:ascii="Arial" w:cs="Arial" w:eastAsia="Arial" w:hAnsi="Arial"/>
-          <w:sz w:val="20"/>
-          <w:szCs w:val="20"/>
-        </w:rPr>
-        <w:t xml:space="preserve">ATE (mieszaniny, na skórę): Nie sklasyfikowano (brak istotnych składników o toksyczności skórnej)</w:t>
-      </w:r>
-    </w:p>
-    <w:p>
-      <w:pPr>
-        <w:spacing w:after="80"/>
-      </w:pPr>
-      <w:r>
-        <w:rPr>
-          <w:rFonts w:ascii="Arial" w:cs="Arial" w:eastAsia="Arial" w:hAnsi="Arial"/>
-          <w:sz w:val="20"/>
-          <w:szCs w:val="20"/>
-        </w:rPr>
-        <w:t xml:space="preserve">Informacje toksykologiczne o składnikach:</w:t>
-      </w:r>
-    </w:p>
-    <w:p>
-      <w:pPr>
-        <w:spacing w:after="80"/>
-      </w:pPr>
-      <w:r>
-        <w:rPr>
-          <w:rFonts w:ascii="Arial" w:cs="Arial" w:eastAsia="Arial" w:hAnsi="Arial"/>
-          <w:sz w:val="20"/>
-          <w:szCs w:val="20"/>
-        </w:rPr>
-        <w:t xml:space="preserve">Etanol [CAS: 64-17-5]:</w:t>
-      </w:r>
-    </w:p>
-    <w:p>
-      <w:pPr>
-        <w:spacing w:after="80"/>
-      </w:pPr>
-      <w:r>
-        <w:rPr>
-          <w:rFonts w:ascii="Arial" w:cs="Arial" w:eastAsia="Arial" w:hAnsi="Arial"/>
-          <w:sz w:val="20"/>
-          <w:szCs w:val="20"/>
-        </w:rPr>
-        <w:t xml:space="preserve">LD50 (droga pokarmowa, szczur): &gt; 5000 mg/kg mc.</w:t>
+        <w:t xml:space="preserve">ATE (przez drogi oddechowe) mieszaniny: Nie sklasyfikowano (brak istotnych składników)</w:t>
+      </w:r>
+    </w:p>
+    <w:p>
+      <w:pPr>
+        <w:spacing w:after="80"/>
+      </w:pPr>
+      <w:r>
+        <w:rPr>
+          <w:rFonts w:ascii="Arial" w:cs="Arial" w:eastAsia="Arial" w:hAnsi="Arial"/>
+          <w:sz w:val="20"/>
+          <w:szCs w:val="20"/>
+        </w:rPr>
+        <w:t xml:space="preserve">ATE (droga pokarmowa) mieszaniny: Nie sklasyfikowano (brak istotnych składników)</w:t>
+      </w:r>
+    </w:p>
+    <w:p>
+      <w:pPr>
+        <w:spacing w:after="80"/>
+      </w:pPr>
+      <w:r>
+        <w:rPr>
+          <w:rFonts w:ascii="Arial" w:cs="Arial" w:eastAsia="Arial" w:hAnsi="Arial"/>
+          <w:sz w:val="20"/>
+          <w:szCs w:val="20"/>
+        </w:rPr>
+        <w:t xml:space="preserve">ATE (na skórę) mieszaniny: Nie sklasyfikowano (brak istotnych składników)</w:t>
+      </w:r>
+    </w:p>
+    <w:p>
+      <w:pPr>
+        <w:spacing w:after="80"/>
+      </w:pPr>
+      <w:r>
+        <w:rPr>
+          <w:rFonts w:ascii="Arial" w:cs="Arial" w:eastAsia="Arial" w:hAnsi="Arial"/>
+          <w:sz w:val="20"/>
+          <w:szCs w:val="20"/>
+        </w:rPr>
+        <w:t xml:space="preserve">etanol:</w:t>
+      </w:r>
+    </w:p>
+    <w:p>
+      <w:pPr>
+        <w:spacing w:after="80"/>
+      </w:pPr>
+      <w:r>
+        <w:rPr>
+          <w:rFonts w:ascii="Arial" w:cs="Arial" w:eastAsia="Arial" w:hAnsi="Arial"/>
+          <w:sz w:val="20"/>
+          <w:szCs w:val="20"/>
+        </w:rPr>
+        <w:t xml:space="preserve">LD50 (droga pokarmowa, szczur): &gt; 5000 mg/kg</w:t>
       </w:r>
     </w:p>
     <w:p>
@@ -4346,33 +4478,33 @@
           <w:sz w:val="20"/>
           <w:szCs w:val="20"/>
         </w:rPr>
-        <w:t xml:space="preserve">Aldehyd anyżowy [CAS: 123-11-5]:</w:t>
-      </w:r>
-    </w:p>
-    <w:p>
-      <w:pPr>
-        <w:spacing w:after="80"/>
-      </w:pPr>
-      <w:r>
-        <w:rPr>
-          <w:rFonts w:ascii="Arial" w:cs="Arial" w:eastAsia="Arial" w:hAnsi="Arial"/>
-          <w:sz w:val="20"/>
-          <w:szCs w:val="20"/>
-        </w:rPr>
-        <w:t xml:space="preserve">LD50 (na skórę, królik): &gt; 5000 mg/kg mc.</w:t>
-      </w:r>
-    </w:p>
-    <w:p>
-      <w:pPr>
-        <w:spacing w:after="80"/>
-      </w:pPr>
-      <w:r>
-        <w:rPr>
-          <w:rFonts w:ascii="Arial" w:cs="Arial" w:eastAsia="Arial" w:hAnsi="Arial"/>
-          <w:sz w:val="20"/>
-          <w:szCs w:val="20"/>
-        </w:rPr>
-        <w:t xml:space="preserve">LD50 (droga pokarmowa, szczur): 3210 mg/kg mc.</w:t>
+        <w:t xml:space="preserve">aldehyd anyżowy:</w:t>
+      </w:r>
+    </w:p>
+    <w:p>
+      <w:pPr>
+        <w:spacing w:after="80"/>
+      </w:pPr>
+      <w:r>
+        <w:rPr>
+          <w:rFonts w:ascii="Arial" w:cs="Arial" w:eastAsia="Arial" w:hAnsi="Arial"/>
+          <w:sz w:val="20"/>
+          <w:szCs w:val="20"/>
+        </w:rPr>
+        <w:t xml:space="preserve">LD50 (na skórę, królik): &gt; 5000 mg/kg</w:t>
+      </w:r>
+    </w:p>
+    <w:p>
+      <w:pPr>
+        <w:spacing w:after="80"/>
+      </w:pPr>
+      <w:r>
+        <w:rPr>
+          <w:rFonts w:ascii="Arial" w:cs="Arial" w:eastAsia="Arial" w:hAnsi="Arial"/>
+          <w:sz w:val="20"/>
+          <w:szCs w:val="20"/>
+        </w:rPr>
+        <w:t xml:space="preserve">LD50 (droga pokarmowa, szczur): 3210 mg/kg</w:t>
       </w:r>
     </w:p>
     <w:p>
@@ -4398,33 +4530,33 @@
           <w:sz w:val="20"/>
           <w:szCs w:val="20"/>
         </w:rPr>
-        <w:t xml:space="preserve">Kumaryna [CAS: 91-64-5]:</w:t>
-      </w:r>
-    </w:p>
-    <w:p>
-      <w:pPr>
-        <w:spacing w:after="80"/>
-      </w:pPr>
-      <w:r>
-        <w:rPr>
-          <w:rFonts w:ascii="Arial" w:cs="Arial" w:eastAsia="Arial" w:hAnsi="Arial"/>
-          <w:sz w:val="20"/>
-          <w:szCs w:val="20"/>
-        </w:rPr>
-        <w:t xml:space="preserve">LD50 (na skórę, szczur): 293 mg/kg mc.</w:t>
-      </w:r>
-    </w:p>
-    <w:p>
-      <w:pPr>
-        <w:spacing w:after="80"/>
-      </w:pPr>
-      <w:r>
-        <w:rPr>
-          <w:rFonts w:ascii="Arial" w:cs="Arial" w:eastAsia="Arial" w:hAnsi="Arial"/>
-          <w:sz w:val="20"/>
-          <w:szCs w:val="20"/>
-        </w:rPr>
-        <w:t xml:space="preserve">LD50 (droga pokarmowa, szczur): 290 mg/kg mc. (ATE do klasyfikacji mieszaniny: 500 mg/kg mc.)</w:t>
+        <w:t xml:space="preserve">kumaryna:</w:t>
+      </w:r>
+    </w:p>
+    <w:p>
+      <w:pPr>
+        <w:spacing w:after="80"/>
+      </w:pPr>
+      <w:r>
+        <w:rPr>
+          <w:rFonts w:ascii="Arial" w:cs="Arial" w:eastAsia="Arial" w:hAnsi="Arial"/>
+          <w:sz w:val="20"/>
+          <w:szCs w:val="20"/>
+        </w:rPr>
+        <w:t xml:space="preserve">LD50 (na skórę, szczur): 293 mg/kg m.c.</w:t>
+      </w:r>
+    </w:p>
+    <w:p>
+      <w:pPr>
+        <w:spacing w:after="80"/>
+      </w:pPr>
+      <w:r>
+        <w:rPr>
+          <w:rFonts w:ascii="Arial" w:cs="Arial" w:eastAsia="Arial" w:hAnsi="Arial"/>
+          <w:sz w:val="20"/>
+          <w:szCs w:val="20"/>
+        </w:rPr>
+        <w:t xml:space="preserve">LD50 (droga pokarmowa, szczur): 290 mg/kg m.c. (ATE = 500 mg/kg)</w:t>
       </w:r>
     </w:p>
     <w:p>
@@ -4450,72 +4582,72 @@
           <w:sz w:val="20"/>
           <w:szCs w:val="20"/>
         </w:rPr>
-        <w:t xml:space="preserve">2,6-di-tert-butylo-4-metylofenol (BHT) [CAS: 128-37-0]:</w:t>
-      </w:r>
-    </w:p>
-    <w:p>
-      <w:pPr>
-        <w:spacing w:after="80"/>
-      </w:pPr>
-      <w:r>
-        <w:rPr>
-          <w:rFonts w:ascii="Arial" w:cs="Arial" w:eastAsia="Arial" w:hAnsi="Arial"/>
-          <w:sz w:val="20"/>
-          <w:szCs w:val="20"/>
-        </w:rPr>
-        <w:t xml:space="preserve">LD50 (na skórę, szczur): &gt; 2000 mg/kg mc.</w:t>
-      </w:r>
-    </w:p>
-    <w:p>
-      <w:pPr>
-        <w:spacing w:after="80"/>
-      </w:pPr>
-      <w:r>
-        <w:rPr>
-          <w:rFonts w:ascii="Arial" w:cs="Arial" w:eastAsia="Arial" w:hAnsi="Arial"/>
-          <w:sz w:val="20"/>
-          <w:szCs w:val="20"/>
-        </w:rPr>
-        <w:t xml:space="preserve">LD50 (droga pokarmowa, szczur): 2930 mg/kg mc.</w:t>
-      </w:r>
-    </w:p>
-    <w:p>
-      <w:pPr>
-        <w:spacing w:after="80"/>
-      </w:pPr>
-      <w:r>
-        <w:rPr>
-          <w:rFonts w:ascii="Arial" w:cs="Arial" w:eastAsia="Arial" w:hAnsi="Arial"/>
-          <w:sz w:val="20"/>
-          <w:szCs w:val="20"/>
-        </w:rPr>
-        <w:t xml:space="preserve">Toluen [CAS: 108-88-3]:</w:t>
-      </w:r>
-    </w:p>
-    <w:p>
-      <w:pPr>
-        <w:spacing w:after="80"/>
-      </w:pPr>
-      <w:r>
-        <w:rPr>
-          <w:rFonts w:ascii="Arial" w:cs="Arial" w:eastAsia="Arial" w:hAnsi="Arial"/>
-          <w:sz w:val="20"/>
-          <w:szCs w:val="20"/>
-        </w:rPr>
-        <w:t xml:space="preserve">LD50 (na skórę, królik): &gt; 5000 mg/kg mc.</w:t>
-      </w:r>
-    </w:p>
-    <w:p>
-      <w:pPr>
-        <w:spacing w:after="80"/>
-      </w:pPr>
-      <w:r>
-        <w:rPr>
-          <w:rFonts w:ascii="Arial" w:cs="Arial" w:eastAsia="Arial" w:hAnsi="Arial"/>
-          <w:sz w:val="20"/>
-          <w:szCs w:val="20"/>
-        </w:rPr>
-        <w:t xml:space="preserve">LD50 (droga pokarmowa, szczur): &gt; 5000 mg/kg mc.</w:t>
+        <w:t xml:space="preserve">2,6-di-tert-butylo-4-metylofenol (BHT):</w:t>
+      </w:r>
+    </w:p>
+    <w:p>
+      <w:pPr>
+        <w:spacing w:after="80"/>
+      </w:pPr>
+      <w:r>
+        <w:rPr>
+          <w:rFonts w:ascii="Arial" w:cs="Arial" w:eastAsia="Arial" w:hAnsi="Arial"/>
+          <w:sz w:val="20"/>
+          <w:szCs w:val="20"/>
+        </w:rPr>
+        <w:t xml:space="preserve">LD50 (na skórę, szczur): &gt; 2000 mg/kg</w:t>
+      </w:r>
+    </w:p>
+    <w:p>
+      <w:pPr>
+        <w:spacing w:after="80"/>
+      </w:pPr>
+      <w:r>
+        <w:rPr>
+          <w:rFonts w:ascii="Arial" w:cs="Arial" w:eastAsia="Arial" w:hAnsi="Arial"/>
+          <w:sz w:val="20"/>
+          <w:szCs w:val="20"/>
+        </w:rPr>
+        <w:t xml:space="preserve">LD50 (droga pokarmowa, szczur): 2930 mg/kg</w:t>
+      </w:r>
+    </w:p>
+    <w:p>
+      <w:pPr>
+        <w:spacing w:after="80"/>
+      </w:pPr>
+      <w:r>
+        <w:rPr>
+          <w:rFonts w:ascii="Arial" w:cs="Arial" w:eastAsia="Arial" w:hAnsi="Arial"/>
+          <w:sz w:val="20"/>
+          <w:szCs w:val="20"/>
+        </w:rPr>
+        <w:t xml:space="preserve">toluen:</w:t>
+      </w:r>
+    </w:p>
+    <w:p>
+      <w:pPr>
+        <w:spacing w:after="80"/>
+      </w:pPr>
+      <w:r>
+        <w:rPr>
+          <w:rFonts w:ascii="Arial" w:cs="Arial" w:eastAsia="Arial" w:hAnsi="Arial"/>
+          <w:sz w:val="20"/>
+          <w:szCs w:val="20"/>
+        </w:rPr>
+        <w:t xml:space="preserve">LD50 (na skórę, królik): &gt; 5000 mg/kg m.c.</w:t>
+      </w:r>
+    </w:p>
+    <w:p>
+      <w:pPr>
+        <w:spacing w:after="80"/>
+      </w:pPr>
+      <w:r>
+        <w:rPr>
+          <w:rFonts w:ascii="Arial" w:cs="Arial" w:eastAsia="Arial" w:hAnsi="Arial"/>
+          <w:sz w:val="20"/>
+          <w:szCs w:val="20"/>
+        </w:rPr>
+        <w:t xml:space="preserve">LD50 (droga pokarmowa, szczur): &gt; 5000 mg/kg m.c.</w:t>
       </w:r>
     </w:p>
     <w:p>
@@ -4554,7 +4686,7 @@
           <w:sz w:val="20"/>
           <w:szCs w:val="20"/>
         </w:rPr>
-        <w:t xml:space="preserve">W oparciu o dostępne dane, kryteria klasyfikacji nie są spełnione.</w:t>
+        <w:t xml:space="preserve">Nie spełnia kryteriów klasyfikacji dla tej klasy zagrożenia.</w:t>
       </w:r>
     </w:p>
     <w:p>
@@ -4606,7 +4738,7 @@
           <w:sz w:val="20"/>
           <w:szCs w:val="20"/>
         </w:rPr>
-        <w:t xml:space="preserve">Produkt zawiera kumarynę w stężeniu ≥ 0,1 % i może powodować wystąpienie reakcji alergicznej (EUH208). W oparciu o dostępne dane produkt nie spełnia kryteriów do sklasyfikowania jako działający uczulająco na skórę.</w:t>
+        <w:t xml:space="preserve">Może wywołać reakcję alergiczną (zawiera: kumarynę).</w:t>
       </w:r>
     </w:p>
     <w:p>
@@ -4632,7 +4764,7 @@
           <w:sz w:val="20"/>
           <w:szCs w:val="20"/>
         </w:rPr>
-        <w:t xml:space="preserve">W oparciu o dostępne dane, kryteria klasyfikacji nie są spełnione.</w:t>
+        <w:t xml:space="preserve">Nie spełnia kryteriów klasyfikacji dla tej klasy zagrożenia.</w:t>
       </w:r>
     </w:p>
     <w:p>
@@ -4658,20 +4790,33 @@
           <w:sz w:val="20"/>
           <w:szCs w:val="20"/>
         </w:rPr>
-        <w:t xml:space="preserve">W oparciu o dostępne dane, kryteria klasyfikacji nie są spełnione.</w:t>
-      </w:r>
-    </w:p>
-    <w:p>
-      <w:pPr>
-        <w:spacing w:after="80"/>
-      </w:pPr>
-      <w:r>
-        <w:rPr>
-          <w:rFonts w:ascii="Arial" w:cs="Arial" w:eastAsia="Arial" w:hAnsi="Arial"/>
-          <w:sz w:val="20"/>
-          <w:szCs w:val="20"/>
-        </w:rPr>
-        <w:t xml:space="preserve">Toluen został zaklasyfikowany do Grupy 3 (nie można zakwalifikować jako rakotwórczy dla ludzi) przez Międzynarodową Agencję Badań nad Rakiem (IARC, 1999). Agencja EPA wskazuje na brak wystarczających danych do oceny potencjału rakotwórczego.</w:t>
+        <w:t xml:space="preserve">Nie spełnia kryteriów klasyfikacji dla tej klasy zagrożenia.</w:t>
+      </w:r>
+    </w:p>
+    <w:p>
+      <w:pPr>
+        <w:spacing w:after="80"/>
+      </w:pPr>
+      <w:r>
+        <w:rPr>
+          <w:rFonts w:ascii="Arial" w:cs="Arial" w:eastAsia="Arial" w:hAnsi="Arial"/>
+          <w:sz w:val="20"/>
+          <w:szCs w:val="20"/>
+        </w:rPr>
+        <w:t xml:space="preserve">Toluen został sklasyfikowany w grupie 3 (nie można zaklasyfikować jako rakotwórczy dla ludzi) przez Międzynarodową Agencję Badań nad Rakiem (IARC) – (IARC, 1999).</w:t>
+      </w:r>
+    </w:p>
+    <w:p>
+      <w:pPr>
+        <w:spacing w:after="80"/>
+      </w:pPr>
+      <w:r>
+        <w:rPr>
+          <w:rFonts w:ascii="Arial" w:cs="Arial" w:eastAsia="Arial" w:hAnsi="Arial"/>
+          <w:sz w:val="20"/>
+          <w:szCs w:val="20"/>
+        </w:rPr>
+        <w:t xml:space="preserve">Agencja Ochrony Środowiska USA (EPA) wskazuje, że dane są niewystarczające do oceny potencjału rakotwórczego.</w:t>
       </w:r>
     </w:p>
     <w:p>
@@ -4697,59 +4842,59 @@
           <w:sz w:val="20"/>
           <w:szCs w:val="20"/>
         </w:rPr>
-        <w:t xml:space="preserve">W oparciu o dostępne dane, kryteria klasyfikacji nie są spełnione (składniki o podejrzeniu takiego działania występują w stężeniach poniżej progów klasyfikacyjnych).</w:t>
-      </w:r>
-    </w:p>
-    <w:p>
-      <w:pPr>
-        <w:spacing w:after="80"/>
-      </w:pPr>
-      <w:r>
-        <w:rPr>
-          <w:rFonts w:ascii="Arial" w:cs="Arial" w:eastAsia="Arial" w:hAnsi="Arial"/>
-          <w:sz w:val="20"/>
-          <w:szCs w:val="20"/>
-        </w:rPr>
-        <w:t xml:space="preserve">Działanie toksyczne na narządy docelowe – narażenie jednorazowe (STOT SE):</w:t>
-      </w:r>
-    </w:p>
-    <w:p>
-      <w:pPr>
-        <w:spacing w:after="80"/>
-      </w:pPr>
-      <w:r>
-        <w:rPr>
-          <w:rFonts w:ascii="Arial" w:cs="Arial" w:eastAsia="Arial" w:hAnsi="Arial"/>
-          <w:sz w:val="20"/>
-          <w:szCs w:val="20"/>
-        </w:rPr>
-        <w:t xml:space="preserve">W oparciu o dostępne dane, kryteria klasyfikacji nie są spełnione.</w:t>
-      </w:r>
-    </w:p>
-    <w:p>
-      <w:pPr>
-        <w:spacing w:after="80"/>
-      </w:pPr>
-      <w:r>
-        <w:rPr>
-          <w:rFonts w:ascii="Arial" w:cs="Arial" w:eastAsia="Arial" w:hAnsi="Arial"/>
-          <w:sz w:val="20"/>
-          <w:szCs w:val="20"/>
-        </w:rPr>
-        <w:t xml:space="preserve">Działanie toksyczne na narządy docelowe – narażenie powtarzane (STOT RE):</w:t>
-      </w:r>
-    </w:p>
-    <w:p>
-      <w:pPr>
-        <w:spacing w:after="80"/>
-      </w:pPr>
-      <w:r>
-        <w:rPr>
-          <w:rFonts w:ascii="Arial" w:cs="Arial" w:eastAsia="Arial" w:hAnsi="Arial"/>
-          <w:sz w:val="20"/>
-          <w:szCs w:val="20"/>
-        </w:rPr>
-        <w:t xml:space="preserve">W oparciu o dostępne dane, kryteria klasyfikacji nie są spełnione.</w:t>
+        <w:t xml:space="preserve">Nie spełnia kryteriów klasyfikacji dla tej klasy zagrożenia.</w:t>
+      </w:r>
+    </w:p>
+    <w:p>
+      <w:pPr>
+        <w:spacing w:after="80"/>
+      </w:pPr>
+      <w:r>
+        <w:rPr>
+          <w:rFonts w:ascii="Arial" w:cs="Arial" w:eastAsia="Arial" w:hAnsi="Arial"/>
+          <w:sz w:val="20"/>
+          <w:szCs w:val="20"/>
+        </w:rPr>
+        <w:t xml:space="preserve">Działanie toksyczne na narządy docelowe – narażenie jednorazowe:</w:t>
+      </w:r>
+    </w:p>
+    <w:p>
+      <w:pPr>
+        <w:spacing w:after="80"/>
+      </w:pPr>
+      <w:r>
+        <w:rPr>
+          <w:rFonts w:ascii="Arial" w:cs="Arial" w:eastAsia="Arial" w:hAnsi="Arial"/>
+          <w:sz w:val="20"/>
+          <w:szCs w:val="20"/>
+        </w:rPr>
+        <w:t xml:space="preserve">Nie spełnia kryteriów klasyfikacji dla tej klasy zagrożenia.</w:t>
+      </w:r>
+    </w:p>
+    <w:p>
+      <w:pPr>
+        <w:spacing w:after="80"/>
+      </w:pPr>
+      <w:r>
+        <w:rPr>
+          <w:rFonts w:ascii="Arial" w:cs="Arial" w:eastAsia="Arial" w:hAnsi="Arial"/>
+          <w:sz w:val="20"/>
+          <w:szCs w:val="20"/>
+        </w:rPr>
+        <w:t xml:space="preserve">Działanie toksyczne na narządy docelowe – narażenie powtarzane:</w:t>
+      </w:r>
+    </w:p>
+    <w:p>
+      <w:pPr>
+        <w:spacing w:after="80"/>
+      </w:pPr>
+      <w:r>
+        <w:rPr>
+          <w:rFonts w:ascii="Arial" w:cs="Arial" w:eastAsia="Arial" w:hAnsi="Arial"/>
+          <w:sz w:val="20"/>
+          <w:szCs w:val="20"/>
+        </w:rPr>
+        <w:t xml:space="preserve">Nie spełnia kryteriów klasyfikacji dla tej klasy zagrożenia.</w:t>
       </w:r>
     </w:p>
     <w:p>
@@ -4775,7 +4920,7 @@
           <w:sz w:val="20"/>
           <w:szCs w:val="20"/>
         </w:rPr>
-        <w:t xml:space="preserve">W oparciu o dostępne dane, kryteria klasyfikacji nie są spełnione.</w:t>
+        <w:t xml:space="preserve">Nie spełnia kryteriów klasyfikacji dla tej klasy zagrożenia.</w:t>
       </w:r>
     </w:p>
     <w:p>
@@ -4795,58 +4940,15 @@
     </w:p>
     <w:p>
       <w:pPr>
-        <w:spacing w:after="100" w:before="200"/>
-      </w:pPr>
-      <w:r>
-        <w:rPr>
-          <w:rFonts w:ascii="Arial" w:cs="Arial" w:eastAsia="Arial" w:hAnsi="Arial"/>
-          <w:b/>
-          <w:bCs/>
-          <w:sz w:val="20"/>
-          <w:szCs w:val="20"/>
-        </w:rPr>
-        <w:t xml:space="preserve">11.2.1. Właściwości zaburzające funkcjonowanie układu hormonalnego:</w:t>
-      </w:r>
-    </w:p>
-    <w:p>
-      <w:pPr>
-        <w:spacing w:after="80"/>
-      </w:pPr>
-      <w:r>
-        <w:rPr>
-          <w:rFonts w:ascii="Arial" w:cs="Arial" w:eastAsia="Arial" w:hAnsi="Arial"/>
-          <w:sz w:val="20"/>
-          <w:szCs w:val="20"/>
-        </w:rPr>
-        <w:t xml:space="preserve">Na podstawie dostępnych danych mieszanina nie zawiera substancji wpisanych do wykazu ustanowionego zgodnie z art. 59 ust. 1 rozporządzenia REACH ze względu na właściwości zaburzające gospodarkę hormonalną ani substancji o właściwościach zaburzających gospodarkę hormonalną u ludzi w stężeniu równym lub większym niż 0,1 % zgodnie z kryteriami określonymi w rozporządzeniach (UE) 2017/2100 lub (UE) 2018/605.</w:t>
-      </w:r>
-    </w:p>
-    <w:p>
-      <w:pPr>
-        <w:spacing w:after="100" w:before="200"/>
-      </w:pPr>
-      <w:r>
-        <w:rPr>
-          <w:rFonts w:ascii="Arial" w:cs="Arial" w:eastAsia="Arial" w:hAnsi="Arial"/>
-          <w:b/>
-          <w:bCs/>
-          <w:sz w:val="20"/>
-          <w:szCs w:val="20"/>
-        </w:rPr>
-        <w:t xml:space="preserve">11.2.2. Inne informacje:</w:t>
-      </w:r>
-    </w:p>
-    <w:p>
-      <w:pPr>
-        <w:spacing w:after="80"/>
-      </w:pPr>
-      <w:r>
-        <w:rPr>
-          <w:rFonts w:ascii="Arial" w:cs="Arial" w:eastAsia="Arial" w:hAnsi="Arial"/>
-          <w:sz w:val="20"/>
-          <w:szCs w:val="20"/>
-        </w:rPr>
-        <w:t xml:space="preserve">Brak innych istotnych informacji.</w:t>
+        <w:spacing w:after="80"/>
+      </w:pPr>
+      <w:r>
+        <w:rPr>
+          <w:rFonts w:ascii="Arial" w:cs="Arial" w:eastAsia="Arial" w:hAnsi="Arial"/>
+          <w:sz w:val="20"/>
+          <w:szCs w:val="20"/>
+        </w:rPr>
+        <w:t xml:space="preserve">Na podstawie dostępnych danych produkt nie zawiera substancji wymienionych w głównych europejskich wykazach potencjalnych lub podejrzewanych substancji zaburzających funkcjonowanie układu hormonalnego pod kątem wpływu na zdrowie człowieka w stężeniu ≥ 0,1%.</w:t>
       </w:r>
     </w:p>
     <w:p>
@@ -7989,7 +8091,126 @@
           <w:sz w:val="20"/>
           <w:szCs w:val="20"/>
         </w:rPr>
-        <w:t xml:space="preserve">Niniejsza karta charakterystyki została opracowana i zaktualizowana zgodnie z wymogami Rozporządzenia Komisji (UE) 2020/878 z dnia 18 czerwca 2020 r. zmieniającego załącznik II do rozporządzenia (WE) nr 1907/2006 (REACH).</w:t>
+        <w:t xml:space="preserve">Niniejsza karta charakterystyki (wersja 2.0 PL) zastępuje wersję Wersja 1 (z dnia 01.09.2023).</w:t>
+      </w:r>
+    </w:p>
+    <w:p>
+      <w:pPr>
+        <w:spacing w:after="80"/>
+      </w:pPr>
+      <w:r>
+        <w:rPr>
+          <w:rFonts w:ascii="Arial" w:cs="Arial" w:eastAsia="Arial" w:hAnsi="Arial"/>
+          <w:sz w:val="20"/>
+          <w:szCs w:val="20"/>
+        </w:rPr>
+        <w:t xml:space="preserve">Aktualizacja została sporządzona i dostosowana zgodnie z wymogami Rozporządzenia Komisji (UE) 2020/878 z dnia 18 czerwca 2020 r. zmieniającego załącznik II do rozporządzenia (WE) nr 1907/2006 (REACH) oraz przepisami prawa Rzeczypospolitej Polskiej.</w:t>
+      </w:r>
+    </w:p>
+    <w:p>
+      <w:pPr>
+        <w:spacing w:after="80"/>
+      </w:pPr>
+      <w:r>
+        <w:rPr>
+          <w:rFonts w:ascii="Arial" w:cs="Arial" w:eastAsia="Arial" w:hAnsi="Arial"/>
+          <w:sz w:val="20"/>
+          <w:szCs w:val="20"/>
+        </w:rPr>
+        <w:t xml:space="preserve">Główne zmiany wprowadzone w bieżącej wersji obejmują:</w:t>
+      </w:r>
+    </w:p>
+    <w:p>
+      <w:pPr>
+        <w:spacing w:after="80"/>
+      </w:pPr>
+      <w:r>
+        <w:rPr>
+          <w:rFonts w:ascii="Arial" w:cs="Arial" w:eastAsia="Arial" w:hAnsi="Arial"/>
+          <w:sz w:val="20"/>
+          <w:szCs w:val="20"/>
+        </w:rPr>
+        <w:t xml:space="preserve">- Sekcja 1.3: Aktualizacja danych dostawcy karty w Rzeczypospolitej Polskiej na ITALLUX Sp. z o.o. (ul. Wesoła 16, 63-600 Kępno, www.prostozwloch.pl).</w:t>
+      </w:r>
+    </w:p>
+    <w:p>
+      <w:pPr>
+        <w:spacing w:after="80"/>
+      </w:pPr>
+      <w:r>
+        <w:rPr>
+          <w:rFonts w:ascii="Arial" w:cs="Arial" w:eastAsia="Arial" w:hAnsi="Arial"/>
+          <w:sz w:val="20"/>
+          <w:szCs w:val="20"/>
+        </w:rPr>
+        <w:t xml:space="preserve">- Sekcja 8.1: Weryfikacja i implementacja krajowych norm higienicznych w środowisku pracy (NDS, NDSCh) na podstawie Rozporządzenia MRPiPS (Dz.U. 2018 poz. 1286 z późn. zm.).</w:t>
+      </w:r>
+    </w:p>
+    <w:p>
+      <w:pPr>
+        <w:spacing w:after="80"/>
+      </w:pPr>
+      <w:r>
+        <w:rPr>
+          <w:rFonts w:ascii="Arial" w:cs="Arial" w:eastAsia="Arial" w:hAnsi="Arial"/>
+          <w:sz w:val="20"/>
+          <w:szCs w:val="20"/>
+        </w:rPr>
+        <w:t xml:space="preserve">- Sekcja 11.2 i 12.6: Wdrożenie obligatoryjnych podsekcji dotyczących właściwości zaburzających funkcjonowanie układu hormonalnego.</w:t>
+      </w:r>
+    </w:p>
+    <w:p>
+      <w:pPr>
+        <w:spacing w:after="80"/>
+      </w:pPr>
+      <w:r>
+        <w:rPr>
+          <w:rFonts w:ascii="Arial" w:cs="Arial" w:eastAsia="Arial" w:hAnsi="Arial"/>
+          <w:sz w:val="20"/>
+          <w:szCs w:val="20"/>
+        </w:rPr>
+        <w:t xml:space="preserve">- Sekcja 13: Aktualizacja klasyfikacji i 6-cyfrowych kodów odpadów zgodnie z ustawą o odpadach i Dz.U. 2020 poz. 10.</w:t>
+      </w:r>
+    </w:p>
+    <w:p>
+      <w:pPr>
+        <w:spacing w:after="80"/>
+      </w:pPr>
+      <w:r>
+        <w:rPr>
+          <w:rFonts w:ascii="Arial" w:cs="Arial" w:eastAsia="Arial" w:hAnsi="Arial"/>
+          <w:sz w:val="20"/>
+          <w:szCs w:val="20"/>
+        </w:rPr>
+        <w:t xml:space="preserve">- Sekcja 14: Weryfikacja i zharmonizowanie warunków przewozu zgodnie z Umową ADR.</w:t>
+      </w:r>
+    </w:p>
+    <w:p>
+      <w:pPr>
+        <w:spacing w:after="80" w:before="150"/>
+      </w:pPr>
+      <w:r>
+        <w:rPr>
+          <w:rFonts w:ascii="Arial" w:cs="Arial" w:eastAsia="Arial" w:hAnsi="Arial"/>
+          <w:b/>
+          <w:bCs/>
+          <w:sz w:val="20"/>
+          <w:szCs w:val="20"/>
+        </w:rPr>
+        <w:t xml:space="preserve">Klauzula prawna i ochrona praw autorskich:</w:t>
+      </w:r>
+    </w:p>
+    <w:p>
+      <w:pPr>
+        <w:spacing w:after="80"/>
+      </w:pPr>
+      <w:r>
+        <w:rPr>
+          <w:rFonts w:ascii="Arial" w:cs="Arial" w:eastAsia="Arial" w:hAnsi="Arial"/>
+          <w:sz w:val="20"/>
+          <w:szCs w:val="20"/>
+        </w:rPr>
+        <w:t xml:space="preserve">Niniejsze autorskie opracowanie tłumaczenia, formatowania oraz adaptacji regulacyjnej do prawa polskiego stanowi własność intelektualną firmy ITALLUX Sp. z o.o. Kopiowanie i wykorzystywanie całości lub fragmentów w celach komercyjnych przez podmioty trzecie bez uprzedniej zgody właściciela jest zabronione. Dozwolone jest wykorzystanie dokumentu przez odbiorców w łańcuchu dostaw do celów bezpieczeństwa pracy i ochrony zdrowia.</w:t>
       </w:r>
     </w:p>
     <w:p>
@@ -8062,17 +8283,36 @@
 <w:ftr xmlns:wpc="http://schemas.microsoft.com/office/word/2010/wordprocessingCanvas" xmlns:mc="http://schemas.openxmlformats.org/markup-compatibility/2006" xmlns:o="urn:schemas-microsoft-com:office:office" xmlns:r="http://schemas.openxmlformats.org/officeDocument/2006/relationships" xmlns:m="http://schemas.openxmlformats.org/officeDocument/2006/math" xmlns:v="urn:schemas-microsoft-com:vml" xmlns:wp14="http://schemas.microsoft.com/office/word/2010/wordprocessingDrawing" xmlns:wp="http://schemas.openxmlformats.org/drawingml/2006/wordprocessingDrawing" xmlns:w10="urn:schemas-microsoft-com:office:word" xmlns:w="http://schemas.openxmlformats.org/wordprocessingml/2006/main" xmlns:w14="http://schemas.microsoft.com/office/word/2010/wordml" xmlns:w15="http://schemas.microsoft.com/office/word/2012/wordml" xmlns:wpg="http://schemas.microsoft.com/office/word/2010/wordprocessingGroup" xmlns:wpi="http://schemas.microsoft.com/office/word/2010/wordprocessingInk" xmlns:wne="http://schemas.microsoft.com/office/word/2006/wordml" xmlns:wps="http://schemas.microsoft.com/office/word/2010/wordprocessingShape">
   <w:p>
     <w:pPr>
+      <w:pBdr>
+        <w:top w:color="E5E7EB" w:sz="4" w:space="4"/>
+      </w:pBdr>
+      <w:spacing w:before="120"/>
       <w:jc w:val="right"/>
     </w:pPr>
     <w:r>
       <w:rPr>
         <w:rFonts w:ascii="Arial" w:cs="Arial" w:eastAsia="Arial" w:hAnsi="Arial"/>
+        <w:color w:val="555555"/>
+        <w:sz w:val="16"/>
+        <w:szCs w:val="16"/>
+      </w:rPr>
+      <w:t xml:space="preserve">Dystrybutor: ITALLUX Sp. z o.o. (www.prostozwloch.pl) | </w:t>
+    </w:r>
+    <w:r>
+      <w:rPr>
+        <w:rFonts w:ascii="Arial" w:cs="Arial" w:eastAsia="Arial" w:hAnsi="Arial"/>
+        <w:color w:val="555555"/>
+        <w:sz w:val="16"/>
+        <w:szCs w:val="16"/>
       </w:rPr>
       <w:t xml:space="preserve">Strona </w:t>
     </w:r>
     <w:r>
       <w:rPr>
         <w:rFonts w:ascii="Arial" w:cs="Arial" w:eastAsia="Arial" w:hAnsi="Arial"/>
+        <w:color w:val="555555"/>
+        <w:sz w:val="16"/>
+        <w:szCs w:val="16"/>
       </w:rPr>
       <w:fldChar w:fldCharType="begin"/>
       <w:instrText xml:space="preserve">PAGE</w:instrText>
@@ -8082,12 +8322,18 @@
     <w:r>
       <w:rPr>
         <w:rFonts w:ascii="Arial" w:cs="Arial" w:eastAsia="Arial" w:hAnsi="Arial"/>
+        <w:color w:val="555555"/>
+        <w:sz w:val="16"/>
+        <w:szCs w:val="16"/>
       </w:rPr>
       <w:t xml:space="preserve"> z </w:t>
     </w:r>
     <w:r>
       <w:rPr>
         <w:rFonts w:ascii="Arial" w:cs="Arial" w:eastAsia="Arial" w:hAnsi="Arial"/>
+        <w:color w:val="555555"/>
+        <w:sz w:val="16"/>
+        <w:szCs w:val="16"/>
       </w:rPr>
       <w:fldChar w:fldCharType="begin"/>
       <w:instrText xml:space="preserve">NUMPAGES</w:instrText>
@@ -8139,13 +8385,20 @@
 <w:hdr xmlns:wpc="http://schemas.microsoft.com/office/word/2010/wordprocessingCanvas" xmlns:mc="http://schemas.openxmlformats.org/markup-compatibility/2006" xmlns:o="urn:schemas-microsoft-com:office:office" xmlns:r="http://schemas.openxmlformats.org/officeDocument/2006/relationships" xmlns:m="http://schemas.openxmlformats.org/officeDocument/2006/math" xmlns:v="urn:schemas-microsoft-com:vml" xmlns:wp14="http://schemas.microsoft.com/office/word/2010/wordprocessingDrawing" xmlns:wp="http://schemas.openxmlformats.org/drawingml/2006/wordprocessingDrawing" xmlns:w10="urn:schemas-microsoft-com:office:word" xmlns:w="http://schemas.openxmlformats.org/wordprocessingml/2006/main" xmlns:w14="http://schemas.microsoft.com/office/word/2010/wordml" xmlns:w15="http://schemas.microsoft.com/office/word/2012/wordml" xmlns:wpg="http://schemas.microsoft.com/office/word/2010/wordprocessingGroup" xmlns:wpi="http://schemas.microsoft.com/office/word/2010/wordprocessingInk" xmlns:wne="http://schemas.microsoft.com/office/word/2006/wordml" xmlns:wps="http://schemas.microsoft.com/office/word/2010/wordprocessingShape" xmlns:cx="http://schemas.microsoft.com/office/drawing/2014/chartex" xmlns:cx1="http://schemas.microsoft.com/office/drawing/2015/9/8/chartex" xmlns:cx2="http://schemas.microsoft.com/office/drawing/2015/10/21/chartex" xmlns:cx3="http://schemas.microsoft.com/office/drawing/2016/5/9/chartex" xmlns:cx4="http://schemas.microsoft.com/office/drawing/2016/5/10/chartex" xmlns:cx5="http://schemas.microsoft.com/office/drawing/2016/5/11/chartex" xmlns:cx6="http://schemas.microsoft.com/office/drawing/2016/5/12/chartex" xmlns:cx7="http://schemas.microsoft.com/office/drawing/2016/5/13/chartex" xmlns:cx8="http://schemas.microsoft.com/office/drawing/2016/5/14/chartex" xmlns:w16cid="http://schemas.microsoft.com/office/word/2016/wordml/cid" xmlns:w16se="http://schemas.microsoft.com/office/word/2015/wordml/symex">
   <w:p>
     <w:pPr>
+      <w:pBdr>
+        <w:bottom w:color="E5E7EB" w:sz="4" w:space="4"/>
+      </w:pBdr>
+      <w:spacing w:after="120"/>
       <w:jc w:val="right"/>
     </w:pPr>
     <w:r>
       <w:rPr>
         <w:rFonts w:ascii="Arial" w:cs="Arial" w:eastAsia="Arial" w:hAnsi="Arial"/>
+        <w:color w:val="555555"/>
+        <w:sz w:val="16"/>
+        <w:szCs w:val="16"/>
       </w:rPr>
-      <w:t xml:space="preserve">SDS | SWEET HOME - PROFUMATORE AMBIENTE ORCHIDEA E VANIGLIA V2</w:t>
+      <w:t xml:space="preserve">KARTA CHARAKTERYSTYKI | SWEET HOME - PROFUMATORE AMBIENTE ORCHIDEA E VANIGLIA V2 | Wersja: 2.0 / PL</w:t>
     </w:r>
   </w:p>
 </w:hdr>

</xml_diff>

<commit_message>
fix(sds): refine replaced revision formula with manufacturer date and remove website from docx footer
</commit_message>
<xml_diff>
--- a/docs/SDS/Karta_Charakterystyki_8034055535448_SDS_ORCHIDEA_E_VANIGLIA_V2_PL.docx
+++ b/docs/SDS/Karta_Charakterystyki_8034055535448_SDS_ORCHIDEA_E_VANIGLIA_V2_PL.docx
@@ -5222,6 +5222,21 @@
     </w:p>
     <w:p>
       <w:pPr>
+        <w:spacing w:after="100" w:before="200"/>
+      </w:pPr>
+      <w:r>
+        <w:rPr>
+          <w:rFonts w:ascii="Arial" w:cs="Arial" w:eastAsia="Arial" w:hAnsi="Arial"/>
+          <w:b/>
+          <w:bCs/>
+          <w:sz w:val="20"/>
+          <w:szCs w:val="20"/>
+        </w:rPr>
+        <w:t xml:space="preserve">11.1. Informacje na temat klas zagrożenia zdefiniowanych w rozporządzeniu (WE) nr 1272/2008</w:t>
+      </w:r>
+    </w:p>
+    <w:p>
+      <w:pPr>
         <w:spacing w:after="80"/>
       </w:pPr>
       <w:r>
@@ -5243,7 +5258,709 @@
           <w:sz w:val="20"/>
           <w:szCs w:val="20"/>
         </w:rPr>
-        <w:t xml:space="preserve">W związku z tym w celu oceny skutków toksykologicznych narażenia na produkt należy wziąć pod uwagę stężenia poszczególnych substancji niebezpiecznych wskazanych w sekcji 3.</w:t>
+        <w:t xml:space="preserve">W związku z tym należy wziąć pod uwagę stężenia poszczególnych substancji niebezpiecznych wskazanych w sekcji 3, aby ocenić skutki toksykologiczne narażenia na produkt.</w:t>
+      </w:r>
+    </w:p>
+    <w:p>
+      <w:pPr>
+        <w:spacing w:after="80"/>
+      </w:pPr>
+      <w:r>
+        <w:rPr>
+          <w:rFonts w:ascii="Arial" w:cs="Arial" w:eastAsia="Arial" w:hAnsi="Arial"/>
+          <w:sz w:val="20"/>
+          <w:szCs w:val="20"/>
+        </w:rPr>
+        <w:t xml:space="preserve">Metabolizm, toksykokinetyka, mechanizm działania i inne informacje:</w:t>
+      </w:r>
+    </w:p>
+    <w:p>
+      <w:pPr>
+        <w:spacing w:after="80"/>
+      </w:pPr>
+      <w:r>
+        <w:rPr>
+          <w:rFonts w:ascii="Arial" w:cs="Arial" w:eastAsia="Arial" w:hAnsi="Arial"/>
+          <w:sz w:val="20"/>
+          <w:szCs w:val="20"/>
+        </w:rPr>
+        <w:t xml:space="preserve">Brak dostępnych informacji.</w:t>
+      </w:r>
+    </w:p>
+    <w:p>
+      <w:pPr>
+        <w:spacing w:after="80"/>
+      </w:pPr>
+      <w:r>
+        <w:rPr>
+          <w:rFonts w:ascii="Arial" w:cs="Arial" w:eastAsia="Arial" w:hAnsi="Arial"/>
+          <w:sz w:val="20"/>
+          <w:szCs w:val="20"/>
+        </w:rPr>
+        <w:t xml:space="preserve">Informacje dotyczące prawdopodobnych dróg narażenia:</w:t>
+      </w:r>
+    </w:p>
+    <w:p>
+      <w:pPr>
+        <w:spacing w:after="80"/>
+      </w:pPr>
+      <w:r>
+        <w:rPr>
+          <w:rFonts w:ascii="Arial" w:cs="Arial" w:eastAsia="Arial" w:hAnsi="Arial"/>
+          <w:sz w:val="20"/>
+          <w:szCs w:val="20"/>
+        </w:rPr>
+        <w:t xml:space="preserve">Toluen:</w:t>
+      </w:r>
+    </w:p>
+    <w:p>
+      <w:pPr>
+        <w:spacing w:after="80"/>
+      </w:pPr>
+      <w:r>
+        <w:rPr>
+          <w:rFonts w:ascii="Arial" w:cs="Arial" w:eastAsia="Arial" w:hAnsi="Arial"/>
+          <w:sz w:val="20"/>
+          <w:szCs w:val="20"/>
+        </w:rPr>
+        <w:t xml:space="preserve">PRACOWNICY: przez drogi oddechowe (inhalacyjnie); kontakt ze skórą.</w:t>
+      </w:r>
+    </w:p>
+    <w:p>
+      <w:pPr>
+        <w:spacing w:after="80"/>
+      </w:pPr>
+      <w:r>
+        <w:rPr>
+          <w:rFonts w:ascii="Arial" w:cs="Arial" w:eastAsia="Arial" w:hAnsi="Arial"/>
+          <w:sz w:val="20"/>
+          <w:szCs w:val="20"/>
+        </w:rPr>
+        <w:t xml:space="preserve">KONSUMENCI: spożycie skażonej żywności lub wody; przez drogi oddechowe (inhalacyjnie) z powietrza otoczenia; kontakt ze skórą z produktami zawierającymi substancję.</w:t>
+      </w:r>
+    </w:p>
+    <w:p>
+      <w:pPr>
+        <w:spacing w:after="80"/>
+      </w:pPr>
+      <w:r>
+        <w:rPr>
+          <w:rFonts w:ascii="Arial" w:cs="Arial" w:eastAsia="Arial" w:hAnsi="Arial"/>
+          <w:sz w:val="20"/>
+          <w:szCs w:val="20"/>
+        </w:rPr>
+        <w:t xml:space="preserve">Opóźnione, bezpośrednie oraz przewlekłe skutki krótko- i długotrwałego narażenia:</w:t>
+      </w:r>
+    </w:p>
+    <w:p>
+      <w:pPr>
+        <w:spacing w:after="80"/>
+      </w:pPr>
+      <w:r>
+        <w:rPr>
+          <w:rFonts w:ascii="Arial" w:cs="Arial" w:eastAsia="Arial" w:hAnsi="Arial"/>
+          <w:sz w:val="20"/>
+          <w:szCs w:val="20"/>
+        </w:rPr>
+        <w:t xml:space="preserve">Toluen:</w:t>
+      </w:r>
+    </w:p>
+    <w:p>
+      <w:pPr>
+        <w:spacing w:after="80"/>
+      </w:pPr>
+      <w:r>
+        <w:rPr>
+          <w:rFonts w:ascii="Arial" w:cs="Arial" w:eastAsia="Arial" w:hAnsi="Arial"/>
+          <w:sz w:val="20"/>
+          <w:szCs w:val="20"/>
+        </w:rPr>
+        <w:t xml:space="preserve">Działanie toksyczne na ośrodkowy i obwodowy układ nerwowy z encefalopatią i polineuropatią; działa drażniąco na skórę, spojówki, rogówkę i układ oddechowy.</w:t>
+      </w:r>
+    </w:p>
+    <w:p>
+      <w:pPr>
+        <w:spacing w:after="80"/>
+      </w:pPr>
+      <w:r>
+        <w:rPr>
+          <w:rFonts w:ascii="Arial" w:cs="Arial" w:eastAsia="Arial" w:hAnsi="Arial"/>
+          <w:sz w:val="20"/>
+          <w:szCs w:val="20"/>
+        </w:rPr>
+        <w:t xml:space="preserve">Skutki wzajemnego oddziaływania:</w:t>
+      </w:r>
+    </w:p>
+    <w:p>
+      <w:pPr>
+        <w:spacing w:after="80"/>
+      </w:pPr>
+      <w:r>
+        <w:rPr>
+          <w:rFonts w:ascii="Arial" w:cs="Arial" w:eastAsia="Arial" w:hAnsi="Arial"/>
+          <w:sz w:val="20"/>
+          <w:szCs w:val="20"/>
+        </w:rPr>
+        <w:t xml:space="preserve">Toluen:</w:t>
+      </w:r>
+    </w:p>
+    <w:p>
+      <w:pPr>
+        <w:spacing w:after="80"/>
+      </w:pPr>
+      <w:r>
+        <w:rPr>
+          <w:rFonts w:ascii="Arial" w:cs="Arial" w:eastAsia="Arial" w:hAnsi="Arial"/>
+          <w:sz w:val="20"/>
+          <w:szCs w:val="20"/>
+        </w:rPr>
+        <w:t xml:space="preserve">Niektóre leki i inne produkty przemysłowe mogą zakłócać metabolizm toluenu.</w:t>
+      </w:r>
+    </w:p>
+    <w:p>
+      <w:pPr>
+        <w:spacing w:after="80"/>
+      </w:pPr>
+      <w:r>
+        <w:rPr>
+          <w:rFonts w:ascii="Arial" w:cs="Arial" w:eastAsia="Arial" w:hAnsi="Arial"/>
+          <w:sz w:val="20"/>
+          <w:szCs w:val="20"/>
+        </w:rPr>
+        <w:t xml:space="preserve">Toksyczność ostra:</w:t>
+      </w:r>
+    </w:p>
+    <w:p>
+      <w:pPr>
+        <w:spacing w:after="80"/>
+      </w:pPr>
+      <w:r>
+        <w:rPr>
+          <w:rFonts w:ascii="Arial" w:cs="Arial" w:eastAsia="Arial" w:hAnsi="Arial"/>
+          <w:sz w:val="20"/>
+          <w:szCs w:val="20"/>
+        </w:rPr>
+        <w:t xml:space="preserve">ATE (przez drogi oddechowe - inhalacyjnie) mieszaniny: Nie sklasyfikowano (brak istotnych składników)</w:t>
+      </w:r>
+    </w:p>
+    <w:p>
+      <w:pPr>
+        <w:spacing w:after="80"/>
+      </w:pPr>
+      <w:r>
+        <w:rPr>
+          <w:rFonts w:ascii="Arial" w:cs="Arial" w:eastAsia="Arial" w:hAnsi="Arial"/>
+          <w:sz w:val="20"/>
+          <w:szCs w:val="20"/>
+        </w:rPr>
+        <w:t xml:space="preserve">ATE (droga pokarmowa - doustnie) mieszaniny: Nie sklasyfikowano (brak istotnych składników)</w:t>
+      </w:r>
+    </w:p>
+    <w:p>
+      <w:pPr>
+        <w:spacing w:after="80"/>
+      </w:pPr>
+      <w:r>
+        <w:rPr>
+          <w:rFonts w:ascii="Arial" w:cs="Arial" w:eastAsia="Arial" w:hAnsi="Arial"/>
+          <w:sz w:val="20"/>
+          <w:szCs w:val="20"/>
+        </w:rPr>
+        <w:t xml:space="preserve">ATE (na skórę) mieszaniny: Nie sklasyfikowano (brak istotnych składników)</w:t>
+      </w:r>
+    </w:p>
+    <w:p>
+      <w:pPr>
+        <w:spacing w:after="80"/>
+      </w:pPr>
+      <w:r>
+        <w:rPr>
+          <w:rFonts w:ascii="Arial" w:cs="Arial" w:eastAsia="Arial" w:hAnsi="Arial"/>
+          <w:sz w:val="20"/>
+          <w:szCs w:val="20"/>
+        </w:rPr>
+        <w:t xml:space="preserve">Etanol:</w:t>
+      </w:r>
+    </w:p>
+    <w:p>
+      <w:pPr>
+        <w:spacing w:after="80"/>
+      </w:pPr>
+      <w:r>
+        <w:rPr>
+          <w:rFonts w:ascii="Arial" w:cs="Arial" w:eastAsia="Arial" w:hAnsi="Arial"/>
+          <w:sz w:val="20"/>
+          <w:szCs w:val="20"/>
+        </w:rPr>
+        <w:t xml:space="preserve">LD50 (droga pokarmowa): &gt; 5000 mg/kg (szczur)</w:t>
+      </w:r>
+    </w:p>
+    <w:p>
+      <w:pPr>
+        <w:spacing w:after="80"/>
+      </w:pPr>
+      <w:r>
+        <w:rPr>
+          <w:rFonts w:ascii="Arial" w:cs="Arial" w:eastAsia="Arial" w:hAnsi="Arial"/>
+          <w:sz w:val="20"/>
+          <w:szCs w:val="20"/>
+        </w:rPr>
+        <w:t xml:space="preserve">LC50 (przez drogi oddechowe, pary): &gt; 50 mg/l/4h (szczur)</w:t>
+      </w:r>
+    </w:p>
+    <w:p>
+      <w:pPr>
+        <w:spacing w:after="80"/>
+      </w:pPr>
+      <w:r>
+        <w:rPr>
+          <w:rFonts w:ascii="Arial" w:cs="Arial" w:eastAsia="Arial" w:hAnsi="Arial"/>
+          <w:sz w:val="20"/>
+          <w:szCs w:val="20"/>
+        </w:rPr>
+        <w:t xml:space="preserve">Aldehyd anyżowy:</w:t>
+      </w:r>
+    </w:p>
+    <w:p>
+      <w:pPr>
+        <w:spacing w:after="80"/>
+      </w:pPr>
+      <w:r>
+        <w:rPr>
+          <w:rFonts w:ascii="Arial" w:cs="Arial" w:eastAsia="Arial" w:hAnsi="Arial"/>
+          <w:sz w:val="20"/>
+          <w:szCs w:val="20"/>
+        </w:rPr>
+        <w:t xml:space="preserve">LD50 (na skórę): &gt; 5000 mg/kg (królik)</w:t>
+      </w:r>
+    </w:p>
+    <w:p>
+      <w:pPr>
+        <w:spacing w:after="80"/>
+      </w:pPr>
+      <w:r>
+        <w:rPr>
+          <w:rFonts w:ascii="Arial" w:cs="Arial" w:eastAsia="Arial" w:hAnsi="Arial"/>
+          <w:sz w:val="20"/>
+          <w:szCs w:val="20"/>
+        </w:rPr>
+        <w:t xml:space="preserve">LD50 (droga pokarmowa): 3210 mg/kg (szczur)</w:t>
+      </w:r>
+    </w:p>
+    <w:p>
+      <w:pPr>
+        <w:spacing w:after="80"/>
+      </w:pPr>
+      <w:r>
+        <w:rPr>
+          <w:rFonts w:ascii="Arial" w:cs="Arial" w:eastAsia="Arial" w:hAnsi="Arial"/>
+          <w:sz w:val="20"/>
+          <w:szCs w:val="20"/>
+        </w:rPr>
+        <w:t xml:space="preserve">LC50 (przez drogi oddechowe, pary): 0,32 mg/l/7h (szczur)</w:t>
+      </w:r>
+    </w:p>
+    <w:p>
+      <w:pPr>
+        <w:spacing w:after="80"/>
+      </w:pPr>
+      <w:r>
+        <w:rPr>
+          <w:rFonts w:ascii="Arial" w:cs="Arial" w:eastAsia="Arial" w:hAnsi="Arial"/>
+          <w:sz w:val="20"/>
+          <w:szCs w:val="20"/>
+        </w:rPr>
+        <w:t xml:space="preserve">Kumaryna:</w:t>
+      </w:r>
+    </w:p>
+    <w:p>
+      <w:pPr>
+        <w:spacing w:after="80"/>
+      </w:pPr>
+      <w:r>
+        <w:rPr>
+          <w:rFonts w:ascii="Arial" w:cs="Arial" w:eastAsia="Arial" w:hAnsi="Arial"/>
+          <w:sz w:val="20"/>
+          <w:szCs w:val="20"/>
+        </w:rPr>
+        <w:t xml:space="preserve">LD50 (na skórę): 293 mg/kg mc (szczur)</w:t>
+      </w:r>
+    </w:p>
+    <w:p>
+      <w:pPr>
+        <w:spacing w:after="80"/>
+      </w:pPr>
+      <w:r>
+        <w:rPr>
+          <w:rFonts w:ascii="Arial" w:cs="Arial" w:eastAsia="Arial" w:hAnsi="Arial"/>
+          <w:sz w:val="20"/>
+          <w:szCs w:val="20"/>
+        </w:rPr>
+        <w:t xml:space="preserve">LD50 (droga pokarmowa): 290 mg/kg mc (szczur)</w:t>
+      </w:r>
+    </w:p>
+    <w:p>
+      <w:pPr>
+        <w:spacing w:after="80"/>
+      </w:pPr>
+      <w:r>
+        <w:rPr>
+          <w:rFonts w:ascii="Arial" w:cs="Arial" w:eastAsia="Arial" w:hAnsi="Arial"/>
+          <w:sz w:val="20"/>
+          <w:szCs w:val="20"/>
+        </w:rPr>
+        <w:t xml:space="preserve">LC50 (przez drogi oddechowe, pyły/mgły): 293 mg/m³ (szczur)</w:t>
+      </w:r>
+    </w:p>
+    <w:p>
+      <w:pPr>
+        <w:spacing w:after="80"/>
+      </w:pPr>
+      <w:r>
+        <w:rPr>
+          <w:rFonts w:ascii="Arial" w:cs="Arial" w:eastAsia="Arial" w:hAnsi="Arial"/>
+          <w:sz w:val="20"/>
+          <w:szCs w:val="20"/>
+        </w:rPr>
+        <w:t xml:space="preserve">2,6-di-tert-butylo-4-metylofenol (BHT):</w:t>
+      </w:r>
+    </w:p>
+    <w:p>
+      <w:pPr>
+        <w:spacing w:after="80"/>
+      </w:pPr>
+      <w:r>
+        <w:rPr>
+          <w:rFonts w:ascii="Arial" w:cs="Arial" w:eastAsia="Arial" w:hAnsi="Arial"/>
+          <w:sz w:val="20"/>
+          <w:szCs w:val="20"/>
+        </w:rPr>
+        <w:t xml:space="preserve">LD50 (na skórę): &gt; 2000 mg/kg (szczur)</w:t>
+      </w:r>
+    </w:p>
+    <w:p>
+      <w:pPr>
+        <w:spacing w:after="80"/>
+      </w:pPr>
+      <w:r>
+        <w:rPr>
+          <w:rFonts w:ascii="Arial" w:cs="Arial" w:eastAsia="Arial" w:hAnsi="Arial"/>
+          <w:sz w:val="20"/>
+          <w:szCs w:val="20"/>
+        </w:rPr>
+        <w:t xml:space="preserve">LD50 (droga pokarmowa): 2930 mg/kg (szczur)</w:t>
+      </w:r>
+    </w:p>
+    <w:p>
+      <w:pPr>
+        <w:spacing w:after="80"/>
+      </w:pPr>
+      <w:r>
+        <w:rPr>
+          <w:rFonts w:ascii="Arial" w:cs="Arial" w:eastAsia="Arial" w:hAnsi="Arial"/>
+          <w:sz w:val="20"/>
+          <w:szCs w:val="20"/>
+        </w:rPr>
+        <w:t xml:space="preserve">Toluen:</w:t>
+      </w:r>
+    </w:p>
+    <w:p>
+      <w:pPr>
+        <w:spacing w:after="80"/>
+      </w:pPr>
+      <w:r>
+        <w:rPr>
+          <w:rFonts w:ascii="Arial" w:cs="Arial" w:eastAsia="Arial" w:hAnsi="Arial"/>
+          <w:sz w:val="20"/>
+          <w:szCs w:val="20"/>
+        </w:rPr>
+        <w:t xml:space="preserve">LD50 (na skórę): &gt; 5000 mg/kg mc (królik)</w:t>
+      </w:r>
+    </w:p>
+    <w:p>
+      <w:pPr>
+        <w:spacing w:after="80"/>
+      </w:pPr>
+      <w:r>
+        <w:rPr>
+          <w:rFonts w:ascii="Arial" w:cs="Arial" w:eastAsia="Arial" w:hAnsi="Arial"/>
+          <w:sz w:val="20"/>
+          <w:szCs w:val="20"/>
+        </w:rPr>
+        <w:t xml:space="preserve">LD50 (droga pokarmowa): &gt; 5000 mg/kg mc (szczur)</w:t>
+      </w:r>
+    </w:p>
+    <w:p>
+      <w:pPr>
+        <w:spacing w:after="80"/>
+      </w:pPr>
+      <w:r>
+        <w:rPr>
+          <w:rFonts w:ascii="Arial" w:cs="Arial" w:eastAsia="Arial" w:hAnsi="Arial"/>
+          <w:sz w:val="20"/>
+          <w:szCs w:val="20"/>
+        </w:rPr>
+        <w:t xml:space="preserve">LC50 (przez drogi oddechowe, pary): 100 ppm (człowiek)</w:t>
+      </w:r>
+    </w:p>
+    <w:p>
+      <w:pPr>
+        <w:spacing w:after="80"/>
+      </w:pPr>
+      <w:r>
+        <w:rPr>
+          <w:rFonts w:ascii="Arial" w:cs="Arial" w:eastAsia="Arial" w:hAnsi="Arial"/>
+          <w:sz w:val="20"/>
+          <w:szCs w:val="20"/>
+        </w:rPr>
+        <w:t xml:space="preserve">Działanie żrące/drażniące na skórę:</w:t>
+      </w:r>
+    </w:p>
+    <w:p>
+      <w:pPr>
+        <w:spacing w:after="80"/>
+      </w:pPr>
+      <w:r>
+        <w:rPr>
+          <w:rFonts w:ascii="Arial" w:cs="Arial" w:eastAsia="Arial" w:hAnsi="Arial"/>
+          <w:sz w:val="20"/>
+          <w:szCs w:val="20"/>
+        </w:rPr>
+        <w:t xml:space="preserve">W oparciu o dostępne dane nie spełnia kryteriów klasyfikacji.</w:t>
+      </w:r>
+    </w:p>
+    <w:p>
+      <w:pPr>
+        <w:spacing w:after="80"/>
+      </w:pPr>
+      <w:r>
+        <w:rPr>
+          <w:rFonts w:ascii="Arial" w:cs="Arial" w:eastAsia="Arial" w:hAnsi="Arial"/>
+          <w:sz w:val="20"/>
+          <w:szCs w:val="20"/>
+        </w:rPr>
+        <w:t xml:space="preserve">Poważne uszkodzenie oczu/działanie drażniące na oczy:</w:t>
+      </w:r>
+    </w:p>
+    <w:p>
+      <w:pPr>
+        <w:spacing w:after="80"/>
+      </w:pPr>
+      <w:r>
+        <w:rPr>
+          <w:rFonts w:ascii="Arial" w:cs="Arial" w:eastAsia="Arial" w:hAnsi="Arial"/>
+          <w:sz w:val="20"/>
+          <w:szCs w:val="20"/>
+        </w:rPr>
+        <w:t xml:space="preserve">Działa drażniąco na oczy.</w:t>
+      </w:r>
+    </w:p>
+    <w:p>
+      <w:pPr>
+        <w:spacing w:after="80"/>
+      </w:pPr>
+      <w:r>
+        <w:rPr>
+          <w:rFonts w:ascii="Arial" w:cs="Arial" w:eastAsia="Arial" w:hAnsi="Arial"/>
+          <w:sz w:val="20"/>
+          <w:szCs w:val="20"/>
+        </w:rPr>
+        <w:t xml:space="preserve">Działanie uczulające na drogi oddechowe lub skórę:</w:t>
+      </w:r>
+    </w:p>
+    <w:p>
+      <w:pPr>
+        <w:spacing w:after="80"/>
+      </w:pPr>
+      <w:r>
+        <w:rPr>
+          <w:rFonts w:ascii="Arial" w:cs="Arial" w:eastAsia="Arial" w:hAnsi="Arial"/>
+          <w:sz w:val="20"/>
+          <w:szCs w:val="20"/>
+        </w:rPr>
+        <w:t xml:space="preserve">Może powodować wystąpienie reakcji alergicznej skóry.</w:t>
+      </w:r>
+    </w:p>
+    <w:p>
+      <w:pPr>
+        <w:spacing w:after="80"/>
+      </w:pPr>
+      <w:r>
+        <w:rPr>
+          <w:rFonts w:ascii="Arial" w:cs="Arial" w:eastAsia="Arial" w:hAnsi="Arial"/>
+          <w:sz w:val="20"/>
+          <w:szCs w:val="20"/>
+        </w:rPr>
+        <w:t xml:space="preserve">Zawiera: kumarynę.</w:t>
+      </w:r>
+    </w:p>
+    <w:p>
+      <w:pPr>
+        <w:spacing w:after="80"/>
+      </w:pPr>
+      <w:r>
+        <w:rPr>
+          <w:rFonts w:ascii="Arial" w:cs="Arial" w:eastAsia="Arial" w:hAnsi="Arial"/>
+          <w:sz w:val="20"/>
+          <w:szCs w:val="20"/>
+        </w:rPr>
+        <w:t xml:space="preserve">Działanie mutagenne na komórki rozrodcze:</w:t>
+      </w:r>
+    </w:p>
+    <w:p>
+      <w:pPr>
+        <w:spacing w:after="80"/>
+      </w:pPr>
+      <w:r>
+        <w:rPr>
+          <w:rFonts w:ascii="Arial" w:cs="Arial" w:eastAsia="Arial" w:hAnsi="Arial"/>
+          <w:sz w:val="20"/>
+          <w:szCs w:val="20"/>
+        </w:rPr>
+        <w:t xml:space="preserve">W oparciu o dostępne dane nie spełnia kryteriów klasyfikacji.</w:t>
+      </w:r>
+    </w:p>
+    <w:p>
+      <w:pPr>
+        <w:spacing w:after="80"/>
+      </w:pPr>
+      <w:r>
+        <w:rPr>
+          <w:rFonts w:ascii="Arial" w:cs="Arial" w:eastAsia="Arial" w:hAnsi="Arial"/>
+          <w:sz w:val="20"/>
+          <w:szCs w:val="20"/>
+        </w:rPr>
+        <w:t xml:space="preserve">Rakotwórczość:</w:t>
+      </w:r>
+    </w:p>
+    <w:p>
+      <w:pPr>
+        <w:spacing w:after="80"/>
+      </w:pPr>
+      <w:r>
+        <w:rPr>
+          <w:rFonts w:ascii="Arial" w:cs="Arial" w:eastAsia="Arial" w:hAnsi="Arial"/>
+          <w:sz w:val="20"/>
+          <w:szCs w:val="20"/>
+        </w:rPr>
+        <w:t xml:space="preserve">W oparciu o dostępne dane nie spełnia kryteriów klasyfikacji.</w:t>
+      </w:r>
+    </w:p>
+    <w:p>
+      <w:pPr>
+        <w:spacing w:after="80"/>
+      </w:pPr>
+      <w:r>
+        <w:rPr>
+          <w:rFonts w:ascii="Arial" w:cs="Arial" w:eastAsia="Arial" w:hAnsi="Arial"/>
+          <w:sz w:val="20"/>
+          <w:szCs w:val="20"/>
+        </w:rPr>
+        <w:t xml:space="preserve">Toluen: Sklasyfikowany w grupie 3 (nie można zaklasyfikować jako rakotwórczy dla ludzi) przez Międzynarodową Agencję Badań nad Rakiem (IARC) – (IARC, 1999). Agencja Ochrony Środowiska USA (EPA) wskazuje, że dane są niewystarczające do oceny potencjału rakotwórczego.</w:t>
+      </w:r>
+    </w:p>
+    <w:p>
+      <w:pPr>
+        <w:spacing w:after="80"/>
+      </w:pPr>
+      <w:r>
+        <w:rPr>
+          <w:rFonts w:ascii="Arial" w:cs="Arial" w:eastAsia="Arial" w:hAnsi="Arial"/>
+          <w:sz w:val="20"/>
+          <w:szCs w:val="20"/>
+        </w:rPr>
+        <w:t xml:space="preserve">Szkodliwe działanie na rozrodczość:</w:t>
+      </w:r>
+    </w:p>
+    <w:p>
+      <w:pPr>
+        <w:spacing w:after="80"/>
+      </w:pPr>
+      <w:r>
+        <w:rPr>
+          <w:rFonts w:ascii="Arial" w:cs="Arial" w:eastAsia="Arial" w:hAnsi="Arial"/>
+          <w:sz w:val="20"/>
+          <w:szCs w:val="20"/>
+        </w:rPr>
+        <w:t xml:space="preserve">W oparciu o dostępne dane nie spełnia kryteriów klasyfikacji.</w:t>
+      </w:r>
+    </w:p>
+    <w:p>
+      <w:pPr>
+        <w:spacing w:after="80"/>
+      </w:pPr>
+      <w:r>
+        <w:rPr>
+          <w:rFonts w:ascii="Arial" w:cs="Arial" w:eastAsia="Arial" w:hAnsi="Arial"/>
+          <w:sz w:val="20"/>
+          <w:szCs w:val="20"/>
+        </w:rPr>
+        <w:t xml:space="preserve">Działanie toksyczne na narządy docelowe – narażenie jednorazowe:</w:t>
+      </w:r>
+    </w:p>
+    <w:p>
+      <w:pPr>
+        <w:spacing w:after="80"/>
+      </w:pPr>
+      <w:r>
+        <w:rPr>
+          <w:rFonts w:ascii="Arial" w:cs="Arial" w:eastAsia="Arial" w:hAnsi="Arial"/>
+          <w:sz w:val="20"/>
+          <w:szCs w:val="20"/>
+        </w:rPr>
+        <w:t xml:space="preserve">W oparciu o dostępne dane nie spełnia kryteriów klasyfikacji.</w:t>
+      </w:r>
+    </w:p>
+    <w:p>
+      <w:pPr>
+        <w:spacing w:after="80"/>
+      </w:pPr>
+      <w:r>
+        <w:rPr>
+          <w:rFonts w:ascii="Arial" w:cs="Arial" w:eastAsia="Arial" w:hAnsi="Arial"/>
+          <w:sz w:val="20"/>
+          <w:szCs w:val="20"/>
+        </w:rPr>
+        <w:t xml:space="preserve">Działanie toksyczne na narządy docelowe – narażenie powtarzane:</w:t>
+      </w:r>
+    </w:p>
+    <w:p>
+      <w:pPr>
+        <w:spacing w:after="80"/>
+      </w:pPr>
+      <w:r>
+        <w:rPr>
+          <w:rFonts w:ascii="Arial" w:cs="Arial" w:eastAsia="Arial" w:hAnsi="Arial"/>
+          <w:sz w:val="20"/>
+          <w:szCs w:val="20"/>
+        </w:rPr>
+        <w:t xml:space="preserve">W oparciu o dostępne dane nie spełnia kryteriów klasyfikacji.</w:t>
+      </w:r>
+    </w:p>
+    <w:p>
+      <w:pPr>
+        <w:spacing w:after="80"/>
+      </w:pPr>
+      <w:r>
+        <w:rPr>
+          <w:rFonts w:ascii="Arial" w:cs="Arial" w:eastAsia="Arial" w:hAnsi="Arial"/>
+          <w:sz w:val="20"/>
+          <w:szCs w:val="20"/>
+        </w:rPr>
+        <w:t xml:space="preserve">Zagrożenie spowodowane aspiracją:</w:t>
+      </w:r>
+    </w:p>
+    <w:p>
+      <w:pPr>
+        <w:spacing w:after="80"/>
+      </w:pPr>
+      <w:r>
+        <w:rPr>
+          <w:rFonts w:ascii="Arial" w:cs="Arial" w:eastAsia="Arial" w:hAnsi="Arial"/>
+          <w:sz w:val="20"/>
+          <w:szCs w:val="20"/>
+        </w:rPr>
+        <w:t xml:space="preserve">W oparciu o dostępne dane nie spełnia kryteriów klasyfikacji.</w:t>
       </w:r>
     </w:p>
     <w:p>
@@ -5258,706 +5975,7 @@
           <w:sz w:val="20"/>
           <w:szCs w:val="20"/>
         </w:rPr>
-        <w:t xml:space="preserve">11.1. Informacje na temat klas zagrożenia zdefiniowanych w rozporządzeniu (WE) nr 1272/2008</w:t>
-      </w:r>
-    </w:p>
-    <w:p>
-      <w:pPr>
-        <w:spacing w:after="80"/>
-      </w:pPr>
-      <w:r>
-        <w:rPr>
-          <w:rFonts w:ascii="Arial" w:cs="Arial" w:eastAsia="Arial" w:hAnsi="Arial"/>
-          <w:sz w:val="20"/>
-          <w:szCs w:val="20"/>
-        </w:rPr>
-        <w:t xml:space="preserve">Metabolizm, toksykokinetyka, mechanizm działania i inne informacje:</w:t>
-      </w:r>
-    </w:p>
-    <w:p>
-      <w:pPr>
-        <w:spacing w:after="80"/>
-      </w:pPr>
-      <w:r>
-        <w:rPr>
-          <w:rFonts w:ascii="Arial" w:cs="Arial" w:eastAsia="Arial" w:hAnsi="Arial"/>
-          <w:sz w:val="20"/>
-          <w:szCs w:val="20"/>
-        </w:rPr>
-        <w:t xml:space="preserve">Brak dostępnych danych.</w:t>
-      </w:r>
-    </w:p>
-    <w:p>
-      <w:pPr>
-        <w:spacing w:after="80"/>
-      </w:pPr>
-      <w:r>
-        <w:rPr>
-          <w:rFonts w:ascii="Arial" w:cs="Arial" w:eastAsia="Arial" w:hAnsi="Arial"/>
-          <w:sz w:val="20"/>
-          <w:szCs w:val="20"/>
-        </w:rPr>
-        <w:t xml:space="preserve">Informacje dotyczące prawdopodobnych dróg narażenia:</w:t>
-      </w:r>
-    </w:p>
-    <w:p>
-      <w:pPr>
-        <w:spacing w:after="80"/>
-      </w:pPr>
-      <w:r>
-        <w:rPr>
-          <w:rFonts w:ascii="Arial" w:cs="Arial" w:eastAsia="Arial" w:hAnsi="Arial"/>
-          <w:sz w:val="20"/>
-          <w:szCs w:val="20"/>
-        </w:rPr>
-        <w:t xml:space="preserve">Toluen:</w:t>
-      </w:r>
-    </w:p>
-    <w:p>
-      <w:pPr>
-        <w:spacing w:after="80"/>
-      </w:pPr>
-      <w:r>
-        <w:rPr>
-          <w:rFonts w:ascii="Arial" w:cs="Arial" w:eastAsia="Arial" w:hAnsi="Arial"/>
-          <w:sz w:val="20"/>
-          <w:szCs w:val="20"/>
-        </w:rPr>
-        <w:t xml:space="preserve">PRACOWNICY: przez drogi oddechowe (inhalacyjnie); kontakt ze skórą.</w:t>
-      </w:r>
-    </w:p>
-    <w:p>
-      <w:pPr>
-        <w:spacing w:after="80"/>
-      </w:pPr>
-      <w:r>
-        <w:rPr>
-          <w:rFonts w:ascii="Arial" w:cs="Arial" w:eastAsia="Arial" w:hAnsi="Arial"/>
-          <w:sz w:val="20"/>
-          <w:szCs w:val="20"/>
-        </w:rPr>
-        <w:t xml:space="preserve">LUDNOŚĆ: spożycie skażonej żywności lub wody; wdychanie powietrza atmosferycznego; kontakt ze skórą z produktami zawierającymi substancję.</w:t>
-      </w:r>
-    </w:p>
-    <w:p>
-      <w:pPr>
-        <w:spacing w:after="80"/>
-      </w:pPr>
-      <w:r>
-        <w:rPr>
-          <w:rFonts w:ascii="Arial" w:cs="Arial" w:eastAsia="Arial" w:hAnsi="Arial"/>
-          <w:sz w:val="20"/>
-          <w:szCs w:val="20"/>
-        </w:rPr>
-        <w:t xml:space="preserve">Opóźnione, bezpośrednie oraz przewlekłe skutki krótko- i długotrwałego narażenia:</w:t>
-      </w:r>
-    </w:p>
-    <w:p>
-      <w:pPr>
-        <w:spacing w:after="80"/>
-      </w:pPr>
-      <w:r>
-        <w:rPr>
-          <w:rFonts w:ascii="Arial" w:cs="Arial" w:eastAsia="Arial" w:hAnsi="Arial"/>
-          <w:sz w:val="20"/>
-          <w:szCs w:val="20"/>
-        </w:rPr>
-        <w:t xml:space="preserve">Toluen:</w:t>
-      </w:r>
-    </w:p>
-    <w:p>
-      <w:pPr>
-        <w:spacing w:after="80"/>
-      </w:pPr>
-      <w:r>
-        <w:rPr>
-          <w:rFonts w:ascii="Arial" w:cs="Arial" w:eastAsia="Arial" w:hAnsi="Arial"/>
-          <w:sz w:val="20"/>
-          <w:szCs w:val="20"/>
-        </w:rPr>
-        <w:t xml:space="preserve">Działanie toksyczne na ośrodkowy i obwodowy układ nerwowy z encefalopatią i polineuropatią; działa drażniąco na skórę, spojówki, rogówkę i układ oddechowy.</w:t>
-      </w:r>
-    </w:p>
-    <w:p>
-      <w:pPr>
-        <w:spacing w:after="80"/>
-      </w:pPr>
-      <w:r>
-        <w:rPr>
-          <w:rFonts w:ascii="Arial" w:cs="Arial" w:eastAsia="Arial" w:hAnsi="Arial"/>
-          <w:sz w:val="20"/>
-          <w:szCs w:val="20"/>
-        </w:rPr>
-        <w:t xml:space="preserve">Skutki wzajemnego oddziaływania:</w:t>
-      </w:r>
-    </w:p>
-    <w:p>
-      <w:pPr>
-        <w:spacing w:after="80"/>
-      </w:pPr>
-      <w:r>
-        <w:rPr>
-          <w:rFonts w:ascii="Arial" w:cs="Arial" w:eastAsia="Arial" w:hAnsi="Arial"/>
-          <w:sz w:val="20"/>
-          <w:szCs w:val="20"/>
-        </w:rPr>
-        <w:t xml:space="preserve">Toluen:</w:t>
-      </w:r>
-    </w:p>
-    <w:p>
-      <w:pPr>
-        <w:spacing w:after="80"/>
-      </w:pPr>
-      <w:r>
-        <w:rPr>
-          <w:rFonts w:ascii="Arial" w:cs="Arial" w:eastAsia="Arial" w:hAnsi="Arial"/>
-          <w:sz w:val="20"/>
-          <w:szCs w:val="20"/>
-        </w:rPr>
-        <w:t xml:space="preserve">Niektóre leki i inne produkty przemysłowe mogą zakłócać metabolizm toluenu.</w:t>
-      </w:r>
-    </w:p>
-    <w:p>
-      <w:pPr>
-        <w:spacing w:after="80"/>
-      </w:pPr>
-      <w:r>
-        <w:rPr>
-          <w:rFonts w:ascii="Arial" w:cs="Arial" w:eastAsia="Arial" w:hAnsi="Arial"/>
-          <w:sz w:val="20"/>
-          <w:szCs w:val="20"/>
-        </w:rPr>
-        <w:t xml:space="preserve">Toksyczność ostra:</w:t>
-      </w:r>
-    </w:p>
-    <w:p>
-      <w:pPr>
-        <w:spacing w:after="80"/>
-      </w:pPr>
-      <w:r>
-        <w:rPr>
-          <w:rFonts w:ascii="Arial" w:cs="Arial" w:eastAsia="Arial" w:hAnsi="Arial"/>
-          <w:sz w:val="20"/>
-          <w:szCs w:val="20"/>
-        </w:rPr>
-        <w:t xml:space="preserve">ATE (inhalacja) mieszaniny: Nie sklasyfikowano (brak istotnego składnika)</w:t>
-      </w:r>
-    </w:p>
-    <w:p>
-      <w:pPr>
-        <w:spacing w:after="80"/>
-      </w:pPr>
-      <w:r>
-        <w:rPr>
-          <w:rFonts w:ascii="Arial" w:cs="Arial" w:eastAsia="Arial" w:hAnsi="Arial"/>
-          <w:sz w:val="20"/>
-          <w:szCs w:val="20"/>
-        </w:rPr>
-        <w:t xml:space="preserve">ATE (droga pokarmowa) mieszaniny: Nie sklasyfikowano (brak istotnego składnika)</w:t>
-      </w:r>
-    </w:p>
-    <w:p>
-      <w:pPr>
-        <w:spacing w:after="80"/>
-      </w:pPr>
-      <w:r>
-        <w:rPr>
-          <w:rFonts w:ascii="Arial" w:cs="Arial" w:eastAsia="Arial" w:hAnsi="Arial"/>
-          <w:sz w:val="20"/>
-          <w:szCs w:val="20"/>
-        </w:rPr>
-        <w:t xml:space="preserve">ATE (na skórę) mieszaniny: Nie sklasyfikowano (brak istotnego składnika)</w:t>
-      </w:r>
-    </w:p>
-    <w:p>
-      <w:pPr>
-        <w:spacing w:after="80" w:before="150"/>
-      </w:pPr>
-      <w:r>
-        <w:rPr>
-          <w:rFonts w:ascii="Arial" w:cs="Arial" w:eastAsia="Arial" w:hAnsi="Arial"/>
-          <w:b/>
-          <w:bCs/>
-          <w:sz w:val="20"/>
-          <w:szCs w:val="20"/>
-        </w:rPr>
-        <w:t xml:space="preserve">etanol (CAS: 64-17-5):</w:t>
-      </w:r>
-    </w:p>
-    <w:p>
-      <w:pPr>
-        <w:spacing w:after="80"/>
-      </w:pPr>
-      <w:r>
-        <w:rPr>
-          <w:rFonts w:ascii="Arial" w:cs="Arial" w:eastAsia="Arial" w:hAnsi="Arial"/>
-          <w:sz w:val="20"/>
-          <w:szCs w:val="20"/>
-        </w:rPr>
-        <w:t xml:space="preserve">LD50 (droga pokarmowa, szczur): &gt; 5000 mg/kg</w:t>
-      </w:r>
-    </w:p>
-    <w:p>
-      <w:pPr>
-        <w:spacing w:after="80"/>
-      </w:pPr>
-      <w:r>
-        <w:rPr>
-          <w:rFonts w:ascii="Arial" w:cs="Arial" w:eastAsia="Arial" w:hAnsi="Arial"/>
-          <w:sz w:val="20"/>
-          <w:szCs w:val="20"/>
-        </w:rPr>
-        <w:t xml:space="preserve">LC50 (inhalacja, pary, szczur): &gt; 50 mg/l/4h</w:t>
-      </w:r>
-    </w:p>
-    <w:p>
-      <w:pPr>
-        <w:spacing w:after="80" w:before="150"/>
-      </w:pPr>
-      <w:r>
-        <w:rPr>
-          <w:rFonts w:ascii="Arial" w:cs="Arial" w:eastAsia="Arial" w:hAnsi="Arial"/>
-          <w:b/>
-          <w:bCs/>
-          <w:sz w:val="20"/>
-          <w:szCs w:val="20"/>
-        </w:rPr>
-        <w:t xml:space="preserve">aldehyd anyżowy (CAS: 123-11-5):</w:t>
-      </w:r>
-    </w:p>
-    <w:p>
-      <w:pPr>
-        <w:spacing w:after="80"/>
-      </w:pPr>
-      <w:r>
-        <w:rPr>
-          <w:rFonts w:ascii="Arial" w:cs="Arial" w:eastAsia="Arial" w:hAnsi="Arial"/>
-          <w:sz w:val="20"/>
-          <w:szCs w:val="20"/>
-        </w:rPr>
-        <w:t xml:space="preserve">LD50 (na skórę, królik): &gt; 5000 mg/kg</w:t>
-      </w:r>
-    </w:p>
-    <w:p>
-      <w:pPr>
-        <w:spacing w:after="80"/>
-      </w:pPr>
-      <w:r>
-        <w:rPr>
-          <w:rFonts w:ascii="Arial" w:cs="Arial" w:eastAsia="Arial" w:hAnsi="Arial"/>
-          <w:sz w:val="20"/>
-          <w:szCs w:val="20"/>
-        </w:rPr>
-        <w:t xml:space="preserve">LD50 (droga pokarmowa, szczur): 3210 mg/kg</w:t>
-      </w:r>
-    </w:p>
-    <w:p>
-      <w:pPr>
-        <w:spacing w:after="80"/>
-      </w:pPr>
-      <w:r>
-        <w:rPr>
-          <w:rFonts w:ascii="Arial" w:cs="Arial" w:eastAsia="Arial" w:hAnsi="Arial"/>
-          <w:sz w:val="20"/>
-          <w:szCs w:val="20"/>
-        </w:rPr>
-        <w:t xml:space="preserve">LC50 (inhalacja, pary, szczur): 0,32 mg/l/7h</w:t>
-      </w:r>
-    </w:p>
-    <w:p>
-      <w:pPr>
-        <w:spacing w:after="80" w:before="150"/>
-      </w:pPr>
-      <w:r>
-        <w:rPr>
-          <w:rFonts w:ascii="Arial" w:cs="Arial" w:eastAsia="Arial" w:hAnsi="Arial"/>
-          <w:b/>
-          <w:bCs/>
-          <w:sz w:val="20"/>
-          <w:szCs w:val="20"/>
-        </w:rPr>
-        <w:t xml:space="preserve">kumaryna (CAS: 91-64-5):</w:t>
-      </w:r>
-    </w:p>
-    <w:p>
-      <w:pPr>
-        <w:spacing w:after="80"/>
-      </w:pPr>
-      <w:r>
-        <w:rPr>
-          <w:rFonts w:ascii="Arial" w:cs="Arial" w:eastAsia="Arial" w:hAnsi="Arial"/>
-          <w:sz w:val="20"/>
-          <w:szCs w:val="20"/>
-        </w:rPr>
-        <w:t xml:space="preserve">LD50 (na skórę, szczur): 293 mg/kg mc.</w:t>
-      </w:r>
-    </w:p>
-    <w:p>
-      <w:pPr>
-        <w:spacing w:after="80"/>
-      </w:pPr>
-      <w:r>
-        <w:rPr>
-          <w:rFonts w:ascii="Arial" w:cs="Arial" w:eastAsia="Arial" w:hAnsi="Arial"/>
-          <w:sz w:val="20"/>
-          <w:szCs w:val="20"/>
-        </w:rPr>
-        <w:t xml:space="preserve">LD50 (droga pokarmowa, szczur): 290 mg/kg mc.</w:t>
-      </w:r>
-    </w:p>
-    <w:p>
-      <w:pPr>
-        <w:spacing w:after="80"/>
-      </w:pPr>
-      <w:r>
-        <w:rPr>
-          <w:rFonts w:ascii="Arial" w:cs="Arial" w:eastAsia="Arial" w:hAnsi="Arial"/>
-          <w:sz w:val="20"/>
-          <w:szCs w:val="20"/>
-        </w:rPr>
-        <w:t xml:space="preserve">LC50 (inhalacja, pyły/mgły, szczur): 293 mg/kg</w:t>
-      </w:r>
-    </w:p>
-    <w:p>
-      <w:pPr>
-        <w:spacing w:after="80" w:before="150"/>
-      </w:pPr>
-      <w:r>
-        <w:rPr>
-          <w:rFonts w:ascii="Arial" w:cs="Arial" w:eastAsia="Arial" w:hAnsi="Arial"/>
-          <w:b/>
-          <w:bCs/>
-          <w:sz w:val="20"/>
-          <w:szCs w:val="20"/>
-        </w:rPr>
-        <w:t xml:space="preserve">2,6-di-tert-butylo-4-metylofenol (BHT) (CAS: 128-37-0):</w:t>
-      </w:r>
-    </w:p>
-    <w:p>
-      <w:pPr>
-        <w:spacing w:after="80"/>
-      </w:pPr>
-      <w:r>
-        <w:rPr>
-          <w:rFonts w:ascii="Arial" w:cs="Arial" w:eastAsia="Arial" w:hAnsi="Arial"/>
-          <w:sz w:val="20"/>
-          <w:szCs w:val="20"/>
-        </w:rPr>
-        <w:t xml:space="preserve">LD50 (na skórę, szczur): &gt; 2000 mg/kg</w:t>
-      </w:r>
-    </w:p>
-    <w:p>
-      <w:pPr>
-        <w:spacing w:after="80"/>
-      </w:pPr>
-      <w:r>
-        <w:rPr>
-          <w:rFonts w:ascii="Arial" w:cs="Arial" w:eastAsia="Arial" w:hAnsi="Arial"/>
-          <w:sz w:val="20"/>
-          <w:szCs w:val="20"/>
-        </w:rPr>
-        <w:t xml:space="preserve">LD50 (droga pokarmowa, szczur): 2930 mg/kg</w:t>
-      </w:r>
-    </w:p>
-    <w:p>
-      <w:pPr>
-        <w:spacing w:after="80" w:before="150"/>
-      </w:pPr>
-      <w:r>
-        <w:rPr>
-          <w:rFonts w:ascii="Arial" w:cs="Arial" w:eastAsia="Arial" w:hAnsi="Arial"/>
-          <w:b/>
-          <w:bCs/>
-          <w:sz w:val="20"/>
-          <w:szCs w:val="20"/>
-        </w:rPr>
-        <w:t xml:space="preserve">toluen (CAS: 108-88-3):</w:t>
-      </w:r>
-    </w:p>
-    <w:p>
-      <w:pPr>
-        <w:spacing w:after="80"/>
-      </w:pPr>
-      <w:r>
-        <w:rPr>
-          <w:rFonts w:ascii="Arial" w:cs="Arial" w:eastAsia="Arial" w:hAnsi="Arial"/>
-          <w:sz w:val="20"/>
-          <w:szCs w:val="20"/>
-        </w:rPr>
-        <w:t xml:space="preserve">LD50 (na skórę, królik): &gt; 5000 mg/kg mc.</w:t>
-      </w:r>
-    </w:p>
-    <w:p>
-      <w:pPr>
-        <w:spacing w:after="80"/>
-      </w:pPr>
-      <w:r>
-        <w:rPr>
-          <w:rFonts w:ascii="Arial" w:cs="Arial" w:eastAsia="Arial" w:hAnsi="Arial"/>
-          <w:sz w:val="20"/>
-          <w:szCs w:val="20"/>
-        </w:rPr>
-        <w:t xml:space="preserve">LD50 (droga pokarmowa, szczur): &gt; 5000 mg/kg mc.</w:t>
-      </w:r>
-    </w:p>
-    <w:p>
-      <w:pPr>
-        <w:spacing w:after="80"/>
-      </w:pPr>
-      <w:r>
-        <w:rPr>
-          <w:rFonts w:ascii="Arial" w:cs="Arial" w:eastAsia="Arial" w:hAnsi="Arial"/>
-          <w:sz w:val="20"/>
-          <w:szCs w:val="20"/>
-        </w:rPr>
-        <w:t xml:space="preserve">LC50 (inhalacja, pary, człowiek): 100 ppm</w:t>
-      </w:r>
-    </w:p>
-    <w:p>
-      <w:pPr>
-        <w:spacing w:after="80"/>
-      </w:pPr>
-      <w:r>
-        <w:rPr>
-          <w:rFonts w:ascii="Arial" w:cs="Arial" w:eastAsia="Arial" w:hAnsi="Arial"/>
-          <w:sz w:val="20"/>
-          <w:szCs w:val="20"/>
-        </w:rPr>
-        <w:t xml:space="preserve">Działanie żrące/drażniące na skórę:</w:t>
-      </w:r>
-    </w:p>
-    <w:p>
-      <w:pPr>
-        <w:spacing w:after="80"/>
-      </w:pPr>
-      <w:r>
-        <w:rPr>
-          <w:rFonts w:ascii="Arial" w:cs="Arial" w:eastAsia="Arial" w:hAnsi="Arial"/>
-          <w:sz w:val="20"/>
-          <w:szCs w:val="20"/>
-        </w:rPr>
-        <w:t xml:space="preserve">W oparciu o dostępne dane, kryteria klasyfikacji nie są spełnione.</w:t>
-      </w:r>
-    </w:p>
-    <w:p>
-      <w:pPr>
-        <w:spacing w:after="80"/>
-      </w:pPr>
-      <w:r>
-        <w:rPr>
-          <w:rFonts w:ascii="Arial" w:cs="Arial" w:eastAsia="Arial" w:hAnsi="Arial"/>
-          <w:sz w:val="20"/>
-          <w:szCs w:val="20"/>
-        </w:rPr>
-        <w:t xml:space="preserve">Poważne uszkodzenie oczu/działanie drażniące na oczy:</w:t>
-      </w:r>
-    </w:p>
-    <w:p>
-      <w:pPr>
-        <w:spacing w:after="80"/>
-      </w:pPr>
-      <w:r>
-        <w:rPr>
-          <w:rFonts w:ascii="Arial" w:cs="Arial" w:eastAsia="Arial" w:hAnsi="Arial"/>
-          <w:sz w:val="20"/>
-          <w:szCs w:val="20"/>
-        </w:rPr>
-        <w:t xml:space="preserve">Działa drażniąco na oczy (Eye Irrit. 2, H319).</w:t>
-      </w:r>
-    </w:p>
-    <w:p>
-      <w:pPr>
-        <w:spacing w:after="80"/>
-      </w:pPr>
-      <w:r>
-        <w:rPr>
-          <w:rFonts w:ascii="Arial" w:cs="Arial" w:eastAsia="Arial" w:hAnsi="Arial"/>
-          <w:sz w:val="20"/>
-          <w:szCs w:val="20"/>
-        </w:rPr>
-        <w:t xml:space="preserve">Działanie uczulające na drogi oddechowe lub skórę:</w:t>
-      </w:r>
-    </w:p>
-    <w:p>
-      <w:pPr>
-        <w:spacing w:after="80"/>
-      </w:pPr>
-      <w:r>
-        <w:rPr>
-          <w:rFonts w:ascii="Arial" w:cs="Arial" w:eastAsia="Arial" w:hAnsi="Arial"/>
-          <w:sz w:val="20"/>
-          <w:szCs w:val="20"/>
-        </w:rPr>
-        <w:t xml:space="preserve">Może wywoływać reakcję alergiczną skóry (EUH208). Zawiera: kumarynę (2H-chromen-2-on).</w:t>
-      </w:r>
-    </w:p>
-    <w:p>
-      <w:pPr>
-        <w:spacing w:after="80"/>
-      </w:pPr>
-      <w:r>
-        <w:rPr>
-          <w:rFonts w:ascii="Arial" w:cs="Arial" w:eastAsia="Arial" w:hAnsi="Arial"/>
-          <w:sz w:val="20"/>
-          <w:szCs w:val="20"/>
-        </w:rPr>
-        <w:t xml:space="preserve">Działanie mutagenne na komórki rozrodcze:</w:t>
-      </w:r>
-    </w:p>
-    <w:p>
-      <w:pPr>
-        <w:spacing w:after="80"/>
-      </w:pPr>
-      <w:r>
-        <w:rPr>
-          <w:rFonts w:ascii="Arial" w:cs="Arial" w:eastAsia="Arial" w:hAnsi="Arial"/>
-          <w:sz w:val="20"/>
-          <w:szCs w:val="20"/>
-        </w:rPr>
-        <w:t xml:space="preserve">W oparciu o dostępne dane, kryteria klasyfikacji nie są spełnione.</w:t>
-      </w:r>
-    </w:p>
-    <w:p>
-      <w:pPr>
-        <w:spacing w:after="80"/>
-      </w:pPr>
-      <w:r>
-        <w:rPr>
-          <w:rFonts w:ascii="Arial" w:cs="Arial" w:eastAsia="Arial" w:hAnsi="Arial"/>
-          <w:sz w:val="20"/>
-          <w:szCs w:val="20"/>
-        </w:rPr>
-        <w:t xml:space="preserve">Rakotwórczość:</w:t>
-      </w:r>
-    </w:p>
-    <w:p>
-      <w:pPr>
-        <w:spacing w:after="80"/>
-      </w:pPr>
-      <w:r>
-        <w:rPr>
-          <w:rFonts w:ascii="Arial" w:cs="Arial" w:eastAsia="Arial" w:hAnsi="Arial"/>
-          <w:sz w:val="20"/>
-          <w:szCs w:val="20"/>
-        </w:rPr>
-        <w:t xml:space="preserve">W oparciu o dostępne dane, kryteria klasyfikacji nie są spełnione.</w:t>
-      </w:r>
-    </w:p>
-    <w:p>
-      <w:pPr>
-        <w:spacing w:after="80"/>
-      </w:pPr>
-      <w:r>
-        <w:rPr>
-          <w:rFonts w:ascii="Arial" w:cs="Arial" w:eastAsia="Arial" w:hAnsi="Arial"/>
-          <w:sz w:val="20"/>
-          <w:szCs w:val="20"/>
-        </w:rPr>
-        <w:t xml:space="preserve">Toluen: Zaklasyfikowany do Grupy 3 (nie może być sklasyfikowany jako rakotwórczy dla ludzi) przez Międzynarodową Agencję Badań nad Rakiem (IARC, 1999). Agencja Ochrony Środowiska USA (EPA) wskazuje, że dane są niewystarczające do oceny potencjału rakotwórczego.</w:t>
-      </w:r>
-    </w:p>
-    <w:p>
-      <w:pPr>
-        <w:spacing w:after="80"/>
-      </w:pPr>
-      <w:r>
-        <w:rPr>
-          <w:rFonts w:ascii="Arial" w:cs="Arial" w:eastAsia="Arial" w:hAnsi="Arial"/>
-          <w:sz w:val="20"/>
-          <w:szCs w:val="20"/>
-        </w:rPr>
-        <w:t xml:space="preserve">Szkodliwe działanie na rozrodczość:</w:t>
-      </w:r>
-    </w:p>
-    <w:p>
-      <w:pPr>
-        <w:spacing w:after="80"/>
-      </w:pPr>
-      <w:r>
-        <w:rPr>
-          <w:rFonts w:ascii="Arial" w:cs="Arial" w:eastAsia="Arial" w:hAnsi="Arial"/>
-          <w:sz w:val="20"/>
-          <w:szCs w:val="20"/>
-        </w:rPr>
-        <w:t xml:space="preserve">W oparciu o dostępne dane, kryteria klasyfikacji nie są spełnione.</w:t>
-      </w:r>
-    </w:p>
-    <w:p>
-      <w:pPr>
-        <w:spacing w:after="80"/>
-      </w:pPr>
-      <w:r>
-        <w:rPr>
-          <w:rFonts w:ascii="Arial" w:cs="Arial" w:eastAsia="Arial" w:hAnsi="Arial"/>
-          <w:sz w:val="20"/>
-          <w:szCs w:val="20"/>
-        </w:rPr>
-        <w:t xml:space="preserve">Działanie toksyczne na narządy docelowe – narażenie jednorazowe:</w:t>
-      </w:r>
-    </w:p>
-    <w:p>
-      <w:pPr>
-        <w:spacing w:after="80"/>
-      </w:pPr>
-      <w:r>
-        <w:rPr>
-          <w:rFonts w:ascii="Arial" w:cs="Arial" w:eastAsia="Arial" w:hAnsi="Arial"/>
-          <w:sz w:val="20"/>
-          <w:szCs w:val="20"/>
-        </w:rPr>
-        <w:t xml:space="preserve">W oparciu o dostępne dane, kryteria klasyfikacji nie są spełnione.</w:t>
-      </w:r>
-    </w:p>
-    <w:p>
-      <w:pPr>
-        <w:spacing w:after="80"/>
-      </w:pPr>
-      <w:r>
-        <w:rPr>
-          <w:rFonts w:ascii="Arial" w:cs="Arial" w:eastAsia="Arial" w:hAnsi="Arial"/>
-          <w:sz w:val="20"/>
-          <w:szCs w:val="20"/>
-        </w:rPr>
-        <w:t xml:space="preserve">Działanie toksyczne na narządy docelowe – narażenie powtarzane:</w:t>
-      </w:r>
-    </w:p>
-    <w:p>
-      <w:pPr>
-        <w:spacing w:after="80"/>
-      </w:pPr>
-      <w:r>
-        <w:rPr>
-          <w:rFonts w:ascii="Arial" w:cs="Arial" w:eastAsia="Arial" w:hAnsi="Arial"/>
-          <w:sz w:val="20"/>
-          <w:szCs w:val="20"/>
-        </w:rPr>
-        <w:t xml:space="preserve">W oparciu o dostępne dane, kryteria klasyfikacji nie są spełnione.</w:t>
-      </w:r>
-    </w:p>
-    <w:p>
-      <w:pPr>
-        <w:spacing w:after="80"/>
-      </w:pPr>
-      <w:r>
-        <w:rPr>
-          <w:rFonts w:ascii="Arial" w:cs="Arial" w:eastAsia="Arial" w:hAnsi="Arial"/>
-          <w:sz w:val="20"/>
-          <w:szCs w:val="20"/>
-        </w:rPr>
-        <w:t xml:space="preserve">Zagrożenie spowodowane aspiracją:</w:t>
-      </w:r>
-    </w:p>
-    <w:p>
-      <w:pPr>
-        <w:spacing w:after="80"/>
-      </w:pPr>
-      <w:r>
-        <w:rPr>
-          <w:rFonts w:ascii="Arial" w:cs="Arial" w:eastAsia="Arial" w:hAnsi="Arial"/>
-          <w:sz w:val="20"/>
-          <w:szCs w:val="20"/>
-        </w:rPr>
-        <w:t xml:space="preserve">W oparciu o dostępne dane, kryteria klasyfikacji nie są spełnione.</w:t>
+        <w:t xml:space="preserve">11.2. Informacje o innych zagrożeniach</w:t>
       </w:r>
     </w:p>
     <w:p>
@@ -5972,20 +5990,48 @@
           <w:sz w:val="20"/>
           <w:szCs w:val="20"/>
         </w:rPr>
-        <w:t xml:space="preserve">11.2. Informacje o innych zagrożeniach</w:t>
-      </w:r>
-    </w:p>
-    <w:p>
-      <w:pPr>
-        <w:spacing w:after="80"/>
-      </w:pPr>
-      <w:r>
-        <w:rPr>
-          <w:rFonts w:ascii="Arial" w:cs="Arial" w:eastAsia="Arial" w:hAnsi="Arial"/>
-          <w:sz w:val="20"/>
-          <w:szCs w:val="20"/>
-        </w:rPr>
-        <w:t xml:space="preserve">Na podstawie dostępnych danych produkt nie zawiera substancji wymienionych w głównych europejskich wykazach potencjalnych lub podejrzewanych substancji zaburzających funkcjonowanie układu hormonalnego w odniesieniu do zdrowia ludzkiego w stężeniu ≥ 0,1 %.</w:t>
+        <w:t xml:space="preserve">11.2.1. Właściwości zaburzające funkcjonowanie układu hormonalnego:</w:t>
+      </w:r>
+    </w:p>
+    <w:p>
+      <w:pPr>
+        <w:spacing w:after="80"/>
+      </w:pPr>
+      <w:r>
+        <w:rPr>
+          <w:rFonts w:ascii="Arial" w:cs="Arial" w:eastAsia="Arial" w:hAnsi="Arial"/>
+          <w:sz w:val="20"/>
+          <w:szCs w:val="20"/>
+        </w:rPr>
+        <w:t xml:space="preserve">W oparciu o dostępne dane produkt nie zawiera substancji wymienionych w głównych europejskich wykazach potencjalnych lub podejrzewanych substancji zaburzających funkcjonowanie układu hormonalnego o wpływie na zdrowie człowieka w stężeniu ≥ 0,1% wag.</w:t>
+      </w:r>
+    </w:p>
+    <w:p>
+      <w:pPr>
+        <w:spacing w:after="100" w:before="200"/>
+      </w:pPr>
+      <w:r>
+        <w:rPr>
+          <w:rFonts w:ascii="Arial" w:cs="Arial" w:eastAsia="Arial" w:hAnsi="Arial"/>
+          <w:b/>
+          <w:bCs/>
+          <w:sz w:val="20"/>
+          <w:szCs w:val="20"/>
+        </w:rPr>
+        <w:t xml:space="preserve">11.2.2. Inne informacje:</w:t>
+      </w:r>
+    </w:p>
+    <w:p>
+      <w:pPr>
+        <w:spacing w:after="80"/>
+      </w:pPr>
+      <w:r>
+        <w:rPr>
+          <w:rFonts w:ascii="Arial" w:cs="Arial" w:eastAsia="Arial" w:hAnsi="Arial"/>
+          <w:sz w:val="20"/>
+          <w:szCs w:val="20"/>
+        </w:rPr>
+        <w:t xml:space="preserve">Brak dalszych istotnych informacji.</w:t>
       </w:r>
     </w:p>
     <w:p>
@@ -9540,7 +9586,7 @@
           <w:sz w:val="20"/>
           <w:szCs w:val="20"/>
         </w:rPr>
-        <w:t xml:space="preserve">Niniejsza karta charakterystyki (wersja 1.0 PL) zastępuje wersję Brak (wydanie pierwsze w języku polskim, opracowane na podstawie SDS producenta – rewizja nr 2 z dnia 14.02.2025 r.).</w:t>
+        <w:t xml:space="preserve">Niniejsza karta charakterystyki (wersja 1.0 PL) stanowi wydanie pierwsze w języku polskim, opracowane na podstawie karty charakterystyki SDS producenta.</w:t>
       </w:r>
     </w:p>
     <w:p>
@@ -9795,7 +9841,7 @@
         <w:sz w:val="16"/>
         <w:szCs w:val="16"/>
       </w:rPr>
-      <w:t xml:space="preserve">Dystrybutor: ITALLUX Sp. z o.o. (www.prostozwloch.pl) | </w:t>
+      <w:t xml:space="preserve">Dystrybutor: ITALLUX Sp. z o.o. | </w:t>
     </w:r>
     <w:r>
       <w:rPr>

</xml_diff>

<commit_message>
fix(sds): enforce universal polish header metrics, eliminate hardcoded fallbacks and separate polish creation date from manufacturer date
</commit_message>
<xml_diff>
--- a/docs/SDS/Karta_Charakterystyki_8034055535448_SDS_ORCHIDEA_E_VANIGLIA_V2_PL.docx
+++ b/docs/SDS/Karta_Charakterystyki_8034055535448_SDS_ORCHIDEA_E_VANIGLIA_V2_PL.docx
@@ -83,7 +83,7 @@
                 <w:sz w:val="18"/>
                 <w:szCs w:val="18"/>
               </w:rPr>
-              <w:t xml:space="preserve">01.09.2023</w:t>
+              <w:t xml:space="preserve">15.09.2026</w:t>
             </w:r>
           </w:p>
           <w:p>
@@ -103,7 +103,7 @@
                 <w:sz w:val="18"/>
                 <w:szCs w:val="18"/>
               </w:rPr>
-              <w:t xml:space="preserve">14.02.2025</w:t>
+              <w:t xml:space="preserve">Nie dotyczy</w:t>
             </w:r>
           </w:p>
         </w:tc>
@@ -5272,20 +5272,20 @@
           <w:sz w:val="20"/>
           <w:szCs w:val="20"/>
         </w:rPr>
-        <w:t xml:space="preserve">Wobec braku danych doświadczalnych dla samego produktu, zagrożenia dla zdrowia oceniono na podstawie właściwości substancji w nim zawartych, stosując kryteria określone w odpowiednich przepisach dotyczących klasyfikacji.</w:t>
-      </w:r>
-    </w:p>
-    <w:p>
-      <w:pPr>
-        <w:spacing w:after="80"/>
-      </w:pPr>
-      <w:r>
-        <w:rPr>
-          <w:rFonts w:ascii="Arial" w:cs="Arial" w:eastAsia="Arial" w:hAnsi="Arial"/>
-          <w:sz w:val="20"/>
-          <w:szCs w:val="20"/>
-        </w:rPr>
-        <w:t xml:space="preserve">Należy zatem wziąć pod uwagę stężenia poszczególnych substancji niebezpiecznych wymienionych w sekcji 3, aby ocenić skutki toksykologiczne narażenia na produkt.</w:t>
+        <w:t xml:space="preserve">Wobec braku danych doświadczalnych dla samego produktu, zagrożenia dla zdrowia oceniono na podstawie właściwości substancji w nim zawartych, zgodnie z kryteriami określonymi w odpowiednich przepisach dotyczących klasyfikacji.</w:t>
+      </w:r>
+    </w:p>
+    <w:p>
+      <w:pPr>
+        <w:spacing w:after="80"/>
+      </w:pPr>
+      <w:r>
+        <w:rPr>
+          <w:rFonts w:ascii="Arial" w:cs="Arial" w:eastAsia="Arial" w:hAnsi="Arial"/>
+          <w:sz w:val="20"/>
+          <w:szCs w:val="20"/>
+        </w:rPr>
+        <w:t xml:space="preserve">Należy zatem wziąć pod uwagę stężenie poszczególnych niebezpiecznych substancji wskazanych w sekcji 3, aby ocenić skutki toksykologiczne narażenia na produkt.</w:t>
       </w:r>
     </w:p>
     <w:p>
@@ -5378,7 +5378,7 @@
           <w:sz w:val="20"/>
           <w:szCs w:val="20"/>
         </w:rPr>
-        <w:t xml:space="preserve">KONSUMENCI: spożycie skażonej żywności lub wody; przez drogi oddechowe (inhalacyjnie) z otaczającego powietrza; kontakt ze skórą z produktami zawierającymi substancję.</w:t>
+        <w:t xml:space="preserve">LUDNOŚĆ: spożycie skażonej żywności lub wody; wdychanie powietrza z otoczenia; kontakt ze skórą z produktami zawierającymi substancję.</w:t>
       </w:r>
     </w:p>
     <w:p>
@@ -5456,7 +5456,7 @@
           <w:sz w:val="20"/>
           <w:szCs w:val="20"/>
         </w:rPr>
-        <w:t xml:space="preserve">Niektóre leki oraz inne produkty przemysłowe mogą zakłócać metabolizm toluenu.</w:t>
+        <w:t xml:space="preserve">Niektóre leki i inne produkty przemysłowe mogą zakłócać metabolizm toluenu.</w:t>
       </w:r>
     </w:p>
     <w:p>
@@ -5482,59 +5482,59 @@
           <w:sz w:val="20"/>
           <w:szCs w:val="20"/>
         </w:rPr>
-        <w:t xml:space="preserve">ATE (przez drogi oddechowe (inhalacyjnie)) mieszaniny: Nie sklasyfikowano (brak istotnych składników)</w:t>
-      </w:r>
-    </w:p>
-    <w:p>
-      <w:pPr>
-        <w:spacing w:after="80"/>
-      </w:pPr>
-      <w:r>
-        <w:rPr>
-          <w:rFonts w:ascii="Arial" w:cs="Arial" w:eastAsia="Arial" w:hAnsi="Arial"/>
-          <w:sz w:val="20"/>
-          <w:szCs w:val="20"/>
-        </w:rPr>
-        <w:t xml:space="preserve">ATE (droga pokarmowa (doustnie)) mieszaniny: Nie sklasyfikowano (brak istotnych składników)</w:t>
-      </w:r>
-    </w:p>
-    <w:p>
-      <w:pPr>
-        <w:spacing w:after="80"/>
-      </w:pPr>
-      <w:r>
-        <w:rPr>
-          <w:rFonts w:ascii="Arial" w:cs="Arial" w:eastAsia="Arial" w:hAnsi="Arial"/>
-          <w:sz w:val="20"/>
-          <w:szCs w:val="20"/>
-        </w:rPr>
-        <w:t xml:space="preserve">ATE (na skórę) mieszaniny: Nie sklasyfikowano (brak istotnych składników)</w:t>
-      </w:r>
-    </w:p>
-    <w:p>
-      <w:pPr>
-        <w:spacing w:after="80"/>
-      </w:pPr>
-      <w:r>
-        <w:rPr>
-          <w:rFonts w:ascii="Arial" w:cs="Arial" w:eastAsia="Arial" w:hAnsi="Arial"/>
-          <w:sz w:val="20"/>
-          <w:szCs w:val="20"/>
-        </w:rPr>
-        <w:t xml:space="preserve">etanol:</w:t>
-      </w:r>
-    </w:p>
-    <w:p>
-      <w:pPr>
-        <w:spacing w:after="80"/>
-      </w:pPr>
-      <w:r>
-        <w:rPr>
-          <w:rFonts w:ascii="Arial" w:cs="Arial" w:eastAsia="Arial" w:hAnsi="Arial"/>
-          <w:sz w:val="20"/>
-          <w:szCs w:val="20"/>
-        </w:rPr>
-        <w:t xml:space="preserve">LD50 (droga pokarmowa): &gt; 5000 mg/kg (szczur)</w:t>
+        <w:t xml:space="preserve">ATE (przez drogi oddechowe (inhalacyjnie)) mieszaniny: Nie sklasyfikowano (brak istotnego składnika)</w:t>
+      </w:r>
+    </w:p>
+    <w:p>
+      <w:pPr>
+        <w:spacing w:after="80"/>
+      </w:pPr>
+      <w:r>
+        <w:rPr>
+          <w:rFonts w:ascii="Arial" w:cs="Arial" w:eastAsia="Arial" w:hAnsi="Arial"/>
+          <w:sz w:val="20"/>
+          <w:szCs w:val="20"/>
+        </w:rPr>
+        <w:t xml:space="preserve">ATE (droga pokarmowa (doustnie)) mieszaniny: Nie sklasyfikowano (brak istotnego składnika)</w:t>
+      </w:r>
+    </w:p>
+    <w:p>
+      <w:pPr>
+        <w:spacing w:after="80"/>
+      </w:pPr>
+      <w:r>
+        <w:rPr>
+          <w:rFonts w:ascii="Arial" w:cs="Arial" w:eastAsia="Arial" w:hAnsi="Arial"/>
+          <w:sz w:val="20"/>
+          <w:szCs w:val="20"/>
+        </w:rPr>
+        <w:t xml:space="preserve">ATE (na skórę) mieszaniny: Nie sklasyfikowano (brak istotnego składnika)</w:t>
+      </w:r>
+    </w:p>
+    <w:p>
+      <w:pPr>
+        <w:spacing w:after="80"/>
+      </w:pPr>
+      <w:r>
+        <w:rPr>
+          <w:rFonts w:ascii="Arial" w:cs="Arial" w:eastAsia="Arial" w:hAnsi="Arial"/>
+          <w:sz w:val="20"/>
+          <w:szCs w:val="20"/>
+        </w:rPr>
+        <w:t xml:space="preserve">Etanol:</w:t>
+      </w:r>
+    </w:p>
+    <w:p>
+      <w:pPr>
+        <w:spacing w:after="80"/>
+      </w:pPr>
+      <w:r>
+        <w:rPr>
+          <w:rFonts w:ascii="Arial" w:cs="Arial" w:eastAsia="Arial" w:hAnsi="Arial"/>
+          <w:sz w:val="20"/>
+          <w:szCs w:val="20"/>
+        </w:rPr>
+        <w:t xml:space="preserve">LD50 (droga pokarmowa (doustnie)): &gt; 5000 mg/kg (szczur)</w:t>
       </w:r>
     </w:p>
     <w:p>
@@ -5560,7 +5560,7 @@
           <w:sz w:val="20"/>
           <w:szCs w:val="20"/>
         </w:rPr>
-        <w:t xml:space="preserve">aldehyd anyżowy (4-metoksybenzaldehyd):</w:t>
+        <w:t xml:space="preserve">Aldehyd anyżowy:</w:t>
       </w:r>
     </w:p>
     <w:p>
@@ -5586,33 +5586,33 @@
           <w:sz w:val="20"/>
           <w:szCs w:val="20"/>
         </w:rPr>
-        <w:t xml:space="preserve">LD50 (droga pokarmowa): 3210 mg/kg (szczur)</w:t>
-      </w:r>
-    </w:p>
-    <w:p>
-      <w:pPr>
-        <w:spacing w:after="80"/>
-      </w:pPr>
-      <w:r>
-        <w:rPr>
-          <w:rFonts w:ascii="Arial" w:cs="Arial" w:eastAsia="Arial" w:hAnsi="Arial"/>
-          <w:sz w:val="20"/>
-          <w:szCs w:val="20"/>
-        </w:rPr>
-        <w:t xml:space="preserve">LC50 (przez drogi oddechowe, pary): 0,32 mg/l/7h (szczur)</w:t>
-      </w:r>
-    </w:p>
-    <w:p>
-      <w:pPr>
-        <w:spacing w:after="80"/>
-      </w:pPr>
-      <w:r>
-        <w:rPr>
-          <w:rFonts w:ascii="Arial" w:cs="Arial" w:eastAsia="Arial" w:hAnsi="Arial"/>
-          <w:sz w:val="20"/>
-          <w:szCs w:val="20"/>
-        </w:rPr>
-        <w:t xml:space="preserve">kumaryna (2H-chromen-2-on):</w:t>
+        <w:t xml:space="preserve">LD50 (droga pokarmowa (doustnie)): 3210 mg/kg (szczur)</w:t>
+      </w:r>
+    </w:p>
+    <w:p>
+      <w:pPr>
+        <w:spacing w:after="80"/>
+      </w:pPr>
+      <w:r>
+        <w:rPr>
+          <w:rFonts w:ascii="Arial" w:cs="Arial" w:eastAsia="Arial" w:hAnsi="Arial"/>
+          <w:sz w:val="20"/>
+          <w:szCs w:val="20"/>
+        </w:rPr>
+        <w:t xml:space="preserve">LC50 (przez drogi oddechowe (inhalacyjnie), pary): 0,32 mg/l/7h (szczur)</w:t>
+      </w:r>
+    </w:p>
+    <w:p>
+      <w:pPr>
+        <w:spacing w:after="80"/>
+      </w:pPr>
+      <w:r>
+        <w:rPr>
+          <w:rFonts w:ascii="Arial" w:cs="Arial" w:eastAsia="Arial" w:hAnsi="Arial"/>
+          <w:sz w:val="20"/>
+          <w:szCs w:val="20"/>
+        </w:rPr>
+        <w:t xml:space="preserve">Kumaryna:</w:t>
       </w:r>
     </w:p>
     <w:p>
@@ -5638,20 +5638,20 @@
           <w:sz w:val="20"/>
           <w:szCs w:val="20"/>
         </w:rPr>
-        <w:t xml:space="preserve">LD50 (droga pokarmowa): 290 mg/kg mc. (szczur)</w:t>
-      </w:r>
-    </w:p>
-    <w:p>
-      <w:pPr>
-        <w:spacing w:after="80"/>
-      </w:pPr>
-      <w:r>
-        <w:rPr>
-          <w:rFonts w:ascii="Arial" w:cs="Arial" w:eastAsia="Arial" w:hAnsi="Arial"/>
-          <w:sz w:val="20"/>
-          <w:szCs w:val="20"/>
-        </w:rPr>
-        <w:t xml:space="preserve">LC50 (przez drogi oddechowe, pyły/mgły): 293 mg/kg (szczur)</w:t>
+        <w:t xml:space="preserve">LD50 (droga pokarmowa (doustnie)): 290 mg/kg mc. (szczur)</w:t>
+      </w:r>
+    </w:p>
+    <w:p>
+      <w:pPr>
+        <w:spacing w:after="80"/>
+      </w:pPr>
+      <w:r>
+        <w:rPr>
+          <w:rFonts w:ascii="Arial" w:cs="Arial" w:eastAsia="Arial" w:hAnsi="Arial"/>
+          <w:sz w:val="20"/>
+          <w:szCs w:val="20"/>
+        </w:rPr>
+        <w:t xml:space="preserve">LC50 (przez drogi oddechowe (inhalacyjnie), mgły/pyły): 293 mg/kg (szczur)</w:t>
       </w:r>
     </w:p>
     <w:p>
@@ -5690,20 +5690,20 @@
           <w:sz w:val="20"/>
           <w:szCs w:val="20"/>
         </w:rPr>
-        <w:t xml:space="preserve">LD50 (droga pokarmowa): 2930 mg/kg (szczur)</w:t>
-      </w:r>
-    </w:p>
-    <w:p>
-      <w:pPr>
-        <w:spacing w:after="80"/>
-      </w:pPr>
-      <w:r>
-        <w:rPr>
-          <w:rFonts w:ascii="Arial" w:cs="Arial" w:eastAsia="Arial" w:hAnsi="Arial"/>
-          <w:sz w:val="20"/>
-          <w:szCs w:val="20"/>
-        </w:rPr>
-        <w:t xml:space="preserve">toluen:</w:t>
+        <w:t xml:space="preserve">LD50 (droga pokarmowa (doustnie)): 2930 mg/kg (szczur)</w:t>
+      </w:r>
+    </w:p>
+    <w:p>
+      <w:pPr>
+        <w:spacing w:after="80"/>
+      </w:pPr>
+      <w:r>
+        <w:rPr>
+          <w:rFonts w:ascii="Arial" w:cs="Arial" w:eastAsia="Arial" w:hAnsi="Arial"/>
+          <w:sz w:val="20"/>
+          <w:szCs w:val="20"/>
+        </w:rPr>
+        <w:t xml:space="preserve">Toluen:</w:t>
       </w:r>
     </w:p>
     <w:p>
@@ -5729,20 +5729,20 @@
           <w:sz w:val="20"/>
           <w:szCs w:val="20"/>
         </w:rPr>
-        <w:t xml:space="preserve">LD50 (droga pokarmowa): &gt; 5000 mg/kg mc. (szczur)</w:t>
-      </w:r>
-    </w:p>
-    <w:p>
-      <w:pPr>
-        <w:spacing w:after="80"/>
-      </w:pPr>
-      <w:r>
-        <w:rPr>
-          <w:rFonts w:ascii="Arial" w:cs="Arial" w:eastAsia="Arial" w:hAnsi="Arial"/>
-          <w:sz w:val="20"/>
-          <w:szCs w:val="20"/>
-        </w:rPr>
-        <w:t xml:space="preserve">LC50 (przez drogi oddechowe, pary): 100 ppm (człowiek)</w:t>
+        <w:t xml:space="preserve">LD50 (droga pokarmowa (doustnie)): &gt; 5000 mg/kg mc. (szczur)</w:t>
+      </w:r>
+    </w:p>
+    <w:p>
+      <w:pPr>
+        <w:spacing w:after="80"/>
+      </w:pPr>
+      <w:r>
+        <w:rPr>
+          <w:rFonts w:ascii="Arial" w:cs="Arial" w:eastAsia="Arial" w:hAnsi="Arial"/>
+          <w:sz w:val="20"/>
+          <w:szCs w:val="20"/>
+        </w:rPr>
+        <w:t xml:space="preserve">LC50 (przez drogi oddechowe (inhalacyjnie), pary): 100 ppm (człowiek)</w:t>
       </w:r>
     </w:p>
     <w:p>
@@ -5820,20 +5820,20 @@
           <w:sz w:val="20"/>
           <w:szCs w:val="20"/>
         </w:rPr>
-        <w:t xml:space="preserve">Może powodować wystąpienie reakcji alergicznej skóry.</w:t>
-      </w:r>
-    </w:p>
-    <w:p>
-      <w:pPr>
-        <w:spacing w:after="80"/>
-      </w:pPr>
-      <w:r>
-        <w:rPr>
-          <w:rFonts w:ascii="Arial" w:cs="Arial" w:eastAsia="Arial" w:hAnsi="Arial"/>
-          <w:sz w:val="20"/>
-          <w:szCs w:val="20"/>
-        </w:rPr>
-        <w:t xml:space="preserve">Zawiera: kumarynę (2H-chromen-2-on).</w:t>
+        <w:t xml:space="preserve">Może powodować wystąpienie reakcji alergicznej.</w:t>
+      </w:r>
+    </w:p>
+    <w:p>
+      <w:pPr>
+        <w:spacing w:after="80"/>
+      </w:pPr>
+      <w:r>
+        <w:rPr>
+          <w:rFonts w:ascii="Arial" w:cs="Arial" w:eastAsia="Arial" w:hAnsi="Arial"/>
+          <w:sz w:val="20"/>
+          <w:szCs w:val="20"/>
+        </w:rPr>
+        <w:t xml:space="preserve">Zawiera: kumarynę.</w:t>
       </w:r>
     </w:p>
     <w:p>
@@ -5911,20 +5911,20 @@
           <w:sz w:val="20"/>
           <w:szCs w:val="20"/>
         </w:rPr>
-        <w:t xml:space="preserve">Sklasyfikowany w Grupie 3 (nie można zaklasyfikować jako rakotwórczy dla ludzi) przez Międzynarodową Agencję Badań nad Rakiem (IARC) - (IARC, 1999).</w:t>
-      </w:r>
-    </w:p>
-    <w:p>
-      <w:pPr>
-        <w:spacing w:after="80"/>
-      </w:pPr>
-      <w:r>
-        <w:rPr>
-          <w:rFonts w:ascii="Arial" w:cs="Arial" w:eastAsia="Arial" w:hAnsi="Arial"/>
-          <w:sz w:val="20"/>
-          <w:szCs w:val="20"/>
-        </w:rPr>
-        <w:t xml:space="preserve">Amerykańska Agencja Ochrony Środowiska (EPA) stwierdza, że „dane są niewystarczające do oceny potencjału rakotwórczego”.</w:t>
+        <w:t xml:space="preserve">Sklasyfikowany w grupie 3 (nie można zaklasyfikować jako rakotwórczy dla ludzi) przez Międzynarodową Agencję Badań nad Rakiem (IARC) - (IARC, 1999).</w:t>
+      </w:r>
+    </w:p>
+    <w:p>
+      <w:pPr>
+        <w:spacing w:after="80"/>
+      </w:pPr>
+      <w:r>
+        <w:rPr>
+          <w:rFonts w:ascii="Arial" w:cs="Arial" w:eastAsia="Arial" w:hAnsi="Arial"/>
+          <w:sz w:val="20"/>
+          <w:szCs w:val="20"/>
+        </w:rPr>
+        <w:t xml:space="preserve">Amerykańska Agencja Ochrony Środowiska (EPA) twierdzi, że „dane są niewystarczające do oceny potencjału rakotwórczego”.</w:t>
       </w:r>
     </w:p>
     <w:p>
@@ -6056,46 +6056,7 @@
           <w:sz w:val="20"/>
           <w:szCs w:val="20"/>
         </w:rPr>
-        <w:t xml:space="preserve">Właściwości zaburzające funkcjonowanie układu hormonalnego:</w:t>
-      </w:r>
-    </w:p>
-    <w:p>
-      <w:pPr>
-        <w:spacing w:after="80"/>
-      </w:pPr>
-      <w:r>
-        <w:rPr>
-          <w:rFonts w:ascii="Arial" w:cs="Arial" w:eastAsia="Arial" w:hAnsi="Arial"/>
-          <w:sz w:val="20"/>
-          <w:szCs w:val="20"/>
-        </w:rPr>
-        <w:t xml:space="preserve">W oparciu o dostępne dane produkt nie zawiera substancji wymienionych w głównych europejskich wykazach potencjalnych lub podejrzewanych substancji zaburzających funkcjonowanie układu hormonalnego o ocenianym wpływie na zdrowie człowieka w stężeniu ≥ 0,1%.</w:t>
-      </w:r>
-    </w:p>
-    <w:p>
-      <w:pPr>
-        <w:spacing w:after="80"/>
-      </w:pPr>
-      <w:r>
-        <w:rPr>
-          <w:rFonts w:ascii="Arial" w:cs="Arial" w:eastAsia="Arial" w:hAnsi="Arial"/>
-          <w:sz w:val="20"/>
-          <w:szCs w:val="20"/>
-        </w:rPr>
-        <w:t xml:space="preserve">Inne informacje:</w:t>
-      </w:r>
-    </w:p>
-    <w:p>
-      <w:pPr>
-        <w:spacing w:after="80"/>
-      </w:pPr>
-      <w:r>
-        <w:rPr>
-          <w:rFonts w:ascii="Arial" w:cs="Arial" w:eastAsia="Arial" w:hAnsi="Arial"/>
-          <w:sz w:val="20"/>
-          <w:szCs w:val="20"/>
-        </w:rPr>
-        <w:t xml:space="preserve">Brak danych.</w:t>
+        <w:t xml:space="preserve">W oparciu o dostępne dane, produkt nie zawiera substancji wymienionych w głównych europejskich wykazach potencjalnych lub podejrzewanych substancji zaburzających funkcjonowanie układu hormonalnego o ocenianym wpływie na zdrowie człowieka.</w:t>
       </w:r>
     </w:p>
     <w:p>

</xml_diff>